<commit_message>
Fix scene renders and de-mechanize Experiment 4 prose
Clutter renders: cutaway bin (near walls dropped), per-face Lambert
shading and edges on cubes, per-body brightness variation, so settled
piles read as distinct bodies instead of merged silhouettes. The
stiffness ball gets its grid and shading. The actuated schematic moves
into part1_scenes_figure.py, viewed from the fingertip's side, and shows
the mechanism: commanded point, its path, the virtual spring K_p, the
sliding box. Doc prose describes the PD purely in scene terms (spring to
a commanded moving point); no mechanism vocabulary.
</commit_message>
<xml_diff>
--- a/part1/bench/results/P1_core_experiments.docx
+++ b/part1/bench/results/P1_core_experiments.docx
@@ -15,7 +15,7 @@
         <w:rPr>
           <w:i/>
         </w:rPr>
-        <w:t>Four experiments carry Part 1. Each entry: the scene, the figure, a one-line caption, a plain-language explanation (setup, what is altered, what is measured, what happens, why it matters), and line-level code citations at commit 35e64ae8da89.</w:t>
+        <w:t>Four experiments carry Part 1. Each entry: the scene, the figure, a one-line caption, a plain-language explanation (setup, what is altered, what is measured, what happens, why it matters), and line-level code citations at commit c0279e47d8fe.</w:t>
       </w:r>
     </w:p>
     <w:p>
@@ -186,7 +186,7 @@
         <w:rPr>
           <w:sz w:val="16"/>
         </w:rPr>
-        <w:t>k sweep values, https://github.com/mardigiorgio/icra2027/blob/35e64ae8da89/part1/bench/benchmarks/part1_stiffness_sweep.py#L32</w:t>
+        <w:t>k sweep values, https://github.com/mardigiorgio/icra2027/blob/c0279e47d8fe/part1/bench/benchmarks/part1_stiffness_sweep.py#L32</w:t>
       </w:r>
     </w:p>
     <w:p>
@@ -197,7 +197,7 @@
         <w:rPr>
           <w:sz w:val="16"/>
         </w:rPr>
-        <w:t>sphere build (rest on plane), https://github.com/mardigiorgio/icra2027/blob/35e64ae8da89/part1/bench/benchmarks/part1_stiffness_sweep.py#L42</w:t>
+        <w:t>sphere build (rest on plane), https://github.com/mardigiorgio/icra2027/blob/c0279e47d8fe/part1/bench/benchmarks/part1_stiffness_sweep.py#L42</w:t>
       </w:r>
     </w:p>
     <w:p>
@@ -208,7 +208,7 @@
         <w:rPr>
           <w:sz w:val="16"/>
         </w:rPr>
-        <w:t>3 s settle loop, https://github.com/mardigiorgio/icra2027/blob/35e64ae8da89/part1/bench/benchmarks/part1_stiffness_sweep.py#L59</w:t>
+        <w:t>3 s settle loop, https://github.com/mardigiorgio/icra2027/blob/c0279e47d8fe/part1/bench/benchmarks/part1_stiffness_sweep.py#L59</w:t>
       </w:r>
     </w:p>
     <w:p>
@@ -219,7 +219,7 @@
         <w:rPr>
           <w:sz w:val="16"/>
         </w:rPr>
-        <w:t>per-arm, per-k sweep, https://github.com/mardigiorgio/icra2027/blob/35e64ae8da89/part1/bench/benchmarks/part1_stiffness_sweep.py#L76</w:t>
+        <w:t>per-arm, per-k sweep, https://github.com/mardigiorgio/icra2027/blob/c0279e47d8fe/part1/bench/benchmarks/part1_stiffness_sweep.py#L76</w:t>
       </w:r>
     </w:p>
     <w:p>
@@ -230,7 +230,7 @@
         <w:rPr>
           <w:sz w:val="16"/>
         </w:rPr>
-        <w:t>MuJoCo solref calibration anchors, https://github.com/mardigiorgio/icra2027/blob/35e64ae8da89/part1/scenes/cenic_scenes.py#L66-L69</w:t>
+        <w:t>MuJoCo solref calibration anchors, https://github.com/mardigiorgio/icra2027/blob/c0279e47d8fe/part1/scenes/cenic_scenes.py#L66-L69</w:t>
       </w:r>
     </w:p>
     <w:p>
@@ -241,7 +241,7 @@
         <w:rPr>
           <w:sz w:val="16"/>
         </w:rPr>
-        <w:t>solref applied per scene, https://github.com/mardigiorgio/icra2027/blob/35e64ae8da89/part1/scenes/cenic_scenes.py#L186-L194</w:t>
+        <w:t>solref applied per scene, https://github.com/mardigiorgio/icra2027/blob/c0279e47d8fe/part1/scenes/cenic_scenes.py#L186-L194</w:t>
       </w:r>
     </w:p>
     <w:p>
@@ -259,7 +259,7 @@
       <w:r>
         <w:drawing>
           <wp:inline xmlns:a="http://schemas.openxmlformats.org/drawingml/2006/main" xmlns:pic="http://schemas.openxmlformats.org/drawingml/2006/picture">
-            <wp:extent cx="2377440" cy="1493905"/>
+            <wp:extent cx="2377440" cy="2304846"/>
             <wp:docPr id="3" name="Picture 3"/>
             <wp:cNvGraphicFramePr>
               <a:graphicFrameLocks noChangeAspect="1"/>
@@ -280,7 +280,7 @@
                   <pic:spPr>
                     <a:xfrm>
                       <a:off x="0" y="0"/>
-                      <a:ext cx="2377440" cy="1493905"/>
+                      <a:ext cx="2377440" cy="2304846"/>
                     </a:xfrm>
                     <a:prstGeom prst="rect"/>
                   </pic:spPr>
@@ -376,7 +376,7 @@
         <w:rPr>
           <w:sz w:val="20"/>
         </w:rPr>
-        <w:t>Why it matters: this is the honest cost picture in the clutter regime, and it favors the MuJoCo backend. CENIC's speed case is not here. It is in Experiment 4, where the stiffness sits in the actuator instead of the contact pile, and the ranking reverses.</w:t>
+        <w:t>Why it matters: this is the honest cost picture in the clutter regime, and it favors the MuJoCo backend. CENIC's speed case is not here. It is in Experiment 4, where the stiffness sits in the controller's virtual spring instead of the contact pile, and the ranking reverses.</w:t>
       </w:r>
     </w:p>
     <w:p>
@@ -396,7 +396,7 @@
         <w:rPr>
           <w:sz w:val="16"/>
         </w:rPr>
-        <w:t>timeout semantics (per world-second), https://github.com/mardigiorgio/icra2027/blob/35e64ae8da89/part1/bench/benchmarks/part1_workprecision.py#L8-L16</w:t>
+        <w:t>timeout semantics (per world-second), https://github.com/mardigiorgio/icra2027/blob/c0279e47d8fe/part1/bench/benchmarks/part1_workprecision.py#L8-L16</w:t>
       </w:r>
     </w:p>
     <w:p>
@@ -407,7 +407,7 @@
         <w:rPr>
           <w:sz w:val="16"/>
         </w:rPr>
-        <w:t>accuracy ladder + march budget, https://github.com/mardigiorgio/icra2027/blob/35e64ae8da89/part1/bench/benchmarks/part1_workprecision.py#L18-L21</w:t>
+        <w:t>accuracy ladder + march budget, https://github.com/mardigiorgio/icra2027/blob/c0279e47d8fe/part1/bench/benchmarks/part1_workprecision.py#L18-L21</w:t>
       </w:r>
     </w:p>
     <w:p>
@@ -418,7 +418,7 @@
         <w:rPr>
           <w:sz w:val="16"/>
         </w:rPr>
-        <w:t>first attempt k_Init·δt_max, https://github.com/mardigiorgio/icra2027/blob/35e64ae8da89/part1/bench/four_arms.py#L47</w:t>
+        <w:t>first attempt k_Init·δt_max, https://github.com/mardigiorgio/icra2027/blob/c0279e47d8fe/part1/bench/four_arms.py#L47</w:t>
       </w:r>
     </w:p>
     <w:p>
@@ -429,7 +429,7 @@
         <w:rPr>
           <w:sz w:val="16"/>
         </w:rPr>
-        <w:t>inner tolerance rule (CENIC eq. 34), https://github.com/mardigiorgio/icra2027/blob/35e64ae8da89/part1/bench/four_arms.py#L48</w:t>
+        <w:t>inner tolerance rule (CENIC eq. 34), https://github.com/mardigiorgio/icra2027/blob/c0279e47d8fe/part1/bench/four_arms.py#L48</w:t>
       </w:r>
     </w:p>
     <w:p>
@@ -440,7 +440,7 @@
         <w:rPr>
           <w:sz w:val="16"/>
         </w:rPr>
-        <w:t>contact budgets (≥ 2× measured demand), https://github.com/mardigiorgio/icra2027/blob/35e64ae8da89/part1/bench/four_arms.py#L62-L64</w:t>
+        <w:t>contact budgets (≥ 2× measured demand), https://github.com/mardigiorgio/icra2027/blob/c0279e47d8fe/part1/bench/four_arms.py#L62-L64</w:t>
       </w:r>
     </w:p>
     <w:p>
@@ -458,7 +458,7 @@
       <w:r>
         <w:drawing>
           <wp:inline xmlns:a="http://schemas.openxmlformats.org/drawingml/2006/main" xmlns:pic="http://schemas.openxmlformats.org/drawingml/2006/picture">
-            <wp:extent cx="2377440" cy="1493905"/>
+            <wp:extent cx="2377440" cy="5041584"/>
             <wp:docPr id="5" name="Picture 5"/>
             <wp:cNvGraphicFramePr>
               <a:graphicFrameLocks noChangeAspect="1"/>
@@ -479,7 +479,7 @@
                   <pic:spPr>
                     <a:xfrm>
                       <a:off x="0" y="0"/>
-                      <a:ext cx="2377440" cy="1493905"/>
+                      <a:ext cx="2377440" cy="5041584"/>
                     </a:xfrm>
                     <a:prstGeom prst="rect"/>
                   </pic:spPr>
@@ -587,7 +587,7 @@
         <w:rPr>
           <w:sz w:val="16"/>
         </w:rPr>
-        <w:t>runner (per-N subprocess), https://github.com/mardigiorgio/icra2027/blob/35e64ae8da89/part1/bench/benchmarks/part1_scaling.py#L36</w:t>
+        <w:t>runner (per-N subprocess), https://github.com/mardigiorgio/icra2027/blob/c0279e47d8fe/part1/bench/benchmarks/part1_scaling.py#L36</w:t>
       </w:r>
     </w:p>
     <w:p>
@@ -598,7 +598,7 @@
         <w:rPr>
           <w:sz w:val="16"/>
         </w:rPr>
-        <w:t>warm-up handling, https://github.com/mardigiorgio/icra2027/blob/35e64ae8da89/part1/bench/benchmarks/part1_scaling.py#L44-L47</w:t>
+        <w:t>warm-up handling, https://github.com/mardigiorgio/icra2027/blob/c0279e47d8fe/part1/bench/benchmarks/part1_scaling.py#L44-L47</w:t>
       </w:r>
     </w:p>
     <w:p>
@@ -609,7 +609,7 @@
         <w:rPr>
           <w:sz w:val="16"/>
         </w:rPr>
-        <w:t>median statistic, https://github.com/mardigiorgio/icra2027/blob/35e64ae8da89/part1/bench/benchmarks/part1_scaling.py#L72</w:t>
+        <w:t>median statistic, https://github.com/mardigiorgio/icra2027/blob/c0279e47d8fe/part1/bench/benchmarks/part1_scaling.py#L72</w:t>
       </w:r>
     </w:p>
     <w:p>
@@ -620,7 +620,7 @@
         <w:rPr>
           <w:sz w:val="16"/>
         </w:rPr>
-        <w:t>defaults: 2 s timed, 0.2 s warm-up, 3 trials, https://github.com/mardigiorgio/icra2027/blob/35e64ae8da89/part1/bench/benchmarks/part1_scaling.py#L82-L89</w:t>
+        <w:t>defaults: 2 s timed, 0.2 s warm-up, 3 trials, https://github.com/mardigiorgio/icra2027/blob/c0279e47d8fe/part1/bench/benchmarks/part1_scaling.py#L82-L89</w:t>
       </w:r>
     </w:p>
     <w:p>
@@ -628,7 +628,7 @@
         <w:pStyle w:val="Heading2"/>
       </w:pPr>
       <w:r>
-        <w:t>Experiment 4, The actuated stiff-contact case (PD gantry push)</w:t>
+        <w:t>Experiment 4, The actuated stiff-contact case (PD push)</w:t>
       </w:r>
     </w:p>
     <w:p>
@@ -762,7 +762,7 @@
         <w:rPr>
           <w:sz w:val="20"/>
         </w:rPr>
-        <w:t>The setup is the smallest scene that has the ingredients of robot learning. A gantry is the simplest possible robot: a carriage that slides left–right and up–down, like the moving head of a 3D printer. Ours carries a small round fingertip (100 grams, 1 centimeter radius). In front of it, a 1-kilogram box, 10 centimeters on a side, rests on the table. The task is to push the box 30 centimeters across the table at 300 mm/s, with hard contact (k = 100,000 N/m) and ordinary friction.</w:t>
+        <w:t>The setup is the smallest scene that has the ingredients of robot learning. A small round fingertip (100 grams, 1 centimeter radius) hangs in the air beside a 1-kilogram box, 10 centimeters on a side, resting on the table. Nothing holds the fingertip in place except the pull of the controller described next. The task is to push the box 30 centimeters across the table at 300 mm/s, with hard contact (k = 100,000 N/m) and ordinary friction.</w:t>
       </w:r>
     </w:p>
     <w:p>
@@ -770,7 +770,7 @@
         <w:rPr>
           <w:sz w:val="20"/>
         </w:rPr>
-        <w:t>The gantry is driven by a PD controller, the standard control law of nearly every robot. You give it a target position, and it pulls the fingertip toward that target with a force proportional to the remaining distance; that is the P term, and its gain K_p is literally the stiffness of a virtual spring stretched between fingertip and target. A second term (the D) brakes proportionally to velocity so the pull does not oscillate forever. A trained policy commands a real robot exactly this way: the policy outputs a target, the PD pulls the joints toward it. Here the target updates 100 times per second and is HELD in between, just as a policy's action would be. Every update suddenly re-stretches the virtual spring by 3 millimeters, and at K_p = 100,000 N/m, a 3 mm stretch is a kick of several hundred newtons landing on a 100-gram fingertip. That kick, repeated 100 times a second, is what makes this scene stiff even though the contact itself is ordinary.</w:t>
+        <w:t>The fingertip is moved by a PD controller, the standard control law of nearly every robot, and in this scene it works like this. There is an invisible commanded point (the hollow circle in the render). The controller pulls the fingertip toward that point with a force proportional to the distance between them; that is the P term, and its gain K_p is literally the stiffness of a virtual spring stretched between the fingertip and the commanded point. A second term (the D) brakes proportionally to velocity so the pull does not oscillate forever. The commanded point moves along a fixed path: it descends to the box's mid-height, then travels sideways in a straight line, and the spring drags the fingertip after it, pressing it into the side of the box and sliding the box along. A trained policy commands a real robot exactly this way: the policy outputs where to go, and a PD does the pulling. Here the commanded point updates 100 times per second and is HELD in between, just as a policy's action would be. Every update suddenly re-stretches the virtual spring by 3 millimeters, and at K_p = 100,000 N/m a 3 mm stretch is a kick of several hundred newtons landing on a 100-gram fingertip. That kick, repeated 100 times a second, is what makes this scene stiff even though the contact itself is ordinary.</w:t>
       </w:r>
     </w:p>
     <w:p>
@@ -778,7 +778,7 @@
         <w:rPr>
           <w:sz w:val="20"/>
         </w:rPr>
-        <w:t>Between runs we change the controller stiffness K_p (from 100 to 1,000,000 N/m (a soft compliant arm up to a rigid industrial one), the solver setting (four fixed steps, four tolerances), and, for the second figure, the number of parallel copies. The scene geometry, masses, friction, and the target program never change.</w:t>
+        <w:t>Between runs we change the controller stiffness K_p (from 100 to 1,000,000 N/m, a soft compliant arm up to a rigid industrial one), the solver setting (four fixed steps, four tolerances), and, for the second figure, the number of parallel copies. The scene geometry, masses, friction, and the commanded point's path never change.</w:t>
       </w:r>
     </w:p>
     <w:p>
@@ -802,7 +802,7 @@
         <w:rPr>
           <w:sz w:val="20"/>
         </w:rPr>
-        <w:t>Why it matters, and the speed reversal: in this regime the stiffness lives in the actuator, not in a pile of objects. Because CENIC handles that stiffness implicitly, it crosses each 10 ms control boundary in a single step, while MuJoCo's explicitly-integrated spring forces its error controller to 5–9 sub-steps and its fixed arm down to 1 ms just to stay stable. The second figure shows the consequence at scale: CENIC is the fastest of all four configurations at every batch size. This is the regime Part 2 trains in, and it is where the paper's speed claim lives.</w:t>
+        <w:t>Why it matters, and the speed reversal: in this regime the stiffness lives in the controller's virtual spring, not in a pile of objects. Because CENIC handles that stiffness implicitly, it crosses each 10 ms control boundary in a single step, while MuJoCo's explicitly-integrated spring forces its error controller to 5-9 sub-steps and its fixed arm down to 1 ms just to stay stable. The second figure shows the consequence at scale: CENIC is the fastest of all four configurations at every batch size. This is the regime Part 2 trains in, and it is where the paper's speed claim lives.</w:t>
       </w:r>
     </w:p>
     <w:p>
@@ -822,7 +822,7 @@
         <w:rPr>
           <w:sz w:val="16"/>
         </w:rPr>
-        <w:t>scene geometry and start pose, https://github.com/mardigiorgio/icra2027/blob/35e64ae8da89/part1/scenes/actuated_press.py#L32-L42</w:t>
+        <w:t>scene geometry and start pose, https://github.com/mardigiorgio/icra2027/blob/c0279e47d8fe/part1/scenes/actuated_press.py#L32-L42</w:t>
       </w:r>
     </w:p>
     <w:p>
@@ -833,7 +833,7 @@
         <w:rPr>
           <w:sz w:val="16"/>
         </w:rPr>
-        <w:t>scene build (densities, bodies), https://github.com/mardigiorgio/icra2027/blob/35e64ae8da89/part1/scenes/actuated_press.py#L68-L80</w:t>
+        <w:t>scene build (densities, bodies), https://github.com/mardigiorgio/icra2027/blob/c0279e47d8fe/part1/scenes/actuated_press.py#L68-L80</w:t>
       </w:r>
     </w:p>
     <w:p>
@@ -844,7 +844,7 @@
         <w:rPr>
           <w:sz w:val="16"/>
         </w:rPr>
-        <w:t>grid: fixed steps × tolerances, https://github.com/mardigiorgio/icra2027/blob/35e64ae8da89/part1/bench/benchmarks/part1_actuated.py#L73</w:t>
+        <w:t>grid: fixed steps × tolerances, https://github.com/mardigiorgio/icra2027/blob/c0279e47d8fe/part1/bench/benchmarks/part1_actuated.py#L73</w:t>
       </w:r>
     </w:p>
     <w:p>
@@ -855,7 +855,7 @@
         <w:rPr>
           <w:sz w:val="16"/>
         </w:rPr>
-        <w:t>metrics (lift, pitch, penetration, chatter), https://github.com/mardigiorgio/icra2027/blob/35e64ae8da89/part1/bench/benchmarks/part1_actuated.py#L108-L159</w:t>
+        <w:t>metrics (lift, pitch, penetration, chatter), https://github.com/mardigiorgio/icra2027/blob/c0279e47d8fe/part1/bench/benchmarks/part1_actuated.py#L108-L159</w:t>
       </w:r>
     </w:p>
     <w:p>
@@ -866,7 +866,7 @@
         <w:rPr>
           <w:sz w:val="16"/>
         </w:rPr>
-        <w:t>sweep driver (gains × arms × knobs), https://github.com/mardigiorgio/icra2027/blob/35e64ae8da89/part1/bench/benchmarks/part1_actuated.py#L191</w:t>
+        <w:t>sweep driver (gains × arms × knobs), https://github.com/mardigiorgio/icra2027/blob/c0279e47d8fe/part1/bench/benchmarks/part1_actuated.py#L191</w:t>
       </w:r>
     </w:p>
     <w:sectPr>

</xml_diff>

<commit_message>
Side-by-side scene panels and force-diagram actuated schematic
Scene renders put each scene's initial and settled states side by side
(one row per scene): the stacked layout made a tall image that document
viewers squash to fit. The actuated schematic freezes the instant before
contact from a near-side camera so nothing overlaps the box: fingertip,
stretched virtual spring, commanded point at the box face, descend path,
slide arrow, with the tip-to-box gap widened for legibility and the
figure marked not to scale.
</commit_message>
<xml_diff>
--- a/part1/bench/results/P1_core_experiments.docx
+++ b/part1/bench/results/P1_core_experiments.docx
@@ -259,7 +259,7 @@
       <w:r>
         <w:drawing>
           <wp:inline xmlns:a="http://schemas.openxmlformats.org/drawingml/2006/main" xmlns:pic="http://schemas.openxmlformats.org/drawingml/2006/picture">
-            <wp:extent cx="2377440" cy="2304846"/>
+            <wp:extent cx="5669280" cy="5650798"/>
             <wp:docPr id="3" name="Picture 3"/>
             <wp:cNvGraphicFramePr>
               <a:graphicFrameLocks noChangeAspect="1"/>
@@ -280,7 +280,7 @@
                   <pic:spPr>
                     <a:xfrm>
                       <a:off x="0" y="0"/>
-                      <a:ext cx="2377440" cy="2304846"/>
+                      <a:ext cx="5669280" cy="5650798"/>
                     </a:xfrm>
                     <a:prstGeom prst="rect"/>
                   </pic:spPr>
@@ -458,7 +458,7 @@
       <w:r>
         <w:drawing>
           <wp:inline xmlns:a="http://schemas.openxmlformats.org/drawingml/2006/main" xmlns:pic="http://schemas.openxmlformats.org/drawingml/2006/picture">
-            <wp:extent cx="2377440" cy="5041584"/>
+            <wp:extent cx="5669280" cy="2878534"/>
             <wp:docPr id="5" name="Picture 5"/>
             <wp:cNvGraphicFramePr>
               <a:graphicFrameLocks noChangeAspect="1"/>
@@ -479,7 +479,7 @@
                   <pic:spPr>
                     <a:xfrm>
                       <a:off x="0" y="0"/>
-                      <a:ext cx="2377440" cy="5041584"/>
+                      <a:ext cx="5669280" cy="2878534"/>
                     </a:xfrm>
                     <a:prstGeom prst="rect"/>
                   </pic:spPr>
@@ -638,7 +638,7 @@
       <w:r>
         <w:drawing>
           <wp:inline xmlns:a="http://schemas.openxmlformats.org/drawingml/2006/main" xmlns:pic="http://schemas.openxmlformats.org/drawingml/2006/picture">
-            <wp:extent cx="2377440" cy="2377440"/>
+            <wp:extent cx="3657600" cy="3657600"/>
             <wp:docPr id="7" name="Picture 7"/>
             <wp:cNvGraphicFramePr>
               <a:graphicFrameLocks noChangeAspect="1"/>
@@ -659,7 +659,7 @@
                   <pic:spPr>
                     <a:xfrm>
                       <a:off x="0" y="0"/>
-                      <a:ext cx="2377440" cy="2377440"/>
+                      <a:ext cx="3657600" cy="3657600"/>
                     </a:xfrm>
                     <a:prstGeom prst="rect"/>
                   </pic:spPr>

</xml_diff>

<commit_message>
Make the stiffness figure self-reading
Plain-language axes (milliseconds; sink depth as 1x/10x/100x too deep),
direct labels on every curve instead of a legend box, and the story
annotated where it happens: the fine-step agreement that defines the
shared system, the clamp softening, the literal-k launches, and the
tolerance panel's blind spot.
</commit_message>
<xml_diff>
--- a/part1/bench/results/P1_core_experiments.docx
+++ b/part1/bench/results/P1_core_experiments.docx
@@ -80,7 +80,7 @@
       <w:r>
         <w:drawing>
           <wp:inline xmlns:a="http://schemas.openxmlformats.org/drawingml/2006/main" xmlns:pic="http://schemas.openxmlformats.org/drawingml/2006/picture">
-            <wp:extent cx="5669280" cy="2582957"/>
+            <wp:extent cx="5669280" cy="2669300"/>
             <wp:docPr id="2" name="Picture 2"/>
             <wp:cNvGraphicFramePr>
               <a:graphicFrameLocks noChangeAspect="1"/>
@@ -101,7 +101,7 @@
                   <pic:spPr>
                     <a:xfrm>
                       <a:off x="0" y="0"/>
-                      <a:ext cx="5669280" cy="2582957"/>
+                      <a:ext cx="5669280" cy="2669300"/>
                     </a:xfrm>
                     <a:prstGeom prst="rect"/>
                   </pic:spPr>

</xml_diff>

<commit_message>
Revert stiffness figure to the standard-legend layout
</commit_message>
<xml_diff>
--- a/part1/bench/results/P1_core_experiments.docx
+++ b/part1/bench/results/P1_core_experiments.docx
@@ -80,7 +80,7 @@
       <w:r>
         <w:drawing>
           <wp:inline xmlns:a="http://schemas.openxmlformats.org/drawingml/2006/main" xmlns:pic="http://schemas.openxmlformats.org/drawingml/2006/picture">
-            <wp:extent cx="5669280" cy="2669300"/>
+            <wp:extent cx="5669280" cy="2582957"/>
             <wp:docPr id="2" name="Picture 2"/>
             <wp:cNvGraphicFramePr>
               <a:graphicFrameLocks noChangeAspect="1"/>
@@ -101,7 +101,7 @@
                   <pic:spPr>
                     <a:xfrm>
                       <a:off x="0" y="0"/>
-                      <a:ext cx="5669280" cy="2669300"/>
+                      <a:ext cx="5669280" cy="2582957"/>
                     </a:xfrm>
                     <a:prstGeom prst="rect"/>
                   </pic:spPr>

</xml_diff>

<commit_message>
Move stiffness legend below the panels, enlarge unstable crosses
</commit_message>
<xml_diff>
--- a/part1/bench/results/P1_core_experiments.docx
+++ b/part1/bench/results/P1_core_experiments.docx
@@ -80,7 +80,7 @@
       <w:r>
         <w:drawing>
           <wp:inline xmlns:a="http://schemas.openxmlformats.org/drawingml/2006/main" xmlns:pic="http://schemas.openxmlformats.org/drawingml/2006/picture">
-            <wp:extent cx="5669280" cy="2582957"/>
+            <wp:extent cx="5669280" cy="2726251"/>
             <wp:docPr id="2" name="Picture 2"/>
             <wp:cNvGraphicFramePr>
               <a:graphicFrameLocks noChangeAspect="1"/>
@@ -101,7 +101,7 @@
                   <pic:spPr>
                     <a:xfrm>
                       <a:off x="0" y="0"/>
-                      <a:ext cx="5669280" cy="2582957"/>
+                      <a:ext cx="5669280" cy="2726251"/>
                     </a:xfrm>
                     <a:prstGeom prst="rect"/>
                   </pic:spPr>

</xml_diff>

<commit_message>
One consistent name pair for MuJoCo's two solref readings
Legend and prose now both say time-constant form and direct-stiffness
form; the reference/literal-k vocabulary is gone.
</commit_message>
<xml_diff>
--- a/part1/bench/results/P1_core_experiments.docx
+++ b/part1/bench/results/P1_core_experiments.docx
@@ -126,7 +126,7 @@
         <w:rPr>
           <w:sz w:val="20"/>
         </w:rPr>
-        <w:t>The setup is a single 65-gram sphere resting on a flat floor, with the contact stiffness fixed at k = 100,000 N/m for the whole experiment. The two solvers describe contact in different languages, so the figure shows three presentations of the same physical system. ICF has a literal stiffness parameter: you hand it k in newtons per meter and the floor pushes back with k times the overlap depth. MuJoCo's usual contact input (a parameter called solref, reference form) is a time constant τ: remove any violation smoothly over about τ seconds. An effective stiffness emerges from τ, scaled by the mass of the touching bodies, and MuJoCo refuses to honor any τ smaller than twice the timestep, a documented safety rule called refsafe. MuJoCo also accepts a second input format (solref, direct form) that takes a stiffness-style constant instead of a time constant, with no safety rule attached. Both formats live in MuJoCo's own contact code; the direct form is the closest MuJoCo gets to ICF's literal k.</w:t>
+        <w:t>The setup is a single 65-gram sphere resting on a flat floor, with the contact stiffness fixed at k = 100,000 N/m for the whole experiment. The two solvers describe contact in different languages, so the figure shows three presentations of the same physical system. ICF has a literal stiffness parameter: you hand it k in newtons per meter and the floor pushes back with k times the overlap depth. MuJoCo's usual contact input (a parameter called solref, in its time-constant form) is a time constant τ: remove any violation smoothly over about τ seconds. An effective stiffness emerges from τ, scaled by the mass of the touching bodies, and MuJoCo refuses to honor any τ smaller than twice the timestep, a documented safety rule called refsafe. MuJoCo also accepts a second input format (the same solref slot in its direct-stiffness form) that takes a stiffness-style constant instead of a time constant, with no safety rule attached. Both formats live in MuJoCo's own contact code; the direct-stiffness form is the closest MuJoCo gets to ICF's literal k.</w:t>
       </w:r>
     </w:p>
     <w:p>
@@ -134,7 +134,7 @@
         <w:rPr>
           <w:sz w:val="20"/>
         </w:rPr>
-        <w:t>The yardstick comes from statics and belongs to neither solver. A resting sphere is held up by a contact force equal to its weight mg, so a spring-like contact of stiffness k must be overlapped by exactly mg/k at rest: 6.4 micrometers here. That number is the physics; no solver appears in its derivation. Equality between the solvers is then established by convergence, not by translating parameters: each MuJoCo form has its one dial set so that, at a timestep fine enough to be converged, the measured resting depth is mg/k. Concretely: hold the step at a fine 1 millisecond, sweep the dial, and keep the value at which the sphere sinks by exactly mg/k. That gave τ = 2.4 milliseconds for the reference form in this scene, and the direct form’s constant was found the same way. The figure re-runs this check every time: if either constant were wrong, the fine-step points would not sit at 1. The left edge of panel (a) is the receipt: at steps of 1 millisecond and finer, all three presentations sit at ratio 1.00 within 2 percent. Three formulations, measurably the same physical system. Nothing else is translated, converted, or fitted anywhere in this experiment.</w:t>
+        <w:t>The yardstick comes from statics and belongs to neither solver. A resting sphere is held up by a contact force equal to its weight mg, so a spring-like contact of stiffness k must be overlapped by exactly mg/k at rest: 6.4 micrometers here. That number is the physics; no solver appears in its derivation. Equality between the solvers is then established by convergence, not by translating parameters: each MuJoCo form has its one dial set so that, at a timestep fine enough to be converged, the measured resting depth is mg/k. Concretely: hold the step at a fine 1 millisecond, sweep the dial, and keep the value at which the sphere sinks by exactly mg/k. That gave τ = 2.4 milliseconds for the time-constant form in this scene, and the direct-stiffness form's constant was found the same way. The figure re-runs this check every time: if either constant were wrong, the fine-step points would not sit at 1. The left edge of panel (a) is the receipt: at steps of 1 millisecond and finer, all three presentations sit at ratio 1.00 within 2 percent. Three formulations, measurably the same physical system. Nothing else is translated, converted, or fitted anywhere in this experiment.</w:t>
       </w:r>
     </w:p>
     <w:p>
@@ -158,7 +158,7 @@
         <w:rPr>
           <w:sz w:val="20"/>
         </w:rPr>
-        <w:t>What happens, panel (a): ICF reads 1.00 at every step, 10 milliseconds included. MuJoCo in its reference form is exactly right at 1 and 0.5 milliseconds (0.98) and departs precisely where its own safety rule says it must, at steps above τ/2 = 1.2 milliseconds (the calibrated τ here is 2.4 milliseconds): 2.7 times too soft at 2 ms, 17 times at 5 ms, 57 times at 10 ms. MuJoCo in its direct form, the literal stiffness with no safety rule, is exactly right at 2 ms and finer (0.999 to 1.000) and is unstable at 5 and 10 ms: the sphere is launched off the floor. So at the coarse steps learners use, MuJoCo offers a choice between a softened contact and an exploding one; there is no third setting. In the soft companion runs (k = 1,000 N/m) both solvers read 0.998 to 1.000 at every step including 10 ms: MuJoCo is exactly right whenever the step resolves its time constant. Panel (b): CENIC reads 1.00 at every tolerance. MuJoCo's error control stays 17 times too soft from ε = 0.1 through ε = 0.0001 and only approaches the physics (1.25) at ε = 0.00001, because a position-error test cannot see a softening that is self-consistent at the steps the controller settles into.</w:t>
+        <w:t>What happens, panel (a): ICF reads 1.00 at every step, 10 milliseconds included. MuJoCo in its time-constant form is exactly right at 1 and 0.5 milliseconds (0.98) and departs precisely where its own safety rule says it must, at steps above τ/2 = 1.2 milliseconds (the calibrated τ here is 2.4 milliseconds): 2.7 times too soft at 2 ms, 17 times at 5 ms, 57 times at 10 ms. MuJoCo in its direct-stiffness form, the stiffness written directly with no safety rule, is exactly right at 2 ms and finer (0.999 to 1.000) and is unstable at 5 and 10 ms: the sphere is launched off the floor. So at the coarse steps learners use, MuJoCo offers a choice between a softened contact and an exploding one; there is no third setting. In the soft companion runs (k = 1,000 N/m) both solvers read 0.998 to 1.000 at every step including 10 ms: MuJoCo is exactly right whenever the step resolves its time constant. Panel (b): CENIC reads 1.00 at every tolerance. MuJoCo's error control stays 17 times too soft from ε = 0.1 through ε = 0.0001 and only approaches the physics (1.25) at ε = 0.00001, because a position-error test cannot see a softening that is self-consistent at the steps the controller settles into.</w:t>
       </w:r>
     </w:p>
     <w:p>
@@ -166,7 +166,7 @@
         <w:rPr>
           <w:sz w:val="20"/>
         </w:rPr>
-        <w:t>Why it matters: nothing here is a bug in MuJoCo; each form faithfully executes its own documented rule (the clamp is real, and an explicit spring's instability at coarse steps is textbook). The finding is that the physics MuJoCo delivers depends on the step you chose, that the literal-stiffness route does not survive coarse steps at all, and that error control on positions does not buy the physics back. ICF's contact does not move with the step, which is the property the rest of the paper builds on. And because each curve is judged only against the model's own mg/k, with the agreement demonstrated inside the figure at fine steps, no cross-solver conversion is involved anywhere.</w:t>
+        <w:t>Why it matters: nothing here is a bug in MuJoCo; each form faithfully executes its own documented rule (the clamp is real, and an explicit spring's instability at coarse steps is textbook). The finding is that the physics MuJoCo delivers depends on the step you chose, that the direct-stiffness route does not survive coarse steps at all, and that error control on positions does not buy the physics back. ICF's contact does not move with the step, which is the property the rest of the paper builds on. And because each curve is judged only against the model's own mg/k, with the agreement demonstrated inside the figure at fine steps, no cross-solver conversion is involved anywhere.</w:t>
       </w:r>
     </w:p>
     <w:p>
@@ -197,7 +197,7 @@
         <w:rPr>
           <w:sz w:val="16"/>
         </w:rPr>
-        <w:t>the two MuJoCo presentations (calibrated reference solref; direct solref, self-verifying at fine steps), https://github.com/mardigiorgio/icra2027/blob/48604cf33b/part1/bench/benchmarks/part1_stiffness_sweep.py#L43-L47</w:t>
+        <w:t>the two MuJoCo presentations (calibrated time-constant solref; direct-stiffness solref, self-verifying at fine steps), https://github.com/mardigiorgio/icra2027/blob/48604cf33b/part1/bench/benchmarks/part1_stiffness_sweep.py#L43-L47</w:t>
       </w:r>
     </w:p>
     <w:p>

</xml_diff>

<commit_message>
Drop the direct-stiffness arm; standard MuJoCo vs ICF only
</commit_message>
<xml_diff>
--- a/part1/bench/results/P1_core_experiments.docx
+++ b/part1/bench/results/P1_core_experiments.docx
@@ -23,7 +23,7 @@
         <w:rPr>
           <w:sz w:val="20"/>
         </w:rPr>
-        <w:t>Reading guide, assume nothing: every experiment compares four “arms”, meaning the same physics advanced four different ways. There are two contact solvers: MuJoCo, the contact solver of the standard robotics simulator, and ICF, the convex contact solver CENIC is built on. Each runs in two modes. FIXED STEP: the simulation always advances by the same slice of time δt, chosen in advance (10 ms, 1 ms, ...). ERROR CONTROL (EC): the solver takes a trial step, re-takes it as two half-steps, compares the two results to estimate its own error, and shrinks or grows the step so the error stays below a tolerance ε you request: small steps during impacts, big steps when nothing is happening. CENIC is ICF's error-controlled mode. Everywhere: smaller δt or smaller ε means more accurate and more expensive. One experiment (Experiment 1) additionally shows MuJoCo in a second input format, explained there.</w:t>
+        <w:t>Reading guide, assume nothing: every experiment compares four “arms”, meaning the same physics advanced four different ways. There are two contact solvers: MuJoCo, the contact solver of the standard robotics simulator, and ICF, the convex contact solver CENIC is built on. Each runs in two modes. FIXED STEP: the simulation always advances by the same slice of time δt, chosen in advance (10 ms, 1 ms, ...). ERROR CONTROL (EC): the solver takes a trial step, re-takes it as two half-steps, compares the two results to estimate its own error, and shrinks or grows the step so the error stays below a tolerance ε you request: small steps during impacts, big steps when nothing is happening. CENIC is ICF's error-controlled mode. Everywhere: smaller δt or smaller ε means more accurate and more expensive.</w:t>
       </w:r>
     </w:p>
     <w:p>
@@ -118,7 +118,7 @@
           <w:b/>
           <w:sz w:val="20"/>
         </w:rPr>
-        <w:t>One 65 g sphere rests on the floor with one fixed contact stiffness; we change only the timestep and the tolerance and measure how far each solver drifts from the physics all of them agree on at fine steps.</w:t>
+        <w:t>One 65 g sphere rests on the floor with one fixed contact stiffness; we change only the timestep and the tolerance and measure how far each solver drifts from the physics both solvers agree on at fine steps.</w:t>
       </w:r>
     </w:p>
     <w:p>
@@ -126,7 +126,7 @@
         <w:rPr>
           <w:sz w:val="20"/>
         </w:rPr>
-        <w:t>The setup is a single 65-gram sphere resting on a flat floor, with the contact stiffness fixed at k = 100,000 N/m for the whole experiment. The two solvers describe contact in different languages, so the figure shows three presentations of the same physical system. ICF has a literal stiffness parameter: you hand it k in newtons per meter and the floor pushes back with k times the overlap depth. MuJoCo's usual contact input (a parameter called solref, in its time-constant form) is a time constant τ: remove any violation smoothly over about τ seconds. An effective stiffness emerges from τ, scaled by the mass of the touching bodies, and MuJoCo refuses to honor any τ smaller than twice the timestep, a documented safety rule called refsafe. MuJoCo also accepts a second input format (the same solref slot in its direct-stiffness form) that takes a stiffness-style constant instead of a time constant, with no safety rule attached. Both formats live in MuJoCo's own contact code; the direct-stiffness form is the closest MuJoCo gets to ICF's literal k.</w:t>
+        <w:t>The setup is a single 65-gram sphere resting on a flat floor, with the contact stiffness fixed at k = 100,000 N/m for the whole experiment. The two solvers describe contact in different languages, so the figure shows the same physical system in both languages. ICF has a literal stiffness parameter: you hand it k in newtons per meter and the floor pushes back with k times the overlap depth. MuJoCo's usual contact input (a parameter called solref) is a time constant τ: remove any violation smoothly over about τ seconds. An effective stiffness emerges from τ, scaled by the mass of the touching bodies, and MuJoCo refuses to honor any τ smaller than twice the timestep, a documented safety rule called refsafe.</w:t>
       </w:r>
     </w:p>
     <w:p>
@@ -134,7 +134,7 @@
         <w:rPr>
           <w:sz w:val="20"/>
         </w:rPr>
-        <w:t>The yardstick comes from statics and belongs to neither solver. A resting sphere is held up by a contact force equal to its weight mg, so a spring-like contact of stiffness k must be overlapped by exactly mg/k at rest: 6.4 micrometers here. That number is the physics; no solver appears in its derivation. Equality between the solvers is then established by convergence, not by translating parameters: each MuJoCo form has its one dial set so that, at a timestep fine enough to be converged, the measured resting depth is mg/k. Concretely: hold the step at a fine 1 millisecond, sweep the dial, and keep the value at which the sphere sinks by exactly mg/k. That gave τ = 2.4 milliseconds for the time-constant form in this scene, and the direct-stiffness form's constant was found the same way. The figure re-runs this check every time: if either constant were wrong, the fine-step points would not sit at 1. The left edge of panel (a) is the receipt: at steps of 1 millisecond and finer, all three presentations sit at ratio 1.00 within 2 percent. Three formulations, measurably the same physical system. Nothing else is translated, converted, or fitted anywhere in this experiment.</w:t>
+        <w:t>The yardstick comes from statics and belongs to neither solver. A resting sphere is held up by a contact force equal to its weight mg, so a spring-like contact of stiffness k must be overlapped by exactly mg/k at rest: 6.4 micrometers here. That number is the physics; no solver appears in its derivation. Equality between the solvers is then established by convergence, not by translating parameters: MuJoCo's one dial, its time constant, is set so that, at a timestep fine enough to be converged, the measured resting depth is mg/k. Concretely: hold the step at a fine 1 millisecond, sweep the dial, and keep the value at which the sphere sinks by exactly mg/k. That gave τ = 2.4 milliseconds for this scene. The figure re-runs this check every time: if the constant were wrong, the fine-step points would not sit at 1. The left edge of panel (a) is the receipt: at steps of 1 millisecond and finer, both solvers sit at ratio 1.00 within 2 percent. Two formulations, measurably the same physical system. Nothing else is translated, converted, or fitted anywhere in this experiment.</w:t>
       </w:r>
     </w:p>
     <w:p>
@@ -150,7 +150,7 @@
         <w:rPr>
           <w:sz w:val="20"/>
         </w:rPr>
-        <w:t>After the sphere settles we read its overlap depth from the geometry and divide by mg/k. A ratio of 1 means the solver delivered the agreed physics. Because a resting contact always carries exactly the weight, a ratio above 1 means the contact went softer than the system by that factor. A cross at the top edge marks a run where the sphere was thrown off the floor instead of resting; its depth is meaningless.</w:t>
+        <w:t>After the sphere settles we read its overlap depth from the geometry and divide by mg/k. A ratio of 1 means the solver delivered the agreed physics. Because a resting contact always carries exactly the weight, a ratio above 1 means the contact went softer than the system by that factor.</w:t>
       </w:r>
     </w:p>
     <w:p>
@@ -158,7 +158,7 @@
         <w:rPr>
           <w:sz w:val="20"/>
         </w:rPr>
-        <w:t>What happens, panel (a): ICF reads 1.00 at every step, 10 milliseconds included. MuJoCo in its time-constant form is exactly right at 1 and 0.5 milliseconds (0.98) and departs precisely where its own safety rule says it must, at steps above τ/2 = 1.2 milliseconds (the calibrated τ here is 2.4 milliseconds): 2.7 times too soft at 2 ms, 17 times at 5 ms, 57 times at 10 ms. MuJoCo in its direct-stiffness form, the stiffness written directly with no safety rule, is exactly right at 2 ms and finer (0.999 to 1.000) and is unstable at 5 and 10 ms: the sphere is launched off the floor. So at the coarse steps learners use, MuJoCo offers a choice between a softened contact and an exploding one; there is no third setting. In the soft companion runs (k = 1,000 N/m) both solvers read 0.998 to 1.000 at every step including 10 ms: MuJoCo is exactly right whenever the step resolves its time constant. Panel (b): CENIC reads 1.00 at every tolerance. MuJoCo's error control stays 17 times too soft from ε = 0.1 through ε = 0.0001 and only approaches the physics (1.25) at ε = 0.00001, because a position-error test cannot see a softening that is self-consistent at the steps the controller settles into.</w:t>
+        <w:t>What happens, panel (a): ICF reads 1.00 at every step, 10 milliseconds included. MuJoCo is exactly right at 1 and 0.5 milliseconds (0.98) and departs precisely where its own safety rule says it must, at steps above τ/2 = 1.2 milliseconds (the calibrated τ here is 2.4 milliseconds): 2.7 times too soft at 2 ms, 17 times at 5 ms, 57 times at 10 ms. In the soft companion runs (k = 1,000 N/m) both solvers read 0.998 to 1.000 at every step including 10 ms: MuJoCo is exactly right whenever the step resolves its time constant. Panel (b): CENIC reads 1.00 at every tolerance. MuJoCo's error control stays 17 times too soft from ε = 0.1 through ε = 0.0001 and only approaches the physics (1.25) at ε = 0.00001, because a position-error test cannot see a softening that is self-consistent at the steps the controller settles into.</w:t>
       </w:r>
     </w:p>
     <w:p>
@@ -166,7 +166,7 @@
         <w:rPr>
           <w:sz w:val="20"/>
         </w:rPr>
-        <w:t>Why it matters: nothing here is a bug in MuJoCo; each form faithfully executes its own documented rule (the clamp is real, and an explicit spring's instability at coarse steps is textbook). The finding is that the physics MuJoCo delivers depends on the step you chose, that the direct-stiffness route does not survive coarse steps at all, and that error control on positions does not buy the physics back. ICF's contact does not move with the step, which is the property the rest of the paper builds on. And because each curve is judged only against the model's own mg/k, with the agreement demonstrated inside the figure at fine steps, no cross-solver conversion is involved anywhere.</w:t>
+        <w:t>Why it matters: nothing here is a bug in MuJoCo; the solver faithfully executes its own documented rule. The finding is that the physics MuJoCo delivers depends on the step you chose, and that error control on positions does not buy the physics back. ICF's contact does not move with the step, which is the property the rest of the paper builds on. And because each curve is judged only against the model's own mg/k, with the agreement demonstrated inside the figure at fine steps, no cross-solver conversion is involved anywhere.</w:t>
       </w:r>
     </w:p>
     <w:p>
@@ -197,7 +197,7 @@
         <w:rPr>
           <w:sz w:val="16"/>
         </w:rPr>
-        <w:t>the two MuJoCo presentations (calibrated time-constant solref; direct-stiffness solref, self-verifying at fine steps), https://github.com/mardigiorgio/icra2027/blob/48604cf33b/part1/bench/benchmarks/part1_stiffness_sweep.py#L43-L47</w:t>
+        <w:t>the calibrated MuJoCo solref anchor, self-verifying at fine steps, https://github.com/mardigiorgio/icra2027/blob/48604cf33b/part1/bench/benchmarks/part1_stiffness_sweep.py#L43-L47</w:t>
       </w:r>
     </w:p>
     <w:p>

</xml_diff>

<commit_message>
Hard-clutter render: no panel letter, moderate size in the doc
</commit_message>
<xml_diff>
--- a/part1/bench/results/P1_core_experiments.docx
+++ b/part1/bench/results/P1_core_experiments.docx
@@ -458,7 +458,7 @@
       <w:r>
         <w:drawing>
           <wp:inline xmlns:a="http://schemas.openxmlformats.org/drawingml/2006/main" xmlns:pic="http://schemas.openxmlformats.org/drawingml/2006/picture">
-            <wp:extent cx="5669280" cy="2878534"/>
+            <wp:extent cx="4114800" cy="2089258"/>
             <wp:docPr id="5" name="Picture 5"/>
             <wp:cNvGraphicFramePr>
               <a:graphicFrameLocks noChangeAspect="1"/>
@@ -479,7 +479,7 @@
                   <pic:spPr>
                     <a:xfrm>
                       <a:off x="0" y="0"/>
-                      <a:ext cx="5669280" cy="2878534"/>
+                      <a:ext cx="4114800" cy="2089258"/>
                     </a:xfrm>
                     <a:prstGeom prst="rect"/>
                   </pic:spPr>

</xml_diff>

<commit_message>
Center scene names over render rows, match Exp 2 render to Exp 3
</commit_message>
<xml_diff>
--- a/part1/bench/results/P1_core_experiments.docx
+++ b/part1/bench/results/P1_core_experiments.docx
@@ -259,7 +259,7 @@
       <w:r>
         <w:drawing>
           <wp:inline xmlns:a="http://schemas.openxmlformats.org/drawingml/2006/main" xmlns:pic="http://schemas.openxmlformats.org/drawingml/2006/picture">
-            <wp:extent cx="5669280" cy="5650798"/>
+            <wp:extent cx="4114800" cy="4183208"/>
             <wp:docPr id="3" name="Picture 3"/>
             <wp:cNvGraphicFramePr>
               <a:graphicFrameLocks noChangeAspect="1"/>
@@ -280,7 +280,7 @@
                   <pic:spPr>
                     <a:xfrm>
                       <a:off x="0" y="0"/>
-                      <a:ext cx="5669280" cy="5650798"/>
+                      <a:ext cx="4114800" cy="4183208"/>
                     </a:xfrm>
                     <a:prstGeom prst="rect"/>
                   </pic:spPr>
@@ -458,7 +458,7 @@
       <w:r>
         <w:drawing>
           <wp:inline xmlns:a="http://schemas.openxmlformats.org/drawingml/2006/main" xmlns:pic="http://schemas.openxmlformats.org/drawingml/2006/picture">
-            <wp:extent cx="4114800" cy="2089258"/>
+            <wp:extent cx="4114800" cy="2120364"/>
             <wp:docPr id="5" name="Picture 5"/>
             <wp:cNvGraphicFramePr>
               <a:graphicFrameLocks noChangeAspect="1"/>
@@ -479,7 +479,7 @@
                   <pic:spPr>
                     <a:xfrm>
                       <a:off x="0" y="0"/>
-                      <a:ext cx="4114800" cy="2089258"/>
+                      <a:ext cx="4114800" cy="2120364"/>
                     </a:xfrm>
                     <a:prstGeom prst="rect"/>
                   </pic:spPr>

</xml_diff>

<commit_message>
P1 doc: design-only; Exp 4 = CPU Drake CENIC vs GPU Newton CENIC
</commit_message>
<xml_diff>
--- a/part1/bench/results/P1_core_experiments.docx
+++ b/part1/bench/results/P1_core_experiments.docx
@@ -7,7 +7,7 @@
         <w:pStyle w:val="Heading1"/>
       </w:pPr>
       <w:r>
-        <w:t>Part 1, core experiments</w:t>
+        <w:t>Part 1, core experiments (design)</w:t>
       </w:r>
     </w:p>
     <w:p>
@@ -15,15 +15,44 @@
         <w:rPr>
           <w:i/>
         </w:rPr>
-        <w:t>Four experiments carry Part 1. Each entry: the scene, the figure, a one-line caption, a plain-language explanation (setup, what is altered, what is measured, what happens, why it matters), and line-level code citations at commit c0279e47d8fe.</w:t>
+        <w:t>Design-only revision, 2026-09-01, on the PI's request: each experiment lists scene, arms, what is varied, what is measured, and code. Scene images: simulator-viewer captures pending (schematic renders removed).</w:t>
       </w:r>
     </w:p>
     <w:p>
       <w:r>
-        <w:rPr>
-          <w:sz w:val="20"/>
-        </w:rPr>
-        <w:t>Reading guide, assume nothing: every experiment compares four “arms”, meaning the same physics advanced four different ways. There are two contact solvers: MuJoCo, the contact solver of the standard robotics simulator, and ICF, the convex contact solver CENIC is built on. Each runs in two modes. FIXED STEP: the simulation always advances by the same slice of time δt, chosen in advance (10 ms, 1 ms, ...). ERROR CONTROL (EC): the solver takes a trial step, re-takes it as two half-steps, compares the two results to estimate its own error, and shrinks or grows the step so the error stays below a tolerance ε you request: small steps during impacts, big steps when nothing is happening. CENIC is ICF's error-controlled mode. Everywhere: smaller δt or smaller ε means more accurate and more expensive.</w:t>
+        <w:t>Reading key:</w:t>
+      </w:r>
+    </w:p>
+    <w:p>
+      <w:pPr>
+        <w:pStyle w:val="ListBullet"/>
+      </w:pPr>
+      <w:r>
+        <w:t>Two contact solvers: MuJoCo (solref constraint contact) and ICF (convex contact with a literal stiffness k in N/m)</w:t>
+      </w:r>
+    </w:p>
+    <w:p>
+      <w:pPr>
+        <w:pStyle w:val="ListBullet"/>
+      </w:pPr>
+      <w:r>
+        <w:t>Two stepping modes each: FIXED (one chosen step size δt) and ERROR CONTROL, EC (step-doubling estimate, per-world step adapts so position error stays below a requested tolerance ε)</w:t>
+      </w:r>
+    </w:p>
+    <w:p>
+      <w:pPr>
+        <w:pStyle w:val="ListBullet"/>
+      </w:pPr>
+      <w:r>
+        <w:t>CENIC = ICF + error control</w:t>
+      </w:r>
+    </w:p>
+    <w:p>
+      <w:pPr>
+        <w:pStyle w:val="ListBullet"/>
+      </w:pPr>
+      <w:r>
+        <w:t>Smaller δt or smaller ε: more accurate, more expensive</w:t>
       </w:r>
     </w:p>
     <w:p>
@@ -31,57 +60,15 @@
         <w:pStyle w:val="Heading2"/>
       </w:pPr>
       <w:r>
-        <w:t>Experiment 1, Realized contact stiffness</w:t>
+        <w:t>Experiment 1, Contact stiffness realization: penetration vs step and vs tolerance</w:t>
       </w:r>
     </w:p>
     <w:p>
-      <w:pPr>
-        <w:jc w:val="center"/>
-      </w:pPr>
-      <w:r>
-        <w:drawing>
-          <wp:inline xmlns:a="http://schemas.openxmlformats.org/drawingml/2006/main" xmlns:pic="http://schemas.openxmlformats.org/drawingml/2006/picture">
-            <wp:extent cx="2377440" cy="2377440"/>
-            <wp:docPr id="1" name="Picture 1"/>
-            <wp:cNvGraphicFramePr>
-              <a:graphicFrameLocks noChangeAspect="1"/>
-            </wp:cNvGraphicFramePr>
-            <a:graphic>
-              <a:graphicData uri="http://schemas.openxmlformats.org/drawingml/2006/picture">
-                <pic:pic>
-                  <pic:nvPicPr>
-                    <pic:cNvPr id="0" name="scene_stiffness.png"/>
-                    <pic:cNvPicPr/>
-                  </pic:nvPicPr>
-                  <pic:blipFill>
-                    <a:blip r:embed="rId9"/>
-                    <a:stretch>
-                      <a:fillRect/>
-                    </a:stretch>
-                  </pic:blipFill>
-                  <pic:spPr>
-                    <a:xfrm>
-                      <a:off x="0" y="0"/>
-                      <a:ext cx="2377440" cy="2377440"/>
-                    </a:xfrm>
-                    <a:prstGeom prst="rect"/>
-                  </pic:spPr>
-                </pic:pic>
-              </a:graphicData>
-            </a:graphic>
-          </wp:inline>
-        </w:drawing>
-      </w:r>
-    </w:p>
-    <w:p>
-      <w:pPr>
-        <w:jc w:val="center"/>
-      </w:pPr>
       <w:r>
         <w:drawing>
           <wp:inline xmlns:a="http://schemas.openxmlformats.org/drawingml/2006/main" xmlns:pic="http://schemas.openxmlformats.org/drawingml/2006/picture">
             <wp:extent cx="5669280" cy="2726251"/>
-            <wp:docPr id="2" name="Picture 2"/>
+            <wp:docPr id="1" name="Picture 1"/>
             <wp:cNvGraphicFramePr>
               <a:graphicFrameLocks noChangeAspect="1"/>
             </wp:cNvGraphicFramePr>
@@ -93,7 +80,7 @@
                     <pic:cNvPicPr/>
                   </pic:nvPicPr>
                   <pic:blipFill>
-                    <a:blip r:embed="rId10"/>
+                    <a:blip r:embed="rId9"/>
                     <a:stretch>
                       <a:fillRect/>
                     </a:stretch>
@@ -114,67 +101,59 @@
     </w:p>
     <w:p>
       <w:r>
-        <w:rPr>
-          <w:b/>
-          <w:sz w:val="20"/>
-        </w:rPr>
-        <w:t>One 65 g sphere rests on the floor with one fixed contact stiffness; we change only the timestep and the tolerance and measure how far each solver drifts from the physics both solvers agree on at fine steps.</w:t>
+        <w:t>Design:</w:t>
+      </w:r>
+    </w:p>
+    <w:p>
+      <w:pPr>
+        <w:pStyle w:val="ListBullet"/>
+      </w:pPr>
+      <w:r>
+        <w:t>Scene: one sphere, r = 2.5 cm, density 1000 (65 g), resting on a flat floor; friction 0.5; contact margin 0; 3 s settle before readout</w:t>
+      </w:r>
+    </w:p>
+    <w:p>
+      <w:pPr>
+        <w:pStyle w:val="ListBullet"/>
+      </w:pPr>
+      <w:r>
+        <w:t>Contact stiffness: k = 100,000 N/m for the whole experiment (companion rows at k = 1,000 in the same CSV); ICF takes k directly; MuJoCo takes solref τ = 2.4 ms, calibrated so the converged rest depth equals mg/k at a 1 ms step (τ swept at fixed 1 ms until depth = mg/k)</w:t>
+      </w:r>
+    </w:p>
+    <w:p>
+      <w:pPr>
+        <w:pStyle w:val="ListBullet"/>
+      </w:pPr>
+      <w:r>
+        <w:t>Arms: ICF fixed, MuJoCo fixed, ICF EC (CENIC), MuJoCo EC</w:t>
+      </w:r>
+    </w:p>
+    <w:p>
+      <w:pPr>
+        <w:pStyle w:val="ListBullet"/>
+      </w:pPr>
+      <w:r>
+        <w:t>Varied, panel (a): fixed step δt in {10, 5, 2, 1, 0.5} ms; varied, panel (b): tolerance ε in {0.1 ... 0.00001} m; nothing else changes between runs</w:t>
+      </w:r>
+    </w:p>
+    <w:p>
+      <w:pPr>
+        <w:pStyle w:val="ListBullet"/>
+      </w:pPr>
+      <w:r>
+        <w:t>Measured: resting penetration divided by mg/k (1 = the model); a launched sphere is marked unstable</w:t>
+      </w:r>
+    </w:p>
+    <w:p>
+      <w:pPr>
+        <w:pStyle w:val="ListBullet"/>
+      </w:pPr>
+      <w:r>
+        <w:t>Built-in control: at δt &lt;= 1 ms both solvers read 1.00 within 2 percent, which is the definition of same physical system (equality by convergence, no parameter translation anywhere)</w:t>
       </w:r>
     </w:p>
     <w:p>
       <w:r>
-        <w:rPr>
-          <w:sz w:val="20"/>
-        </w:rPr>
-        <w:t>The setup is a single 65-gram sphere resting on a flat floor, with the contact stiffness fixed at k = 100,000 N/m for the whole experiment. The two solvers describe contact in different languages, so the figure shows the same physical system in both languages. ICF has a literal stiffness parameter: you hand it k in newtons per meter and the floor pushes back with k times the overlap depth. MuJoCo's usual contact input (a parameter called solref) is a time constant τ: remove any violation smoothly over about τ seconds. An effective stiffness emerges from τ, scaled by the mass of the touching bodies, and MuJoCo refuses to honor any τ smaller than twice the timestep, a documented safety rule called refsafe.</w:t>
-      </w:r>
-    </w:p>
-    <w:p>
-      <w:r>
-        <w:rPr>
-          <w:sz w:val="20"/>
-        </w:rPr>
-        <w:t>The yardstick comes from statics and belongs to neither solver. A resting sphere is held up by a contact force equal to its weight mg, so a spring-like contact of stiffness k must be overlapped by exactly mg/k at rest: 6.4 micrometers here. That number is the physics; no solver appears in its derivation. Equality between the solvers is then established by convergence, not by translating parameters: MuJoCo's one dial, its time constant, is set so that, at a timestep fine enough to be converged, the measured resting depth is mg/k. Concretely: hold the step at a fine 1 millisecond, sweep the dial, and keep the value at which the sphere sinks by exactly mg/k. That gave τ = 2.4 milliseconds for this scene. The figure re-runs this check every time: if the constant were wrong, the fine-step points would not sit at 1. The left edge of panel (a) is the receipt: at steps of 1 millisecond and finer, both solvers sit at ratio 1.00 within 2 percent. Two formulations, measurably the same physical system. Nothing else is translated, converted, or fitted anywhere in this experiment.</w:t>
-      </w:r>
-    </w:p>
-    <w:p>
-      <w:r>
-        <w:rPr>
-          <w:sz w:val="20"/>
-        </w:rPr>
-        <w:t>Between runs we change only the numerics. Panel (a): the fixed timestep δt takes the values 10, 5, 2, 1 and 0.5 milliseconds. Panel (b): the error-controlled arms are asked for tolerances ε from 0.1 down to 0.00001 meters. The sphere, the floor, the stiffness and the 3 seconds of settling are identical in every run. A companion run of the same grid at a soft stiffness, k = 1,000 N/m, sits in the same data file.</w:t>
-      </w:r>
-    </w:p>
-    <w:p>
-      <w:r>
-        <w:rPr>
-          <w:sz w:val="20"/>
-        </w:rPr>
-        <w:t>After the sphere settles we read its overlap depth from the geometry and divide by mg/k. A ratio of 1 means the solver delivered the agreed physics. Because a resting contact always carries exactly the weight, a ratio above 1 means the contact went softer than the system by that factor.</w:t>
-      </w:r>
-    </w:p>
-    <w:p>
-      <w:r>
-        <w:rPr>
-          <w:sz w:val="20"/>
-        </w:rPr>
-        <w:t>What happens, panel (a): ICF reads 1.00 at every step, 10 milliseconds included. MuJoCo is exactly right at 1 and 0.5 milliseconds (0.98) and departs precisely where its own safety rule says it must, at steps above τ/2 = 1.2 milliseconds (the calibrated τ here is 2.4 milliseconds): 2.7 times too soft at 2 ms, 17 times at 5 ms, 57 times at 10 ms. In the soft companion runs (k = 1,000 N/m) both solvers read 0.998 to 1.000 at every step including 10 ms: MuJoCo is exactly right whenever the step resolves its time constant. Panel (b): CENIC reads 1.00 at every tolerance. MuJoCo's error control stays 17 times too soft from ε = 0.1 through ε = 0.0001 and only approaches the physics (1.25) at ε = 0.00001, because a position-error test cannot see a softening that is self-consistent at the steps the controller settles into.</w:t>
-      </w:r>
-    </w:p>
-    <w:p>
-      <w:r>
-        <w:rPr>
-          <w:sz w:val="20"/>
-        </w:rPr>
-        <w:t>Why it matters: nothing here is a bug in MuJoCo; the solver faithfully executes its own documented rule. The finding is that the physics MuJoCo delivers depends on the step you chose, and that error control on positions does not buy the physics back. ICF's contact does not move with the step, which is the property the rest of the paper builds on. And because each curve is judged only against the model's own mg/k, with the agreement demonstrated inside the figure at fine steps, no cross-solver conversion is involved anywhere.</w:t>
-      </w:r>
-    </w:p>
-    <w:p>
-      <w:r>
-        <w:rPr>
-          <w:b/>
-          <w:sz w:val="18"/>
-        </w:rPr>
         <w:t>Code:</w:t>
       </w:r>
     </w:p>
@@ -183,9 +162,6 @@
         <w:pStyle w:val="ListBullet"/>
       </w:pPr>
       <w:r>
-        <w:rPr>
-          <w:sz w:val="16"/>
-        </w:rPr>
         <w:t>step and tolerance grids, https://github.com/mardigiorgio/icra2027/blob/48604cf33b/part1/bench/benchmarks/part1_stiffness_sweep.py#L40-L41</w:t>
       </w:r>
     </w:p>
@@ -194,9 +170,6 @@
         <w:pStyle w:val="ListBullet"/>
       </w:pPr>
       <w:r>
-        <w:rPr>
-          <w:sz w:val="16"/>
-        </w:rPr>
         <w:t>the calibrated MuJoCo solref anchor, self-verifying at fine steps, https://github.com/mardigiorgio/icra2027/blob/48604cf33b/part1/bench/benchmarks/part1_stiffness_sweep.py#L43-L47</w:t>
       </w:r>
     </w:p>
@@ -205,9 +178,6 @@
         <w:pStyle w:val="ListBullet"/>
       </w:pPr>
       <w:r>
-        <w:rPr>
-          <w:sz w:val="16"/>
-        </w:rPr>
         <w:t>MuJoCo solref calibration anchors, https://github.com/mardigiorgio/icra2027/blob/48604cf33b/part1/scenes/cenic_scenes.py#L66-L69</w:t>
       </w:r>
     </w:p>
@@ -216,9 +186,6 @@
         <w:pStyle w:val="ListBullet"/>
       </w:pPr>
       <w:r>
-        <w:rPr>
-          <w:sz w:val="16"/>
-        </w:rPr>
         <w:t>scene build, settle loop and depth readout, https://github.com/mardigiorgio/icra2027/blob/48604cf33b/part1/bench/benchmarks/part1_stiffness_sweep.py#L50-L79</w:t>
       </w:r>
     </w:p>
@@ -227,9 +194,6 @@
         <w:pStyle w:val="ListBullet"/>
       </w:pPr>
       <w:r>
-        <w:rPr>
-          <w:sz w:val="16"/>
-        </w:rPr>
         <w:t>the sweep cells (arms x steps x tolerances), https://github.com/mardigiorgio/icra2027/blob/48604cf33b/part1/bench/benchmarks/part1_stiffness_sweep.py#L92-L99</w:t>
       </w:r>
     </w:p>
@@ -238,9 +202,6 @@
         <w:pStyle w:val="ListBullet"/>
       </w:pPr>
       <w:r>
-        <w:rPr>
-          <w:sz w:val="16"/>
-        </w:rPr>
         <w:t>solref written onto every contact geom, https://github.com/mardigiorgio/icra2027/blob/48604cf33b/part1/bench/four_arms.py#L102-L112</w:t>
       </w:r>
     </w:p>
@@ -253,53 +214,11 @@
       </w:r>
     </w:p>
     <w:p>
-      <w:pPr>
-        <w:jc w:val="center"/>
-      </w:pPr>
-      <w:r>
-        <w:drawing>
-          <wp:inline xmlns:a="http://schemas.openxmlformats.org/drawingml/2006/main" xmlns:pic="http://schemas.openxmlformats.org/drawingml/2006/picture">
-            <wp:extent cx="4114800" cy="4183208"/>
-            <wp:docPr id="3" name="Picture 3"/>
-            <wp:cNvGraphicFramePr>
-              <a:graphicFrameLocks noChangeAspect="1"/>
-            </wp:cNvGraphicFramePr>
-            <a:graphic>
-              <a:graphicData uri="http://schemas.openxmlformats.org/drawingml/2006/picture">
-                <pic:pic>
-                  <pic:nvPicPr>
-                    <pic:cNvPr id="0" name="scenes.png"/>
-                    <pic:cNvPicPr/>
-                  </pic:nvPicPr>
-                  <pic:blipFill>
-                    <a:blip r:embed="rId11"/>
-                    <a:stretch>
-                      <a:fillRect/>
-                    </a:stretch>
-                  </pic:blipFill>
-                  <pic:spPr>
-                    <a:xfrm>
-                      <a:off x="0" y="0"/>
-                      <a:ext cx="4114800" cy="4183208"/>
-                    </a:xfrm>
-                    <a:prstGeom prst="rect"/>
-                  </pic:spPr>
-                </pic:pic>
-              </a:graphicData>
-            </a:graphic>
-          </wp:inline>
-        </w:drawing>
-      </w:r>
-    </w:p>
-    <w:p>
-      <w:pPr>
-        <w:jc w:val="center"/>
-      </w:pPr>
       <w:r>
         <w:drawing>
           <wp:inline xmlns:a="http://schemas.openxmlformats.org/drawingml/2006/main" xmlns:pic="http://schemas.openxmlformats.org/drawingml/2006/picture">
             <wp:extent cx="5669280" cy="4584250"/>
-            <wp:docPr id="4" name="Picture 4"/>
+            <wp:docPr id="2" name="Picture 2"/>
             <wp:cNvGraphicFramePr>
               <a:graphicFrameLocks noChangeAspect="1"/>
             </wp:cNvGraphicFramePr>
@@ -311,7 +230,7 @@
                     <pic:cNvPicPr/>
                   </pic:nvPicPr>
                   <pic:blipFill>
-                    <a:blip r:embed="rId12"/>
+                    <a:blip r:embed="rId10"/>
                     <a:stretch>
                       <a:fillRect/>
                     </a:stretch>
@@ -332,59 +251,51 @@
     </w:p>
     <w:p>
       <w:r>
-        <w:rPr>
-          <w:b/>
-          <w:sz w:val="20"/>
-        </w:rPr>
-        <w:t>Twenty objects dropped into a bin; we sweep the requested accuracy and measure what each error-controlled solver charges for it.</w:t>
+        <w:t>Design:</w:t>
+      </w:r>
+    </w:p>
+    <w:p>
+      <w:pPr>
+        <w:pStyle w:val="ListBullet"/>
+      </w:pPr>
+      <w:r>
+        <w:t>Scenes: soft clutter (20 spheres, k = 1,000 N/m) and hard clutter (10 spheres + 10 cubes, k = 100,000 N/m), dropped into a 30 cm bin from a seeded, jittered lattice; 2 s horizon</w:t>
+      </w:r>
+    </w:p>
+    <w:p>
+      <w:pPr>
+        <w:pStyle w:val="ListBullet"/>
+      </w:pPr>
+      <w:r>
+        <w:t>Arms: ICF EC and MuJoCo EC (curves); ICF fixed and MuJoCo fixed at 10 ms and 1 ms (dotted reference levels)</w:t>
+      </w:r>
+    </w:p>
+    <w:p>
+      <w:pPr>
+        <w:pStyle w:val="ListBullet"/>
+      </w:pPr>
+      <w:r>
+        <w:t>Varied: requested tolerance ε in {0.1 ... 0.000001} m; number of parallel worlds N in {1, 1024}; N = 1 rows are 3-trial medians</w:t>
+      </w:r>
+    </w:p>
+    <w:p>
+      <w:pPr>
+        <w:pStyle w:val="ListBullet"/>
+      </w:pPr>
+      <w:r>
+        <w:t>Measured: wall-clock seconds per simulated second; timeout at 100 s per world-second and march-budget exhaustion are marked as crosses</w:t>
+      </w:r>
+    </w:p>
+    <w:p>
+      <w:pPr>
+        <w:pStyle w:val="ListBullet"/>
+      </w:pPr>
+      <w:r>
+        <w:t>Held: scene geometry, masses, friction, δt_max = 0.1 s, march budget</w:t>
       </w:r>
     </w:p>
     <w:p>
       <w:r>
-        <w:rPr>
-          <w:sz w:val="20"/>
-        </w:rPr>
-        <w:t>The setup is the two clutter drops from the CENIC paper: twenty spheres falling into a box-shaped bin with soft contact (k = 1,000 N/m), and a mix of spheres and cubes with hard contact (k = 100,000 N/m). Each run simulates 2 seconds: the fall, the impacts, and the settling into a pile.</w:t>
-      </w:r>
-    </w:p>
-    <w:p>
-      <w:r>
-        <w:rPr>
-          <w:sz w:val="20"/>
-        </w:rPr>
-        <w:t>Between runs we change two things: the accuracy the error controller is asked for (ε from 0.1 down to 0.000001: smaller means stricter), and how many copies of the scene run in parallel on the GPU (1 or 1024; reinforcement learning uses the large number). The scenes and every physical parameter stay fixed.</w:t>
-      </w:r>
-    </w:p>
-    <w:p>
-      <w:r>
-        <w:rPr>
-          <w:sz w:val="20"/>
-        </w:rPr>
-        <w:t>We measure wall-clock seconds per simulated second: how long the computer works to produce one second of physics. Lower is cheaper. The dotted horizontal lines show what a plain fixed step costs at 10 ms and 1 ms, for reference.</w:t>
-      </w:r>
-    </w:p>
-    <w:p>
-      <w:r>
-        <w:rPr>
-          <w:sz w:val="20"/>
-        </w:rPr>
-        <w:t>What happens: MuJoCo's error control is cheaper than CENIC at every accuracy, 1.1 to 3.3 times at a single scene (nearly equal at middle tolerances), and 8 to 22 times at 1024 parallel scenes. The reason is the price of one attempt: each error-controlled attempt requires three full physics solves (the trial step plus the two half-steps that estimate its error) and two collision checks, and one ICF attempt costs 2.7 to 6.9 milliseconds against MuJoCo's 1.6 to 2.1, while both take similar numbers of attempts. At large batches the gap compounds, because at every attempt the entire batch waits for its slowest world.</w:t>
-      </w:r>
-    </w:p>
-    <w:p>
-      <w:r>
-        <w:rPr>
-          <w:sz w:val="20"/>
-        </w:rPr>
-        <w:t>Why it matters: this is the honest cost picture in the clutter regime, and it favors the MuJoCo backend. CENIC's speed case is not here. It is in Experiment 4, where the stiffness sits in the controller's virtual spring instead of the contact pile, and the ranking reverses.</w:t>
-      </w:r>
-    </w:p>
-    <w:p>
-      <w:r>
-        <w:rPr>
-          <w:b/>
-          <w:sz w:val="18"/>
-        </w:rPr>
         <w:t>Code:</w:t>
       </w:r>
     </w:p>
@@ -393,9 +304,6 @@
         <w:pStyle w:val="ListBullet"/>
       </w:pPr>
       <w:r>
-        <w:rPr>
-          <w:sz w:val="16"/>
-        </w:rPr>
         <w:t>timeout semantics (per world-second), https://github.com/mardigiorgio/icra2027/blob/c0279e47d8fe/part1/bench/benchmarks/part1_workprecision.py#L8-L16</w:t>
       </w:r>
     </w:p>
@@ -404,9 +312,6 @@
         <w:pStyle w:val="ListBullet"/>
       </w:pPr>
       <w:r>
-        <w:rPr>
-          <w:sz w:val="16"/>
-        </w:rPr>
         <w:t>accuracy ladder + march budget, https://github.com/mardigiorgio/icra2027/blob/c0279e47d8fe/part1/bench/benchmarks/part1_workprecision.py#L18-L21</w:t>
       </w:r>
     </w:p>
@@ -415,9 +320,6 @@
         <w:pStyle w:val="ListBullet"/>
       </w:pPr>
       <w:r>
-        <w:rPr>
-          <w:sz w:val="16"/>
-        </w:rPr>
         <w:t>first attempt k_Init·δt_max, https://github.com/mardigiorgio/icra2027/blob/c0279e47d8fe/part1/bench/four_arms.py#L47</w:t>
       </w:r>
     </w:p>
@@ -426,9 +328,6 @@
         <w:pStyle w:val="ListBullet"/>
       </w:pPr>
       <w:r>
-        <w:rPr>
-          <w:sz w:val="16"/>
-        </w:rPr>
         <w:t>inner tolerance rule (CENIC eq. 34), https://github.com/mardigiorgio/icra2027/blob/c0279e47d8fe/part1/bench/four_arms.py#L48</w:t>
       </w:r>
     </w:p>
@@ -437,10 +336,7 @@
         <w:pStyle w:val="ListBullet"/>
       </w:pPr>
       <w:r>
-        <w:rPr>
-          <w:sz w:val="16"/>
-        </w:rPr>
-        <w:t>contact budgets (≥ 2× measured demand), https://github.com/mardigiorgio/icra2027/blob/c0279e47d8fe/part1/bench/four_arms.py#L62-L64</w:t>
+        <w:t>contact budgets (&gt;= 2x measured demand), https://github.com/mardigiorgio/icra2027/blob/c0279e47d8fe/part1/bench/four_arms.py#L62-L64</w:t>
       </w:r>
     </w:p>
     <w:p>
@@ -452,53 +348,11 @@
       </w:r>
     </w:p>
     <w:p>
-      <w:pPr>
-        <w:jc w:val="center"/>
-      </w:pPr>
-      <w:r>
-        <w:drawing>
-          <wp:inline xmlns:a="http://schemas.openxmlformats.org/drawingml/2006/main" xmlns:pic="http://schemas.openxmlformats.org/drawingml/2006/picture">
-            <wp:extent cx="4114800" cy="2120364"/>
-            <wp:docPr id="5" name="Picture 5"/>
-            <wp:cNvGraphicFramePr>
-              <a:graphicFrameLocks noChangeAspect="1"/>
-            </wp:cNvGraphicFramePr>
-            <a:graphic>
-              <a:graphicData uri="http://schemas.openxmlformats.org/drawingml/2006/picture">
-                <pic:pic>
-                  <pic:nvPicPr>
-                    <pic:cNvPr id="0" name="scenes.png"/>
-                    <pic:cNvPicPr/>
-                  </pic:nvPicPr>
-                  <pic:blipFill>
-                    <a:blip r:embed="rId11"/>
-                    <a:stretch>
-                      <a:fillRect/>
-                    </a:stretch>
-                  </pic:blipFill>
-                  <pic:spPr>
-                    <a:xfrm>
-                      <a:off x="0" y="0"/>
-                      <a:ext cx="4114800" cy="2120364"/>
-                    </a:xfrm>
-                    <a:prstGeom prst="rect"/>
-                  </pic:spPr>
-                </pic:pic>
-              </a:graphicData>
-            </a:graphic>
-          </wp:inline>
-        </w:drawing>
-      </w:r>
-    </w:p>
-    <w:p>
-      <w:pPr>
-        <w:jc w:val="center"/>
-      </w:pPr>
       <w:r>
         <w:drawing>
           <wp:inline xmlns:a="http://schemas.openxmlformats.org/drawingml/2006/main" xmlns:pic="http://schemas.openxmlformats.org/drawingml/2006/picture">
             <wp:extent cx="5669280" cy="4127317"/>
-            <wp:docPr id="6" name="Picture 6"/>
+            <wp:docPr id="3" name="Picture 3"/>
             <wp:cNvGraphicFramePr>
               <a:graphicFrameLocks noChangeAspect="1"/>
             </wp:cNvGraphicFramePr>
@@ -510,7 +364,7 @@
                     <pic:cNvPicPr/>
                   </pic:nvPicPr>
                   <pic:blipFill>
-                    <a:blip r:embed="rId13"/>
+                    <a:blip r:embed="rId11"/>
                     <a:stretch>
                       <a:fillRect/>
                     </a:stretch>
@@ -531,51 +385,51 @@
     </w:p>
     <w:p>
       <w:r>
-        <w:rPr>
-          <w:b/>
-          <w:sz w:val="20"/>
-        </w:rPr>
-        <w:t>The same hard-clutter scene copied across more and more GPU worlds; we measure what each additional world costs.</w:t>
+        <w:t>Design:</w:t>
+      </w:r>
+    </w:p>
+    <w:p>
+      <w:pPr>
+        <w:pStyle w:val="ListBullet"/>
+      </w:pPr>
+      <w:r>
+        <w:t>Scene: hard clutter (as in Experiment 2)</w:t>
+      </w:r>
+    </w:p>
+    <w:p>
+      <w:pPr>
+        <w:pStyle w:val="ListBullet"/>
+      </w:pPr>
+      <w:r>
+        <w:t>Arms: all four; fixed arms at δt = 10 ms, EC arms at ε = 0.001</w:t>
+      </w:r>
+    </w:p>
+    <w:p>
+      <w:pPr>
+        <w:pStyle w:val="ListBullet"/>
+      </w:pPr>
+      <w:r>
+        <w:t>Varied: number of parallel worlds N = 2^6 ... 2^13; nothing else</w:t>
+      </w:r>
+    </w:p>
+    <w:p>
+      <w:pPr>
+        <w:pStyle w:val="ListBullet"/>
+      </w:pPr>
+      <w:r>
+        <w:t>Measured: wall time per 100 ms control boundary, median of 3 independent trials (spread drawn as a band); per-world cost = wall / N</w:t>
+      </w:r>
+    </w:p>
+    <w:p>
+      <w:pPr>
+        <w:pStyle w:val="ListBullet"/>
+      </w:pPr>
+      <w:r>
+        <w:t>Held: scene, tolerance, timed window (2 s after 0.2 s warm-up)</w:t>
       </w:r>
     </w:p>
     <w:p>
       <w:r>
-        <w:rPr>
-          <w:sz w:val="20"/>
-        </w:rPr>
-        <w:t>The setup is the hard-clutter scene again, but the variable is now scale: the same scene is copied 64, 128, 256, and so on up to 8,192 times, all advancing in parallel on one GPU, which is how reinforcement learning actually consumes a simulator. Each solver runs at one representative setting: fixed step 10 ms, error control at ε = 0.001.</w:t>
-      </w:r>
-    </w:p>
-    <w:p>
-      <w:r>
-        <w:rPr>
-          <w:sz w:val="20"/>
-        </w:rPr>
-        <w:t>We measure how long it takes to advance every copy through one 100-millisecond slice of simulated time, take the median over a 2-second window, and repeat the whole run three times; the shaded band is the spread between repeats.</w:t>
-      </w:r>
-    </w:p>
-    <w:p>
-      <w:r>
-        <w:rPr>
-          <w:sz w:val="20"/>
-        </w:rPr>
-        <w:t>What happens: at small counts, adding copies is nearly free, the GPU has idle capacity, so the cost per copy falls. Then each solver saturates the GPU and total cost starts doubling when the copies double. The ICF arms saturate earliest, from about 1,024 copies. At 8,192, the cost per copy per 100 ms slice is: MuJoCo fixed 11 microseconds, MuJoCo error control 279 microseconds, ICF fixed 484 microseconds, CENIC 1.35 milliseconds.</w:t>
-      </w:r>
-    </w:p>
-    <w:p>
-      <w:r>
-        <w:rPr>
-          <w:sz w:val="20"/>
-        </w:rPr>
-        <w:t>Why it matters: Part 2 trains at 2,048 copies, which lives on this curve, every wall-time claim about training inherits these numbers. We also checked the obvious suspect, the tolerance of ICF's internal equation solver: loosening it moves these numbers by at most about 5 percent at scale. The cost is what it takes to resolve stiff contact with a convex solve, paid at the pace of the batch's slowest world.</w:t>
-      </w:r>
-    </w:p>
-    <w:p>
-      <w:r>
-        <w:rPr>
-          <w:b/>
-          <w:sz w:val="18"/>
-        </w:rPr>
         <w:t>Code:</w:t>
       </w:r>
     </w:p>
@@ -584,9 +438,6 @@
         <w:pStyle w:val="ListBullet"/>
       </w:pPr>
       <w:r>
-        <w:rPr>
-          <w:sz w:val="16"/>
-        </w:rPr>
         <w:t>runner (per-N subprocess), https://github.com/mardigiorgio/icra2027/blob/c0279e47d8fe/part1/bench/benchmarks/part1_scaling.py#L36</w:t>
       </w:r>
     </w:p>
@@ -595,9 +446,6 @@
         <w:pStyle w:val="ListBullet"/>
       </w:pPr>
       <w:r>
-        <w:rPr>
-          <w:sz w:val="16"/>
-        </w:rPr>
         <w:t>warm-up handling, https://github.com/mardigiorgio/icra2027/blob/c0279e47d8fe/part1/bench/benchmarks/part1_scaling.py#L44-L47</w:t>
       </w:r>
     </w:p>
@@ -606,9 +454,6 @@
         <w:pStyle w:val="ListBullet"/>
       </w:pPr>
       <w:r>
-        <w:rPr>
-          <w:sz w:val="16"/>
-        </w:rPr>
         <w:t>median statistic, https://github.com/mardigiorgio/icra2027/blob/c0279e47d8fe/part1/bench/benchmarks/part1_scaling.py#L72</w:t>
       </w:r>
     </w:p>
@@ -617,9 +462,6 @@
         <w:pStyle w:val="ListBullet"/>
       </w:pPr>
       <w:r>
-        <w:rPr>
-          <w:sz w:val="16"/>
-        </w:rPr>
         <w:t>defaults: 2 s timed, 0.2 s warm-up, 3 trials, https://github.com/mardigiorgio/icra2027/blob/c0279e47d8fe/part1/bench/benchmarks/part1_scaling.py#L82-L89</w:t>
       </w:r>
     </w:p>
@@ -628,189 +470,72 @@
         <w:pStyle w:val="Heading2"/>
       </w:pPr>
       <w:r>
-        <w:t>Experiment 4, The actuated stiff-contact case (PD push)</w:t>
+        <w:t>Experiment 4, CENIC reference implementation (Drake, CPU) vs this work (Newton/Warp, GPU): cost per world vs number of worlds</w:t>
+      </w:r>
+    </w:p>
+    <w:p>
+      <w:r>
+        <w:t>Design (replaces the actuated PD push, PI 2026-09-01; run pending):</w:t>
       </w:r>
     </w:p>
     <w:p>
       <w:pPr>
-        <w:jc w:val="center"/>
+        <w:pStyle w:val="ListBullet"/>
       </w:pPr>
       <w:r>
-        <w:drawing>
-          <wp:inline xmlns:a="http://schemas.openxmlformats.org/drawingml/2006/main" xmlns:pic="http://schemas.openxmlformats.org/drawingml/2006/picture">
-            <wp:extent cx="3657600" cy="3657600"/>
-            <wp:docPr id="7" name="Picture 7"/>
-            <wp:cNvGraphicFramePr>
-              <a:graphicFrameLocks noChangeAspect="1"/>
-            </wp:cNvGraphicFramePr>
-            <a:graphic>
-              <a:graphicData uri="http://schemas.openxmlformats.org/drawingml/2006/picture">
-                <pic:pic>
-                  <pic:nvPicPr>
-                    <pic:cNvPr id="0" name="scene_actuated.png"/>
-                    <pic:cNvPicPr/>
-                  </pic:nvPicPr>
-                  <pic:blipFill>
-                    <a:blip r:embed="rId14"/>
-                    <a:stretch>
-                      <a:fillRect/>
-                    </a:stretch>
-                  </pic:blipFill>
-                  <pic:spPr>
-                    <a:xfrm>
-                      <a:off x="0" y="0"/>
-                      <a:ext cx="3657600" cy="3657600"/>
-                    </a:xfrm>
-                    <a:prstGeom prst="rect"/>
-                  </pic:spPr>
-                </pic:pic>
-              </a:graphicData>
-            </a:graphic>
-          </wp:inline>
-        </w:drawing>
+        <w:t>Question: what does one world of error-controlled CENIC stepping cost as the world count grows, in the reference CPU implementation vs the GPU implementation this paper contributes</w:t>
       </w:r>
     </w:p>
     <w:p>
       <w:pPr>
-        <w:jc w:val="center"/>
+        <w:pStyle w:val="ListBullet"/>
       </w:pPr>
       <w:r>
-        <w:drawing>
-          <wp:inline xmlns:a="http://schemas.openxmlformats.org/drawingml/2006/main" xmlns:pic="http://schemas.openxmlformats.org/drawingml/2006/picture">
-            <wp:extent cx="5669280" cy="1492127"/>
-            <wp:docPr id="8" name="Picture 8"/>
-            <wp:cNvGraphicFramePr>
-              <a:graphicFrameLocks noChangeAspect="1"/>
-            </wp:cNvGraphicFramePr>
-            <a:graphic>
-              <a:graphicData uri="http://schemas.openxmlformats.org/drawingml/2006/picture">
-                <pic:pic>
-                  <pic:nvPicPr>
-                    <pic:cNvPr id="0" name="actuated.png"/>
-                    <pic:cNvPicPr/>
-                  </pic:nvPicPr>
-                  <pic:blipFill>
-                    <a:blip r:embed="rId15"/>
-                    <a:stretch>
-                      <a:fillRect/>
-                    </a:stretch>
-                  </pic:blipFill>
-                  <pic:spPr>
-                    <a:xfrm>
-                      <a:off x="0" y="0"/>
-                      <a:ext cx="5669280" cy="1492127"/>
-                    </a:xfrm>
-                    <a:prstGeom prst="rect"/>
-                  </pic:spPr>
-                </pic:pic>
-              </a:graphicData>
-            </a:graphic>
-          </wp:inline>
-        </w:drawing>
+        <w:t>Arms: Drake CENIC (CPU, the reference implementation) and Newton/Warp CENIC (GPU, ours); identical scene, tolerance, horizon and outer boundary in both</w:t>
       </w:r>
     </w:p>
     <w:p>
       <w:pPr>
-        <w:jc w:val="center"/>
+        <w:pStyle w:val="ListBullet"/>
       </w:pPr>
       <w:r>
-        <w:drawing>
-          <wp:inline xmlns:a="http://schemas.openxmlformats.org/drawingml/2006/main" xmlns:pic="http://schemas.openxmlformats.org/drawingml/2006/picture">
-            <wp:extent cx="5669280" cy="2310628"/>
-            <wp:docPr id="9" name="Picture 9"/>
-            <wp:cNvGraphicFramePr>
-              <a:graphicFrameLocks noChangeAspect="1"/>
-            </wp:cNvGraphicFramePr>
-            <a:graphic>
-              <a:graphicData uri="http://schemas.openxmlformats.org/drawingml/2006/picture">
-                <pic:pic>
-                  <pic:nvPicPr>
-                    <pic:cNvPr id="0" name="actuated_scaling.png"/>
-                    <pic:cNvPicPr/>
-                  </pic:nvPicPr>
-                  <pic:blipFill>
-                    <a:blip r:embed="rId16"/>
-                    <a:stretch>
-                      <a:fillRect/>
-                    </a:stretch>
-                  </pic:blipFill>
-                  <pic:spPr>
-                    <a:xfrm>
-                      <a:off x="0" y="0"/>
-                      <a:ext cx="5669280" cy="2310628"/>
-                    </a:xfrm>
-                    <a:prstGeom prst="rect"/>
-                  </pic:spPr>
-                </pic:pic>
-              </a:graphicData>
-            </a:graphic>
-          </wp:inline>
-        </w:drawing>
+        <w:t>Scene: one CENIC clutter scene reproduced in both stacks (exact scene and parameters to be fixed with the PI; the calibration protocol of Experiment 1 applies to any compliance constants)</w:t>
+      </w:r>
+    </w:p>
+    <w:p>
+      <w:pPr>
+        <w:pStyle w:val="ListBullet"/>
+      </w:pPr>
+      <w:r>
+        <w:t>Varied: number of worlds N (GPU: 1 ... 2^13 batched; CPU: N independent world instances up to the core count, cost accounted as total CPU time / N)</w:t>
+      </w:r>
+    </w:p>
+    <w:p>
+      <w:pPr>
+        <w:pStyle w:val="ListBullet"/>
+      </w:pPr>
+      <w:r>
+        <w:t>Measured: wall-clock time per simulated second per world; requested tolerance ε = 0.001 in both</w:t>
+      </w:r>
+    </w:p>
+    <w:p>
+      <w:pPr>
+        <w:pStyle w:val="ListBullet"/>
+      </w:pPr>
+      <w:r>
+        <w:t>Held: tolerance, scene, horizon, δt_max, error norm</w:t>
+      </w:r>
+    </w:p>
+    <w:p>
+      <w:pPr>
+        <w:pStyle w:val="ListBullet"/>
+      </w:pPr>
+      <w:r>
+        <w:t>Status: pending the Drake CENIC harness; the GPU side reuses the Experiment 3 runner</w:t>
       </w:r>
     </w:p>
     <w:p>
       <w:r>
-        <w:rPr>
-          <w:b/>
-          <w:sz w:val="20"/>
-        </w:rPr>
-        <w:t>A position-controlled fingertip pushes a box across the table, commanded the way a trained policy commands a robot; we sweep the controller stiffness and watch what each solver does to the physics.</w:t>
-      </w:r>
-    </w:p>
-    <w:p>
-      <w:r>
-        <w:rPr>
-          <w:sz w:val="20"/>
-        </w:rPr>
-        <w:t>The setup is the smallest scene that has the ingredients of robot learning. A small round fingertip (100 grams, 1 centimeter radius) hangs in the air beside a 1-kilogram box, 10 centimeters on a side, resting on the table. Nothing holds the fingertip in place except the pull of the controller described next. The task is to push the box 30 centimeters across the table at 300 mm/s, with hard contact (k = 100,000 N/m) and ordinary friction.</w:t>
-      </w:r>
-    </w:p>
-    <w:p>
-      <w:r>
-        <w:rPr>
-          <w:sz w:val="20"/>
-        </w:rPr>
-        <w:t>The fingertip is moved by a PD controller, the standard control law of nearly every robot, and in this scene it works like this. There is an invisible commanded point (the hollow circle in the render). The controller pulls the fingertip toward that point with a force proportional to the distance between them; that is the P term, and its gain K_p is literally the stiffness of a virtual spring stretched between the fingertip and the commanded point. A second term (the D) brakes proportionally to velocity so the pull does not oscillate forever. The commanded point moves along a fixed path: it descends to the box's mid-height, then travels sideways in a straight line, and the spring drags the fingertip after it, pressing it into the side of the box and sliding the box along. A trained policy commands a real robot exactly this way: the policy outputs where to go, and a PD does the pulling. Here the commanded point updates 100 times per second and is HELD in between, just as a policy's action would be. Every update suddenly re-stretches the virtual spring by 3 millimeters, and at K_p = 100,000 N/m a 3 mm stretch is a kick of several hundred newtons landing on a 100-gram fingertip. That kick, repeated 100 times a second, is what makes this scene stiff even though the contact itself is ordinary.</w:t>
-      </w:r>
-    </w:p>
-    <w:p>
-      <w:r>
-        <w:rPr>
-          <w:sz w:val="20"/>
-        </w:rPr>
-        <w:t>Between runs we change the controller stiffness K_p (from 100 to 1,000,000 N/m, a soft compliant arm up to a rigid industrial one), the solver setting (four fixed steps, four tolerances), and, for the second figure, the number of parallel copies. The scene geometry, masses, friction, and the commanded point's path never change.</w:t>
-      </w:r>
-    </w:p>
-    <w:p>
-      <w:r>
-        <w:rPr>
-          <w:sz w:val="20"/>
-        </w:rPr>
-        <w:t>We measure five things per run: whether the simulation blows up (velocities beyond 10 m/s, or numbers that stop being finite), how high the box lifts off the table during what should be a flat horizontal push, how fast the box rocks, how deep the fingertip presses into the box face, and the rattling between fingertip and box while cruising, plus wall time.</w:t>
-      </w:r>
-    </w:p>
-    <w:p>
-      <w:r>
-        <w:rPr>
-          <w:sz w:val="20"/>
-        </w:rPr>
-        <w:t>What happens: MuJoCo integrates the controller's virtual spring explicitly. It applies the spring force from the start of the step for the whole step, so there is a hard stability boundary, roughly when the spring's natural frequency times the timestep exceeds 2. Six of MuJoCo's forty cells blow up outright, and in every surviving cell the box visibly hops millimeters off the table during the push; error control does not remove the hop. ICF folds the same controller into its implicit solve, the spring force is computed at the end of the step, consistently with where things actually end up, so all forty of its cells are stable and the box never leaves its resting depth: 25 micrometers, which is the weight mg spread over the box's four contact corners, mg/(4k), the same force balance as Experiment 1. One more effect matters directly for training: at a 10-millisecond step, the fingertip–box rattling that the held targets excite disappears from the simulation entirely. A policy trained at that step never feels the vibration its own commands create. (In the box-lift panel, both ICF curves sit on the plot floor. One visible line is two configurations, both reading zero lift.)</w:t>
-      </w:r>
-    </w:p>
-    <w:p>
-      <w:r>
-        <w:rPr>
-          <w:sz w:val="20"/>
-        </w:rPr>
-        <w:t>Why it matters, and the speed reversal: in this regime the stiffness lives in the controller's virtual spring, not in a pile of objects. Because CENIC handles that stiffness implicitly, it crosses each 10 ms control boundary in a single step, while MuJoCo's explicitly-integrated spring forces its error controller to 5-9 sub-steps and its fixed arm down to 1 ms just to stay stable. The second figure shows the consequence at scale: CENIC is the fastest of all four configurations at every batch size. This is the regime Part 2 trains in, and it is where the paper's speed claim lives.</w:t>
-      </w:r>
-    </w:p>
-    <w:p>
-      <w:r>
-        <w:rPr>
-          <w:b/>
-          <w:sz w:val="18"/>
-        </w:rPr>
         <w:t>Code:</w:t>
       </w:r>
     </w:p>
@@ -819,10 +544,7 @@
         <w:pStyle w:val="ListBullet"/>
       </w:pPr>
       <w:r>
-        <w:rPr>
-          <w:sz w:val="16"/>
-        </w:rPr>
-        <w:t>scene geometry and start pose, https://github.com/mardigiorgio/icra2027/blob/c0279e47d8fe/part1/scenes/actuated_press.py#L32-L42</w:t>
+        <w:t>GPU-side runner (reused), https://github.com/mardigiorgio/icra2027/blob/c0279e47d8fe/part1/bench/benchmarks/part1_scaling.py#L36</w:t>
       </w:r>
     </w:p>
     <w:p>
@@ -830,43 +552,7 @@
         <w:pStyle w:val="ListBullet"/>
       </w:pPr>
       <w:r>
-        <w:rPr>
-          <w:sz w:val="16"/>
-        </w:rPr>
-        <w:t>scene build (densities, bodies), https://github.com/mardigiorgio/icra2027/blob/c0279e47d8fe/part1/scenes/actuated_press.py#L68-L80</w:t>
-      </w:r>
-    </w:p>
-    <w:p>
-      <w:pPr>
-        <w:pStyle w:val="ListBullet"/>
-      </w:pPr>
-      <w:r>
-        <w:rPr>
-          <w:sz w:val="16"/>
-        </w:rPr>
-        <w:t>grid: fixed steps × tolerances, https://github.com/mardigiorgio/icra2027/blob/c0279e47d8fe/part1/bench/benchmarks/part1_actuated.py#L73</w:t>
-      </w:r>
-    </w:p>
-    <w:p>
-      <w:pPr>
-        <w:pStyle w:val="ListBullet"/>
-      </w:pPr>
-      <w:r>
-        <w:rPr>
-          <w:sz w:val="16"/>
-        </w:rPr>
-        <w:t>metrics (lift, pitch, penetration, chatter), https://github.com/mardigiorgio/icra2027/blob/c0279e47d8fe/part1/bench/benchmarks/part1_actuated.py#L108-L159</w:t>
-      </w:r>
-    </w:p>
-    <w:p>
-      <w:pPr>
-        <w:pStyle w:val="ListBullet"/>
-      </w:pPr>
-      <w:r>
-        <w:rPr>
-          <w:sz w:val="16"/>
-        </w:rPr>
-        <w:t>sweep driver (gains × arms × knobs), https://github.com/mardigiorgio/icra2027/blob/c0279e47d8fe/part1/bench/benchmarks/part1_actuated.py#L191</w:t>
+        <w:t>Drake CENIC harness: not yet written; citation lands here when it exists</w:t>
       </w:r>
     </w:p>
     <w:sectPr>

</xml_diff>

<commit_message>
P1 doc: Exp 4 design + measured Drake-vs-GPU scaling figure
</commit_message>
<xml_diff>
--- a/part1/bench/results/P1_core_experiments.docx
+++ b/part1/bench/results/P1_core_experiments.docx
@@ -475,7 +475,43 @@
     </w:p>
     <w:p>
       <w:r>
-        <w:t>Design (replaces the actuated PD push, PI 2026-09-01; run pending):</w:t>
+        <w:drawing>
+          <wp:inline xmlns:a="http://schemas.openxmlformats.org/drawingml/2006/main" xmlns:pic="http://schemas.openxmlformats.org/drawingml/2006/picture">
+            <wp:extent cx="5669280" cy="3982879"/>
+            <wp:docPr id="4" name="Picture 4"/>
+            <wp:cNvGraphicFramePr>
+              <a:graphicFrameLocks noChangeAspect="1"/>
+            </wp:cNvGraphicFramePr>
+            <a:graphic>
+              <a:graphicData uri="http://schemas.openxmlformats.org/drawingml/2006/picture">
+                <pic:pic>
+                  <pic:nvPicPr>
+                    <pic:cNvPr id="0" name="cenic_scaling.png"/>
+                    <pic:cNvPicPr/>
+                  </pic:nvPicPr>
+                  <pic:blipFill>
+                    <a:blip r:embed="rId12"/>
+                    <a:stretch>
+                      <a:fillRect/>
+                    </a:stretch>
+                  </pic:blipFill>
+                  <pic:spPr>
+                    <a:xfrm>
+                      <a:off x="0" y="0"/>
+                      <a:ext cx="5669280" cy="3982879"/>
+                    </a:xfrm>
+                    <a:prstGeom prst="rect"/>
+                  </pic:spPr>
+                </pic:pic>
+              </a:graphicData>
+            </a:graphic>
+          </wp:inline>
+        </w:drawing>
+      </w:r>
+    </w:p>
+    <w:p>
+      <w:r>
+        <w:t>Design (replaces the actuated PD push, PI 2026-09-01):</w:t>
       </w:r>
     </w:p>
     <w:p>
@@ -483,7 +519,7 @@
         <w:pStyle w:val="ListBullet"/>
       </w:pPr>
       <w:r>
-        <w:t>Question: what does one world of error-controlled CENIC stepping cost as the world count grows, in the reference CPU implementation vs the GPU implementation this paper contributes</w:t>
+        <w:t>Question: what one world of error-controlled CENIC stepping costs as the world count grows, reference CPU implementation vs the GPU implementation this paper contributes</w:t>
       </w:r>
     </w:p>
     <w:p>
@@ -491,7 +527,7 @@
         <w:pStyle w:val="ListBullet"/>
       </w:pPr>
       <w:r>
-        <w:t>Arms: Drake CENIC (CPU, the reference implementation) and Newton/Warp CENIC (GPU, ours); identical scene, tolerance, horizon and outer boundary in both</w:t>
+        <w:t>CPU arm: Drake 1.56, integration_scheme = cenic (the reference implementation, shipped in Drake); each world is an independent process at nice +10; per-world cost is each process's own wall clock</w:t>
       </w:r>
     </w:p>
     <w:p>
@@ -499,7 +535,7 @@
         <w:pStyle w:val="ListBullet"/>
       </w:pPr>
       <w:r>
-        <w:t>Scene: one CENIC clutter scene reproduced in both stacks (exact scene and parameters to be fixed with the PI; the calibration protocol of Experiment 1 applies to any compliance constants)</w:t>
+        <w:t>GPU arm: Newton/Warp CENIC (ICF EC), batched worlds; reuses the Experiment 3 scaling data</w:t>
       </w:r>
     </w:p>
     <w:p>
@@ -507,7 +543,7 @@
         <w:pStyle w:val="ListBullet"/>
       </w:pPr>
       <w:r>
-        <w:t>Varied: number of worlds N (GPU: 1 ... 2^13 batched; CPU: N independent world instances up to the core count, cost accounted as total CPU time / N)</w:t>
+        <w:t>Scene: hard clutter, ported 1:1 (constants copied from cenic_scenes.py, initial-pose lattice RNG replayed call-for-call with the same seed, so both stacks integrate the same initial condition)</w:t>
       </w:r>
     </w:p>
     <w:p>
@@ -515,7 +551,7 @@
         <w:pStyle w:val="ListBullet"/>
       </w:pPr>
       <w:r>
-        <w:t>Measured: wall-clock time per simulated second per world; requested tolerance ε = 0.001 in both</w:t>
+        <w:t>Varied: number of concurrent worlds; CPU 1 ... 96 processes (128-core host, capped below the core count), GPU 2^6 ... 2^13 batched</w:t>
       </w:r>
     </w:p>
     <w:p>
@@ -523,7 +559,7 @@
         <w:pStyle w:val="ListBullet"/>
       </w:pPr>
       <w:r>
-        <w:t>Held: tolerance, scene, horizon, δt_max, error norm</w:t>
+        <w:t>Measured: wall-clock seconds per simulated second per world (median across worlds; min-max band on the CPU)</w:t>
       </w:r>
     </w:p>
     <w:p>
@@ -531,7 +567,15 @@
         <w:pStyle w:val="ListBullet"/>
       </w:pPr>
       <w:r>
-        <w:t>Status: pending the Drake CENIC harness; the GPU side reuses the Experiment 3 runner</w:t>
+        <w:t>Held in both stacks: tolerance eps = 0.001, max step 0.1 s, 0.2 s warm-up then 2 s timed, contact constants (k = 100,000 N/m, Hunt-Crossley 1.0 s/m, friction 0.5, stiction tolerance 0.0001)</w:t>
+      </w:r>
+    </w:p>
+    <w:p>
+      <w:pPr>
+        <w:pStyle w:val="ListBullet"/>
+      </w:pPr>
+      <w:r>
+        <w:t>Single-world note: the CPU reference is faster at one world (0.41 vs 1.17 wall-s per simulated second); the GPU wins per world once dozens of worlds run concurrently, about 20x at 2^13</w:t>
       </w:r>
     </w:p>
     <w:p>
@@ -544,7 +588,7 @@
         <w:pStyle w:val="ListBullet"/>
       </w:pPr>
       <w:r>
-        <w:t>GPU-side runner (reused), https://github.com/mardigiorgio/icra2027/blob/c0279e47d8fe/part1/bench/benchmarks/part1_scaling.py#L36</w:t>
+        <w:t>scene port (constants + lattice RNG replay), https://github.com/mardigiorgio/icra2027/blob/80367ff55e/part1/bench/benchmarks/part1_cenic_cpu.py#L38-L75</w:t>
       </w:r>
     </w:p>
     <w:p>
@@ -552,7 +596,23 @@
         <w:pStyle w:val="ListBullet"/>
       </w:pPr>
       <w:r>
-        <w:t>Drake CENIC harness: not yet written; citation lands here when it exists</w:t>
+        <w:t>Drake world build and CENIC configuration, https://github.com/mardigiorgio/icra2027/blob/80367ff55e/part1/bench/benchmarks/part1_cenic_cpu.py#L77-L150</w:t>
+      </w:r>
+    </w:p>
+    <w:p>
+      <w:pPr>
+        <w:pStyle w:val="ListBullet"/>
+      </w:pPr>
+      <w:r>
+        <w:t>process sweep and per-world accounting, https://github.com/mardigiorgio/icra2027/blob/80367ff55e/part1/bench/benchmarks/part1_cenic_cpu.py#L153-L180</w:t>
+      </w:r>
+    </w:p>
+    <w:p>
+      <w:pPr>
+        <w:pStyle w:val="ListBullet"/>
+      </w:pPr>
+      <w:r>
+        <w:t>GPU-side runner (Experiment 3 data), https://github.com/mardigiorgio/icra2027/blob/c0279e47d8fe/part1/bench/benchmarks/part1_scaling.py#L36</w:t>
       </w:r>
     </w:p>
     <w:sectPr>

</xml_diff>

<commit_message>
Exp 4 as throughput; measured CPU/GPU crossover stated neutrally
</commit_message>
<xml_diff>
--- a/part1/bench/results/P1_core_experiments.docx
+++ b/part1/bench/results/P1_core_experiments.docx
@@ -559,7 +559,7 @@
         <w:pStyle w:val="ListBullet"/>
       </w:pPr>
       <w:r>
-        <w:t>Measured: wall-clock seconds per simulated second per world (median across worlds; min-max band on the CPU)</w:t>
+        <w:t>Measured: THROUGHPUT, total simulated world-seconds per wall second (up = better); per-world cost is N divided by throughput</w:t>
       </w:r>
     </w:p>
     <w:p>
@@ -575,7 +575,15 @@
         <w:pStyle w:val="ListBullet"/>
       </w:pPr>
       <w:r>
-        <w:t>Single-world note: the CPU reference is faster at one world (0.41 vs 1.17 wall-s per simulated second); the GPU wins per world once dozens of worlds run concurrently, about 20x at 2^13</w:t>
+        <w:t>Measured result on this host: CPU throughput scales with core count to a peak near 136 simulated world-seconds per wall second at 96 processes (128-core host); the GPU plateaus near 74 from about 2^10 worlds; at every matched N up to 96 the CPU curve is higher; per world at 2^13 the GPU is about 20x cheaper than one CPU core</w:t>
+      </w:r>
+    </w:p>
+    <w:p>
+      <w:pPr>
+        <w:pStyle w:val="ListBullet"/>
+      </w:pPr>
+      <w:r>
+        <w:t>Measurement caveats: the CPU sweep ran while a GPU training shared the host (idle rerun pending, expected to raise the CPU curve); the CPU host has 128 cores, far above a typical workstation; framing of this comparison is a PI decision</w:t>
       </w:r>
     </w:p>
     <w:p>

</xml_diff>

<commit_message>
Exp 4: oversubscribed CPU rungs and the measured 1024-world memory wall
</commit_message>
<xml_diff>
--- a/part1/bench/results/P1_core_experiments.docx
+++ b/part1/bench/results/P1_core_experiments.docx
@@ -477,7 +477,7 @@
       <w:r>
         <w:drawing>
           <wp:inline xmlns:a="http://schemas.openxmlformats.org/drawingml/2006/main" xmlns:pic="http://schemas.openxmlformats.org/drawingml/2006/picture">
-            <wp:extent cx="5669280" cy="3982879"/>
+            <wp:extent cx="5669280" cy="4000378"/>
             <wp:docPr id="4" name="Picture 4"/>
             <wp:cNvGraphicFramePr>
               <a:graphicFrameLocks noChangeAspect="1"/>
@@ -498,7 +498,7 @@
                   <pic:spPr>
                     <a:xfrm>
                       <a:off x="0" y="0"/>
-                      <a:ext cx="5669280" cy="3982879"/>
+                      <a:ext cx="5669280" cy="4000378"/>
                     </a:xfrm>
                     <a:prstGeom prst="rect"/>
                   </pic:spPr>
@@ -575,7 +575,7 @@
         <w:pStyle w:val="ListBullet"/>
       </w:pPr>
       <w:r>
-        <w:t>Measured result on this host: CPU throughput scales with core count to a peak near 136 simulated world-seconds per wall second at 96 processes (128-core host); the GPU plateaus near 74 from about 2^10 worlds; at every matched N up to 96 the CPU curve is higher; per world at 2^13 the GPU is about 20x cheaper than one CPU core</w:t>
+        <w:t>Measured result on this host (128 cores, 62 GB RAM): CPU throughput climbs to about 175 simulated world-seconds per wall second at 256 processes; measured memory footprint 123 MB per world caps concurrent CPU worlds near 400: a 1024-world batch needs about 126 GB and cannot run; the GPU runs 1024 worlds at about 65 and 8192 at about 74 inside one card, co-resident with the learner</w:t>
       </w:r>
     </w:p>
     <w:p>
@@ -583,7 +583,15 @@
         <w:pStyle w:val="ListBullet"/>
       </w:pPr>
       <w:r>
-        <w:t>Measurement caveats: the CPU sweep ran while a GPU training shared the host (idle rerun pending, expected to raise the CPU curve); the CPU host has 128 cores, far above a typical workstation; framing of this comparison is a PI decision</w:t>
+        <w:t>Reading: at the world counts RL training uses (1024 and up) only the GPU fields the batch; at world counts a many-core server can field, its aggregate throughput exceeds this GPU's (both facts on the figure)</w:t>
+      </w:r>
+    </w:p>
+    <w:p>
+      <w:pPr>
+        <w:pStyle w:val="ListBullet"/>
+      </w:pPr>
+      <w:r>
+        <w:t>Measurement caveats: the CPU sweep ran while a GPU training shared the host (idle rerun pending); the CPU host has 128 cores, far above a typical workstation</w:t>
       </w:r>
     </w:p>
     <w:p>

</xml_diff>

<commit_message>
Mark the 2048-env RL batch on the Exp 4 figure
</commit_message>
<xml_diff>
--- a/part1/bench/results/P1_core_experiments.docx
+++ b/part1/bench/results/P1_core_experiments.docx
@@ -477,7 +477,7 @@
       <w:r>
         <w:drawing>
           <wp:inline xmlns:a="http://schemas.openxmlformats.org/drawingml/2006/main" xmlns:pic="http://schemas.openxmlformats.org/drawingml/2006/picture">
-            <wp:extent cx="5669280" cy="4000378"/>
+            <wp:extent cx="5669280" cy="4007421"/>
             <wp:docPr id="4" name="Picture 4"/>
             <wp:cNvGraphicFramePr>
               <a:graphicFrameLocks noChangeAspect="1"/>
@@ -498,7 +498,7 @@
                   <pic:spPr>
                     <a:xfrm>
                       <a:off x="0" y="0"/>
-                      <a:ext cx="5669280" cy="4000378"/>
+                      <a:ext cx="5669280" cy="4007421"/>
                     </a:xfrm>
                     <a:prstGeom prst="rect"/>
                   </pic:spPr>

</xml_diff>

<commit_message>
Design doc on regenerated data
</commit_message>
<xml_diff>
--- a/part1/bench/results/P1_core_experiments.docx
+++ b/part1/bench/results/P1_core_experiments.docx
@@ -53,6 +53,22 @@
       </w:pPr>
       <w:r>
         <w:t>Smaller δt or smaller ε: more accurate, more expensive</w:t>
+      </w:r>
+    </w:p>
+    <w:p>
+      <w:pPr>
+        <w:pStyle w:val="ListBullet"/>
+      </w:pPr>
+      <w:r>
+        <w:t>Contact fairness: every arm, MuJoCo included, consumes the SAME Newton collision pipeline contact set; the solver is the only difference between arms</w:t>
+      </w:r>
+    </w:p>
+    <w:p>
+      <w:pPr>
+        <w:pStyle w:val="ListBullet"/>
+      </w:pPr>
+      <w:r>
+        <w:t>Clutter worlds: every parallel world draws its own initial arrangement (per-world seed, rejection-sampled so no bodies overlap at spawn; the same shared generator feeds the Drake harness, so CPU and GPU integrate identical world sets)</w:t>
       </w:r>
     </w:p>
     <w:p>
@@ -259,7 +275,7 @@
         <w:pStyle w:val="ListBullet"/>
       </w:pPr>
       <w:r>
-        <w:t>Scenes: soft clutter (20 spheres, k = 1,000 N/m) and hard clutter (10 spheres + 10 cubes, k = 100,000 N/m), dropped into a 30 cm bin from a seeded, jittered lattice; 2 s horizon</w:t>
+        <w:t>Scenes: soft clutter (20 spheres, k = 1,000 N/m) and hard clutter (10 spheres + 10 cubes, k = 100,000 N/m), dropped into a 30 cm bin; each world its own randomized non-overlapping lattice; 2 s horizon</w:t>
       </w:r>
     </w:p>
     <w:p>
@@ -337,6 +353,22 @@
       </w:pPr>
       <w:r>
         <w:t>contact budgets (&gt;= 2x measured demand), https://github.com/mardigiorgio/icra2027/blob/c0279e47d8fe/part1/bench/four_arms.py#L62-L64</w:t>
+      </w:r>
+    </w:p>
+    <w:p>
+      <w:pPr>
+        <w:pStyle w:val="ListBullet"/>
+      </w:pPr>
+      <w:r>
+        <w:t>per-world no-overlap lattice generator, https://github.com/mardigiorgio/icra2027/blob/98cb3afd46/part1/scenes/clutter_lattice.py#L38-L86</w:t>
+      </w:r>
+    </w:p>
+    <w:p>
+      <w:pPr>
+        <w:pStyle w:val="ListBullet"/>
+      </w:pPr>
+      <w:r>
+        <w:t>MuJoCo arms on Newton pipeline contacts, https://github.com/mardigiorgio/icra2027/blob/98cb3afd46/part1/bench/four_arms.py#L120 and #L150</w:t>
       </w:r>
     </w:p>
     <w:p>
@@ -527,7 +559,15 @@
         <w:pStyle w:val="ListBullet"/>
       </w:pPr>
       <w:r>
-        <w:t>CPU arm: Drake 1.56, integration_scheme = cenic (the reference implementation, shipped in Drake); each world is an independent process at nice +10; per-world cost is each process's own wall clock</w:t>
+        <w:t>CPU arm: Drake 1.56, integration_scheme = cenic (the reference implementation, shipped in Drake); N worker processes on an idle 128-core host, all released on one shared GO signal after building and warming up; ONE makespan timed for the whole batch (per-worker self-timing under staggered starts overstated contended throughput and was replaced)</w:t>
+      </w:r>
+    </w:p>
+    <w:p>
+      <w:pPr>
+        <w:pStyle w:val="ListBullet"/>
+      </w:pPr>
+      <w:r>
+        <w:t>Two CPU workloads: independent worlds (each advances its 2 s freely) and lockstep batch (every world barriers at every 0.1 s control boundary, the way an RL batch advances); the GPU is lockstep by construction, so lockstep-vs-GPU is the like-for-like line</w:t>
       </w:r>
     </w:p>
     <w:p>
@@ -543,7 +583,7 @@
         <w:pStyle w:val="ListBullet"/>
       </w:pPr>
       <w:r>
-        <w:t>Scene: hard clutter, ported 1:1 (constants copied from cenic_scenes.py, initial-pose lattice RNG replayed call-for-call with the same seed, so both stacks integrate the same initial condition)</w:t>
+        <w:t>Scene: hard clutter; both stacks import the same lattice generator, world i seeded identically, so CPU and GPU integrate identical randomized world sets</w:t>
       </w:r>
     </w:p>
     <w:p>
@@ -551,7 +591,7 @@
         <w:pStyle w:val="ListBullet"/>
       </w:pPr>
       <w:r>
-        <w:t>Varied: number of concurrent worlds; CPU 1 ... 96 processes (128-core host, capped below the core count), GPU 2^6 ... 2^13 batched</w:t>
+        <w:t>Varied: number of concurrent worlds; CPU 1 ... 256 processes, GPU 2^6 ... 2^13 batched</w:t>
       </w:r>
     </w:p>
     <w:p>
@@ -559,7 +599,7 @@
         <w:pStyle w:val="ListBullet"/>
       </w:pPr>
       <w:r>
-        <w:t>Measured: THROUGHPUT, total simulated world-seconds per wall second (up = better); per-world cost is N divided by throughput</w:t>
+        <w:t>Measured: THROUGHPUT, total simulated world-seconds per wall second (up = better)</w:t>
       </w:r>
     </w:p>
     <w:p>
@@ -575,7 +615,7 @@
         <w:pStyle w:val="ListBullet"/>
       </w:pPr>
       <w:r>
-        <w:t>Measured result on this host (128 cores, 62 GB RAM): CPU throughput climbs to about 175 simulated world-seconds per wall second at 256 processes; measured memory footprint 123 MB per world caps concurrent CPU worlds near 400: a 1024-world batch needs about 126 GB and cannot run; the GPU runs 1024 worlds at about 65 and 8192 at about 74 inside one card, co-resident with the learner</w:t>
+        <w:t>Measured result: CPU lockstep peaks near 127 simulated world-seconds per wall second at 256 worlds, its memory ceiling (123 MB per world; a 1024-world batch needs about 126 GB against 62 GB of host RAM and cannot exist); independent-worlds mode peaks near 140; the GPU runs the RL batch sizes the CPU cannot: about 64 at 2048 worlds and 67 at 8192, inside one card, co-resident with the learner</w:t>
       </w:r>
     </w:p>
     <w:p>
@@ -583,15 +623,7 @@
         <w:pStyle w:val="ListBullet"/>
       </w:pPr>
       <w:r>
-        <w:t>Reading: at the world counts RL training uses (1024 and up) only the GPU fields the batch; at world counts a many-core server can field, its aggregate throughput exceeds this GPU's (both facts on the figure)</w:t>
-      </w:r>
-    </w:p>
-    <w:p>
-      <w:pPr>
-        <w:pStyle w:val="ListBullet"/>
-      </w:pPr>
-      <w:r>
-        <w:t>Measurement caveats: the CPU sweep ran while a GPU training shared the host (idle rerun pending); the CPU host has 128 cores, far above a typical workstation</w:t>
+        <w:t>Reading: at the world counts RL training uses (marked 2048 line) only the GPU fields the batch; at world counts a 128-core server can field, its aggregate throughput exceeds this GPU implementation's</w:t>
       </w:r>
     </w:p>
     <w:p>
@@ -604,7 +636,7 @@
         <w:pStyle w:val="ListBullet"/>
       </w:pPr>
       <w:r>
-        <w:t>scene port (constants + lattice RNG replay), https://github.com/mardigiorgio/icra2027/blob/80367ff55e/part1/bench/benchmarks/part1_cenic_cpu.py#L38-L75</w:t>
+        <w:t>shared lattice import and scene constants, https://github.com/mardigiorgio/icra2027/blob/98cb3afd46/part1/bench/benchmarks/part1_cenic_cpu.py#L38-L60</w:t>
       </w:r>
     </w:p>
     <w:p>
@@ -612,7 +644,7 @@
         <w:pStyle w:val="ListBullet"/>
       </w:pPr>
       <w:r>
-        <w:t>Drake world build and CENIC configuration, https://github.com/mardigiorgio/icra2027/blob/80367ff55e/part1/bench/benchmarks/part1_cenic_cpu.py#L77-L150</w:t>
+        <w:t>Drake world build and CENIC configuration, https://github.com/mardigiorgio/icra2027/blob/98cb3afd46/part1/bench/benchmarks/part1_cenic_cpu.py#L66-L135</w:t>
       </w:r>
     </w:p>
     <w:p>
@@ -620,7 +652,7 @@
         <w:pStyle w:val="ListBullet"/>
       </w:pPr>
       <w:r>
-        <w:t>process sweep and per-world accounting, https://github.com/mardigiorgio/icra2027/blob/80367ff55e/part1/bench/benchmarks/part1_cenic_cpu.py#L153-L180</w:t>
+        <w:t>GO-signal barrier, lockstep boundaries, makespan timing, https://github.com/mardigiorgio/icra2027/blob/98cb3afd46/part1/bench/benchmarks/part1_cenic_cpu.py#L137-L196</w:t>
       </w:r>
     </w:p>
     <w:p>

</xml_diff>

<commit_message>
Scene images from Newton's viewer (ViewerGL headless captures)
</commit_message>
<xml_diff>
--- a/part1/bench/results/P1_core_experiments.docx
+++ b/part1/bench/results/P1_core_experiments.docx
@@ -15,7 +15,7 @@
         <w:rPr>
           <w:i/>
         </w:rPr>
-        <w:t>Design-only revision, 2026-09-01, on the PI's request: each experiment lists scene, arms, what is varied, what is measured, and code. Scene images: simulator-viewer captures pending (schematic renders removed).</w:t>
+        <w:t>Design-only revision, 2026-09-01, on the PI's request: each experiment lists scene, arms, what is varied, what is measured, and code. Scene images are captures from Newton's own viewer (ViewerGL): what is shown is what the simulator draws.</w:t>
       </w:r>
     </w:p>
     <w:p>
@@ -83,8 +83,49 @@
       <w:r>
         <w:drawing>
           <wp:inline xmlns:a="http://schemas.openxmlformats.org/drawingml/2006/main" xmlns:pic="http://schemas.openxmlformats.org/drawingml/2006/picture">
+            <wp:extent cx="2926080" cy="2275840"/>
+            <wp:docPr id="1" name="Picture 1"/>
+            <wp:cNvGraphicFramePr>
+              <a:graphicFrameLocks noChangeAspect="1"/>
+            </wp:cNvGraphicFramePr>
+            <a:graphic>
+              <a:graphicData uri="http://schemas.openxmlformats.org/drawingml/2006/picture">
+                <pic:pic>
+                  <pic:nvPicPr>
+                    <pic:cNvPr id="0" name="capture_stiffness.png"/>
+                    <pic:cNvPicPr/>
+                  </pic:nvPicPr>
+                  <pic:blipFill>
+                    <a:blip r:embed="rId9"/>
+                    <a:stretch>
+                      <a:fillRect/>
+                    </a:stretch>
+                  </pic:blipFill>
+                  <pic:spPr>
+                    <a:xfrm>
+                      <a:off x="0" y="0"/>
+                      <a:ext cx="2926080" cy="2275840"/>
+                    </a:xfrm>
+                    <a:prstGeom prst="rect"/>
+                  </pic:spPr>
+                </pic:pic>
+              </a:graphicData>
+            </a:graphic>
+          </wp:inline>
+        </w:drawing>
+      </w:r>
+    </w:p>
+    <w:p>
+      <w:r>
+        <w:t>Scene (Newton viewer): the 65 g sphere at rest on the plane.</w:t>
+      </w:r>
+    </w:p>
+    <w:p>
+      <w:r>
+        <w:drawing>
+          <wp:inline xmlns:a="http://schemas.openxmlformats.org/drawingml/2006/main" xmlns:pic="http://schemas.openxmlformats.org/drawingml/2006/picture">
             <wp:extent cx="5669280" cy="2726251"/>
-            <wp:docPr id="1" name="Picture 1"/>
+            <wp:docPr id="2" name="Picture 2"/>
             <wp:cNvGraphicFramePr>
               <a:graphicFrameLocks noChangeAspect="1"/>
             </wp:cNvGraphicFramePr>
@@ -96,7 +137,7 @@
                     <pic:cNvPicPr/>
                   </pic:nvPicPr>
                   <pic:blipFill>
-                    <a:blip r:embed="rId9"/>
+                    <a:blip r:embed="rId10"/>
                     <a:stretch>
                       <a:fillRect/>
                     </a:stretch>
@@ -233,8 +274,90 @@
       <w:r>
         <w:drawing>
           <wp:inline xmlns:a="http://schemas.openxmlformats.org/drawingml/2006/main" xmlns:pic="http://schemas.openxmlformats.org/drawingml/2006/picture">
+            <wp:extent cx="4937760" cy="1894974"/>
+            <wp:docPr id="3" name="Picture 3"/>
+            <wp:cNvGraphicFramePr>
+              <a:graphicFrameLocks noChangeAspect="1"/>
+            </wp:cNvGraphicFramePr>
+            <a:graphic>
+              <a:graphicData uri="http://schemas.openxmlformats.org/drawingml/2006/picture">
+                <pic:pic>
+                  <pic:nvPicPr>
+                    <pic:cNvPr id="0" name="capture_soft_clutter.png"/>
+                    <pic:cNvPicPr/>
+                  </pic:nvPicPr>
+                  <pic:blipFill>
+                    <a:blip r:embed="rId11"/>
+                    <a:stretch>
+                      <a:fillRect/>
+                    </a:stretch>
+                  </pic:blipFill>
+                  <pic:spPr>
+                    <a:xfrm>
+                      <a:off x="0" y="0"/>
+                      <a:ext cx="4937760" cy="1894974"/>
+                    </a:xfrm>
+                    <a:prstGeom prst="rect"/>
+                  </pic:spPr>
+                </pic:pic>
+              </a:graphicData>
+            </a:graphic>
+          </wp:inline>
+        </w:drawing>
+      </w:r>
+    </w:p>
+    <w:p>
+      <w:r>
+        <w:t>Soft clutter, world 0 (Newton viewer): t = 0 left, settled at 1.5 s right.</w:t>
+      </w:r>
+    </w:p>
+    <w:p>
+      <w:r>
+        <w:drawing>
+          <wp:inline xmlns:a="http://schemas.openxmlformats.org/drawingml/2006/main" xmlns:pic="http://schemas.openxmlformats.org/drawingml/2006/picture">
+            <wp:extent cx="4937760" cy="1894974"/>
+            <wp:docPr id="4" name="Picture 4"/>
+            <wp:cNvGraphicFramePr>
+              <a:graphicFrameLocks noChangeAspect="1"/>
+            </wp:cNvGraphicFramePr>
+            <a:graphic>
+              <a:graphicData uri="http://schemas.openxmlformats.org/drawingml/2006/picture">
+                <pic:pic>
+                  <pic:nvPicPr>
+                    <pic:cNvPr id="0" name="capture_hard_clutter.png"/>
+                    <pic:cNvPicPr/>
+                  </pic:nvPicPr>
+                  <pic:blipFill>
+                    <a:blip r:embed="rId12"/>
+                    <a:stretch>
+                      <a:fillRect/>
+                    </a:stretch>
+                  </pic:blipFill>
+                  <pic:spPr>
+                    <a:xfrm>
+                      <a:off x="0" y="0"/>
+                      <a:ext cx="4937760" cy="1894974"/>
+                    </a:xfrm>
+                    <a:prstGeom prst="rect"/>
+                  </pic:spPr>
+                </pic:pic>
+              </a:graphicData>
+            </a:graphic>
+          </wp:inline>
+        </w:drawing>
+      </w:r>
+    </w:p>
+    <w:p>
+      <w:r>
+        <w:t>Hard clutter, world 0 (Newton viewer): t = 0 left, settled at 1.5 s right.</w:t>
+      </w:r>
+    </w:p>
+    <w:p>
+      <w:r>
+        <w:drawing>
+          <wp:inline xmlns:a="http://schemas.openxmlformats.org/drawingml/2006/main" xmlns:pic="http://schemas.openxmlformats.org/drawingml/2006/picture">
             <wp:extent cx="5669280" cy="4584250"/>
-            <wp:docPr id="2" name="Picture 2"/>
+            <wp:docPr id="5" name="Picture 5"/>
             <wp:cNvGraphicFramePr>
               <a:graphicFrameLocks noChangeAspect="1"/>
             </wp:cNvGraphicFramePr>
@@ -246,7 +369,7 @@
                     <pic:cNvPicPr/>
                   </pic:nvPicPr>
                   <pic:blipFill>
-                    <a:blip r:embed="rId10"/>
+                    <a:blip r:embed="rId13"/>
                     <a:stretch>
                       <a:fillRect/>
                     </a:stretch>
@@ -381,10 +504,15 @@
     </w:p>
     <w:p>
       <w:r>
+        <w:t>Scene: hard clutter, as captured under Experiment 2.</w:t>
+      </w:r>
+    </w:p>
+    <w:p>
+      <w:r>
         <w:drawing>
           <wp:inline xmlns:a="http://schemas.openxmlformats.org/drawingml/2006/main" xmlns:pic="http://schemas.openxmlformats.org/drawingml/2006/picture">
             <wp:extent cx="5669280" cy="4127317"/>
-            <wp:docPr id="3" name="Picture 3"/>
+            <wp:docPr id="6" name="Picture 6"/>
             <wp:cNvGraphicFramePr>
               <a:graphicFrameLocks noChangeAspect="1"/>
             </wp:cNvGraphicFramePr>
@@ -396,7 +524,7 @@
                     <pic:cNvPicPr/>
                   </pic:nvPicPr>
                   <pic:blipFill>
-                    <a:blip r:embed="rId11"/>
+                    <a:blip r:embed="rId14"/>
                     <a:stretch>
                       <a:fillRect/>
                     </a:stretch>
@@ -510,7 +638,7 @@
         <w:drawing>
           <wp:inline xmlns:a="http://schemas.openxmlformats.org/drawingml/2006/main" xmlns:pic="http://schemas.openxmlformats.org/drawingml/2006/picture">
             <wp:extent cx="5669280" cy="4007421"/>
-            <wp:docPr id="4" name="Picture 4"/>
+            <wp:docPr id="7" name="Picture 7"/>
             <wp:cNvGraphicFramePr>
               <a:graphicFrameLocks noChangeAspect="1"/>
             </wp:cNvGraphicFramePr>
@@ -522,7 +650,7 @@
                     <pic:cNvPicPr/>
                   </pic:nvPicPr>
                   <pic:blipFill>
-                    <a:blip r:embed="rId12"/>
+                    <a:blip r:embed="rId15"/>
                     <a:stretch>
                       <a:fillRect/>
                     </a:stretch>

</xml_diff>

<commit_message>
Exp 4 heading and provenance say throughput
</commit_message>
<xml_diff>
--- a/part1/bench/results/P1_core_experiments.docx
+++ b/part1/bench/results/P1_core_experiments.docx
@@ -630,7 +630,7 @@
         <w:pStyle w:val="Heading2"/>
       </w:pPr>
       <w:r>
-        <w:t>Experiment 4, CENIC reference implementation (Drake, CPU) vs this work (Newton/Warp, GPU): cost per world vs number of worlds</w:t>
+        <w:t>Experiment 4, CENIC reference implementation (Drake, CPU) vs this work (Newton/Warp, GPU): throughput vs number of worlds</w:t>
       </w:r>
     </w:p>
     <w:p>
@@ -679,7 +679,7 @@
         <w:pStyle w:val="ListBullet"/>
       </w:pPr>
       <w:r>
-        <w:t>Question: what one world of error-controlled CENIC stepping costs as the world count grows, reference CPU implementation vs the GPU implementation this paper contributes</w:t>
+        <w:t>Question: how much error-controlled CENIC simulation a wall second buys as the world count grows, reference CPU implementation vs the GPU implementation this paper contributes</w:t>
       </w:r>
     </w:p>
     <w:p>
@@ -703,7 +703,7 @@
         <w:pStyle w:val="ListBullet"/>
       </w:pPr>
       <w:r>
-        <w:t>GPU arm: Newton/Warp CENIC (ICF EC), batched worlds; reuses the Experiment 3 scaling data</w:t>
+        <w:t>GPU arm: Newton/Warp CENIC (ICF EC), batched worlds; Experiment 3 scaling data plus dedicated cells at N = 1 ... 32 so both stacks share every x point</w:t>
       </w:r>
     </w:p>
     <w:p>

</xml_diff>

<commit_message>
Exp 4 figure: one curve per stack, shared x range 1..256
</commit_message>
<xml_diff>
--- a/part1/bench/results/P1_core_experiments.docx
+++ b/part1/bench/results/P1_core_experiments.docx
@@ -637,7 +637,7 @@
       <w:r>
         <w:drawing>
           <wp:inline xmlns:a="http://schemas.openxmlformats.org/drawingml/2006/main" xmlns:pic="http://schemas.openxmlformats.org/drawingml/2006/picture">
-            <wp:extent cx="5669280" cy="4007421"/>
+            <wp:extent cx="5669280" cy="3982879"/>
             <wp:docPr id="7" name="Picture 7"/>
             <wp:cNvGraphicFramePr>
               <a:graphicFrameLocks noChangeAspect="1"/>
@@ -658,7 +658,7 @@
                   <pic:spPr>
                     <a:xfrm>
                       <a:off x="0" y="0"/>
-                      <a:ext cx="5669280" cy="4007421"/>
+                      <a:ext cx="5669280" cy="3982879"/>
                     </a:xfrm>
                     <a:prstGeom prst="rect"/>
                   </pic:spPr>
@@ -695,7 +695,7 @@
         <w:pStyle w:val="ListBullet"/>
       </w:pPr>
       <w:r>
-        <w:t>Two CPU workloads: independent worlds (each advances its 2 s freely) and lockstep batch (every world barriers at every 0.1 s control boundary, the way an RL batch advances); the GPU is lockstep by construction, so lockstep-vs-GPU is the like-for-like line</w:t>
+        <w:t>CPU workload: lockstep batch (every world barriers at every 0.1 s control boundary, the way an RL batch advances); the GPU is lockstep by construction, so the two curves are like-for-like</w:t>
       </w:r>
     </w:p>
     <w:p>
@@ -719,7 +719,7 @@
         <w:pStyle w:val="ListBullet"/>
       </w:pPr>
       <w:r>
-        <w:t>Varied: number of concurrent worlds, the SAME points for both stacks: 1 ... 256, with the GPU continuing alone to 2^13 past the CPU memory wall</w:t>
+        <w:t>Varied: number of concurrent worlds, the SAME points for both stacks: 1 ... 256 (the CPU memory ceiling ends the axis; the GPU alone continues to 2^13 in the Experiment 3 data)</w:t>
       </w:r>
     </w:p>
     <w:p>
@@ -743,7 +743,7 @@
         <w:pStyle w:val="ListBullet"/>
       </w:pPr>
       <w:r>
-        <w:t>Measured result: CPU lockstep peaks near 127 simulated world-seconds per wall second at 256 worlds, its memory ceiling (123 MB per world; a 1024-world batch needs about 126 GB against 62 GB of host RAM and cannot exist); independent-worlds mode peaks near 140; the GPU runs the RL batch sizes the CPU cannot: about 64 at 2048 worlds and 67 at 8192, inside one card, co-resident with the learner</w:t>
+        <w:t>Measured result: at every shared point the 128-core CPU is above this GPU implementation (2.4 vs 1.7 at one world, 127 vs 38 at 256); the CPU ends at its memory ceiling (123 MB per world; a 1024-world batch needs about 126 GB against 62 GB of host RAM and cannot exist), while the GPU continues to the RL batch sizes: about 64 simulated world-seconds per wall second at 2048 worlds and 67 at 8192, inside one card, co-resident with the learner</w:t>
       </w:r>
     </w:p>
     <w:p>
@@ -751,7 +751,7 @@
         <w:pStyle w:val="ListBullet"/>
       </w:pPr>
       <w:r>
-        <w:t>Reading: at the world counts RL training uses (marked 2048 line) only the GPU fields the batch; at world counts a 128-core server can field, its aggregate throughput exceeds this GPU implementation's</w:t>
+        <w:t>Reading: at the world counts RL training uses (1024 and up) only the GPU fields the batch; at world counts a 128-core server can field, its aggregate throughput exceeds this GPU implementation's</w:t>
       </w:r>
     </w:p>
     <w:p>

</xml_diff>

<commit_message>
Exp 4: sequential CPU fallback, wall-per-boundary metric
Per-core world hosting (one shared diagram per worker, ~1 MB contexts)
replaces one-process-per-world: worlds beyond the core count run
sequentially, so the memory wall was a harness artifact and N runs to
2048 on the CPU. Metric unified with Experiment 3: wall time per 100 ms
control boundary.
</commit_message>
<xml_diff>
--- a/part1/bench/results/P1_core_experiments.docx
+++ b/part1/bench/results/P1_core_experiments.docx
@@ -687,7 +687,7 @@
         <w:pStyle w:val="ListBullet"/>
       </w:pPr>
       <w:r>
-        <w:t>CPU arm: Drake 1.56, integration_scheme = cenic (the reference implementation, shipped in Drake); N worker processes on an idle 128-core host, all released on one shared GO signal after building and warming up; ONE makespan timed for the whole batch (per-worker self-timing under staggered starts overstated contended throughput and was replaced)</w:t>
+        <w:t>CPU arm: Drake 1.56, integration_scheme = cenic (the reference implementation, shipped in Drake); W = min(N, 96) worker processes on the idle 128-core host, each building ONE diagram and hosting its share of worlds as ~1 MB per-world contexts, so worlds beyond the core count run SEQUENTIALLY on the cores available with no artificial per-world residency cost</w:t>
       </w:r>
     </w:p>
     <w:p>
@@ -695,7 +695,7 @@
         <w:pStyle w:val="ListBullet"/>
       </w:pPr>
       <w:r>
-        <w:t>CPU workload: lockstep batch (every world barriers at every 0.1 s control boundary, the way an RL batch advances); the GPU is lockstep by construction, so the two curves are like-for-like</w:t>
+        <w:t>Lockstep batch semantics in both stacks: every worker advances each of its worlds one 0.1 s boundary, then all workers barrier; all workers start on one shared GO after building and warming up; the parent times one makespan</w:t>
       </w:r>
     </w:p>
     <w:p>
@@ -719,7 +719,7 @@
         <w:pStyle w:val="ListBullet"/>
       </w:pPr>
       <w:r>
-        <w:t>Varied: number of concurrent worlds, the SAME points for both stacks: 1 ... 256 (the CPU memory ceiling ends the axis; the GPU alone continues to 2^13 in the Experiment 3 data)</w:t>
+        <w:t>Varied: number of concurrent worlds, the SAME points for both stacks, shown 1 ... 256; both stacks also measured beyond (CPU to 2048, GPU to 8192)</w:t>
       </w:r>
     </w:p>
     <w:p>
@@ -727,7 +727,7 @@
         <w:pStyle w:val="ListBullet"/>
       </w:pPr>
       <w:r>
-        <w:t>Measured: THROUGHPUT, total simulated world-seconds per wall second (up = better)</w:t>
+        <w:t>Measured: WALL TIME PER 100 ms CONTROL BOUNDARY in ms (the Experiment 3 metric; lower is better)</w:t>
       </w:r>
     </w:p>
     <w:p>
@@ -743,7 +743,7 @@
         <w:pStyle w:val="ListBullet"/>
       </w:pPr>
       <w:r>
-        <w:t>Measured result: at every shared point the 128-core CPU is above this GPU implementation (2.4 vs 1.7 at one world, 127 vs 38 at 256); the CPU ends at its memory ceiling (123 MB per world; a 1024-world batch needs about 126 GB against 62 GB of host RAM and cannot exist), while the GPU continues to the RL batch sizes: about 64 simulated world-seconds per wall second at 2048 worlds and 67 at 8192, inside one card, co-resident with the learner</w:t>
+        <w:t>Measured result: CPU 43 ms per boundary at 1 world, 80 at 64, then sequential growth past the cores: 229 at 256, 793 at 1024, 1552 at 2048; GPU 51 at 1 world, 388 at 256, 3202 at 2048, 12252 at 8192; the curves approach each other near 8192 worlds</w:t>
       </w:r>
     </w:p>
     <w:p>
@@ -751,7 +751,7 @@
         <w:pStyle w:val="ListBullet"/>
       </w:pPr>
       <w:r>
-        <w:t>Reading: at the world counts RL training uses (1024 and up) only the GPU fields the batch; at world counts a 128-core server can field, its aggregate throughput exceeds this GPU implementation's</w:t>
+        <w:t>Reading: on this 128-core host the CPU reference is below this GPU implementation at every measured point; the GPU case rests on per-world cost at large N, co-residence with the learner (no PCIe state transfer in the training loop), and typical training hosts with far fewer cores</w:t>
       </w:r>
     </w:p>
     <w:p>

</xml_diff>

<commit_message>
Exp 4: plain scene-completion wall time, no normalization
Claude-Session: https://claude.ai/code/session_015jwxLQxXKy7cte15GEu79P
</commit_message>
<xml_diff>
--- a/part1/bench/results/P1_core_experiments.docx
+++ b/part1/bench/results/P1_core_experiments.docx
@@ -630,7 +630,7 @@
         <w:pStyle w:val="Heading2"/>
       </w:pPr>
       <w:r>
-        <w:t>Experiment 4, CENIC reference implementation (Drake, CPU) vs this work (Newton/Warp, GPU): throughput vs number of worlds</w:t>
+        <w:t>Experiment 4, CENIC reference implementation (Drake, CPU) vs this work (Newton/Warp, GPU): wall time vs number of worlds</w:t>
       </w:r>
     </w:p>
     <w:p>
@@ -679,7 +679,7 @@
         <w:pStyle w:val="ListBullet"/>
       </w:pPr>
       <w:r>
-        <w:t>Question: how much error-controlled CENIC simulation a wall second buys as the world count grows, reference CPU implementation vs the GPU implementation this paper contributes</w:t>
+        <w:t>Question: how long a batch of N worlds takes to complete the scene under error-controlled CENIC, reference CPU implementation vs the GPU implementation this paper contributes</w:t>
       </w:r>
     </w:p>
     <w:p>
@@ -727,7 +727,7 @@
         <w:pStyle w:val="ListBullet"/>
       </w:pPr>
       <w:r>
-        <w:t>Measured: WALL TIME PER 100 ms CONTROL BOUNDARY in ms (the Experiment 3 metric; lower is better)</w:t>
+        <w:t>Measured: plain wall-clock time for the batch to complete the 2 s scene, in seconds; no normalization; lower is better</w:t>
       </w:r>
     </w:p>
     <w:p>
@@ -743,7 +743,7 @@
         <w:pStyle w:val="ListBullet"/>
       </w:pPr>
       <w:r>
-        <w:t>Measured result: CPU 43 ms per boundary at 1 world, 80 at 64, then sequential growth past the cores: 229 at 256, 793 at 1024, 1552 at 2048; GPU 51 at 1 world, 388 at 256, 3202 at 2048, 12252 at 8192; the curves approach each other near 8192 worlds</w:t>
+        <w:t>Measured result (seconds to complete the scene): CPU 0.86 at 1 world, 1.6 at 64, then sequential growth past the cores: 4.6 at 256, 15.9 at 1024, 31 at 2048; GPU 1.0 at 1 world, 7.8 at 256, 64 at 2048, 245 at 8192; the curves approach each other near 8192 worlds</w:t>
       </w:r>
     </w:p>
     <w:p>

</xml_diff>

<commit_message>
All cost figures: bare wall-time axis, scene in the caption
Claude-Session: https://claude.ai/code/session_015jwxLQxXKy7cte15GEu79P
</commit_message>
<xml_diff>
--- a/part1/bench/results/P1_core_experiments.docx
+++ b/part1/bench/results/P1_core_experiments.docx
@@ -390,6 +390,11 @@
     </w:p>
     <w:p>
       <w:r>
+        <w:t>Figure: wall time to complete the 2 s clutter scene, vs requested tolerance; dotted levels are the fixed steps; gray line is the timeout.</w:t>
+      </w:r>
+    </w:p>
+    <w:p>
+      <w:r>
         <w:t>Design:</w:t>
       </w:r>
     </w:p>
@@ -422,7 +427,7 @@
         <w:pStyle w:val="ListBullet"/>
       </w:pPr>
       <w:r>
-        <w:t>Measured: wall-clock seconds per simulated second; timeout at 100 s per world-second and march-budget exhaustion are marked as crosses</w:t>
+        <w:t>Measured: wall time to complete the 2 s scene; timeout at 100 s per world-second and march-budget exhaustion are marked as crosses</w:t>
       </w:r>
     </w:p>
     <w:p>
@@ -545,6 +550,11 @@
     </w:p>
     <w:p>
       <w:r>
+        <w:t>Figure: wall time to complete the 2 s hard clutter scene, vs the number of parallel worlds; band is the spread of 3 independent runs.</w:t>
+      </w:r>
+    </w:p>
+    <w:p>
+      <w:r>
         <w:t>Design:</w:t>
       </w:r>
     </w:p>
@@ -577,7 +587,7 @@
         <w:pStyle w:val="ListBullet"/>
       </w:pPr>
       <w:r>
-        <w:t>Measured: wall time per 100 ms control boundary, median of 3 independent trials (spread drawn as a band); per-world cost = wall / N</w:t>
+        <w:t>Measured: wall time to complete the 2 s scene, median of 3 independent trials (spread drawn as a band)</w:t>
       </w:r>
     </w:p>
     <w:p>
@@ -667,6 +677,11 @@
             </a:graphic>
           </wp:inline>
         </w:drawing>
+      </w:r>
+    </w:p>
+    <w:p>
+      <w:r>
+        <w:t>Figure: wall time for the batch of N worlds to complete the 2 s hard clutter scene, CPU reference vs this work.</w:t>
       </w:r>
     </w:p>
     <w:p>

</xml_diff>

<commit_message>
Exp 4 measured to saturation on both stacks
CPU (128 cores) linear at 14.6 ms/world through 8192 worlds; GPU
linear at ~30 ms/world from 2^10; parallel slopes, CPU ~2x below at
all N. Same-GPU MuJoCo-EC control (5.6 ms/world-scene) shows the gap
is the ICF march's per-step cost, not the hardware.

Claude-Session: https://claude.ai/code/session_015jwxLQxXKy7cte15GEu79P
</commit_message>
<xml_diff>
--- a/part1/bench/results/P1_core_experiments.docx
+++ b/part1/bench/results/P1_core_experiments.docx
@@ -681,7 +681,7 @@
     </w:p>
     <w:p>
       <w:r>
-        <w:t>Figure: wall time for the batch of N worlds to complete the 2 s hard clutter scene, CPU reference vs this work.</w:t>
+        <w:t>Figure: wall time for the batch of N worlds to complete the 2 s hard clutter scene, CPU reference (128 cores) vs this work (RTX 5090), both measured to saturation.</w:t>
       </w:r>
     </w:p>
     <w:p>
@@ -734,7 +734,7 @@
         <w:pStyle w:val="ListBullet"/>
       </w:pPr>
       <w:r>
-        <w:t>Varied: number of concurrent worlds, the SAME points for both stacks, shown 1 ... 256; both stacks also measured beyond (CPU to 2048, GPU to 8192)</w:t>
+        <w:t>Varied: number of concurrent worlds, 1 ... 8192, both stacks measured to saturation</w:t>
       </w:r>
     </w:p>
     <w:p>
@@ -758,7 +758,7 @@
         <w:pStyle w:val="ListBullet"/>
       </w:pPr>
       <w:r>
-        <w:t>Measured result (seconds to complete the scene): CPU 0.86 at 1 world, 1.6 at 64, then sequential growth past the cores: 4.6 at 256, 15.9 at 1024, 31 at 2048; GPU 1.0 at 1 world, 7.8 at 256, 64 at 2048, 245 at 8192; the curves approach each other near 8192 worlds</w:t>
+        <w:t>Measured result (seconds to complete the scene): CPU 0.86 at 1 world, 4.6 at 256, then linear at 14.6 ms per world: 16 at 1024, 31 at 2048, 60 at 4096, 120 at 8192; GPU 1.0 at 1 world, 20 at 1024, 64 at 2048, 245 at 8192, linear at about 30 ms per world from 2^10; the two saturated slopes are parallel, CPU about 2x below at every N</w:t>
       </w:r>
     </w:p>
     <w:p>
@@ -766,7 +766,15 @@
         <w:pStyle w:val="ListBullet"/>
       </w:pPr>
       <w:r>
-        <w:t>Reading: on this 128-core host the CPU reference is below this GPU implementation at every measured point; the GPU case rests on per-world cost at large N, co-residence with the learner (no PCIe state transfer in the training loop), and typical training hosts with far fewer cores</w:t>
+        <w:t>Control on the same GPU: the MuJoCo error-controlled march completes at 5.6 ms per world-scene at 8192 worlds, 2.6x below the 128-core CPU: the gap between the curves is this ICF march implementation's per-step cost (narrow phase dominates its profile), not the hardware</w:t>
+      </w:r>
+    </w:p>
+    <w:p>
+      <w:pPr>
+        <w:pStyle w:val="ListBullet"/>
+      </w:pPr>
+      <w:r>
+        <w:t>Reading: on this host pair the CPU reference stays about 2x below this GPU implementation at all N; the same card beats the CPU with a cheaper per-step march, so the gap is implementation headroom, which is the paper's speed-optimization contribution surface; the GPU case additionally rests on co-residence with the learner (no PCIe state transfer in the training loop)</w:t>
       </w:r>
     </w:p>
     <w:p>

</xml_diff>

<commit_message>
Rerun Exp 2 (N=1) and Exp 3 on the optimized ICF solver
Exp 3 scaling (both scenes) and the Exp 2 work-precision N=1 rows
re-measured with the ICF arms on icf_warp perf/contact-solve 543879b
(block-structured Hessian assembly, march compaction, block-sparse
Cholesky). The MuJoCo arms reproduce the previous run within 2%, so
the ICF movement is the solver change alone: on hard clutter the ICF
EC arm goes from 12.25 s to 1.51 s per boundary at 8192 worlds and now
sits below MuJoCo EC over the whole N range. The Exp 2 N=1024 rows are
still the pre-optimization measurement and are marked as such in the
doc.

part1_plots' main block still called plot functions purged in c0279e4
and died before the scaling plots; it now runs the functions that
exist, so every figure regenerates from the CSVs in one invocation.

Claude-Session: https://claude.ai/code/session_015jwxLQxXKy7cte15GEu79P
</commit_message>
<xml_diff>
--- a/part1/bench/results/P1_core_experiments.docx
+++ b/part1/bench/results/P1_core_experiments.docx
@@ -439,6 +439,14 @@
       </w:r>
     </w:p>
     <w:p>
+      <w:pPr>
+        <w:pStyle w:val="ListBullet"/>
+      </w:pPr>
+      <w:r>
+        <w:t>Status (2026-09-03): the N = 1 rows were re-measured on the optimized ICF solver (icf_warp perf/contact-solve 543879b); the N = 1024 rows still come from the pre-optimization solver and are queued for re-measurement, so the ICF EC curve at N = 1024 overstates its cost</w:t>
+      </w:r>
+    </w:p>
+    <w:p>
       <w:r>
         <w:t>Code:</w:t>
       </w:r>
@@ -448,7 +456,7 @@
         <w:pStyle w:val="ListBullet"/>
       </w:pPr>
       <w:r>
-        <w:t>timeout semantics (per world-second), https://github.com/mardigiorgio/icra2027/blob/c0279e47d8fe/part1/bench/benchmarks/part1_workprecision.py#L8-L16</w:t>
+        <w:t>timeout semantics (per world-second), https://github.com/mardigiorgio/icra2027/blob/1edc6a523a/part1/bench/benchmarks/part1_workprecision.py#L8-L16</w:t>
       </w:r>
     </w:p>
     <w:p>
@@ -456,7 +464,7 @@
         <w:pStyle w:val="ListBullet"/>
       </w:pPr>
       <w:r>
-        <w:t>accuracy ladder + march budget, https://github.com/mardigiorgio/icra2027/blob/c0279e47d8fe/part1/bench/benchmarks/part1_workprecision.py#L18-L21</w:t>
+        <w:t>accuracy ladder + march budget, https://github.com/mardigiorgio/icra2027/blob/1edc6a523a/part1/bench/benchmarks/part1_workprecision.py#L18-L21</w:t>
       </w:r>
     </w:p>
     <w:p>
@@ -464,7 +472,7 @@
         <w:pStyle w:val="ListBullet"/>
       </w:pPr>
       <w:r>
-        <w:t>first attempt k_Init·δt_max, https://github.com/mardigiorgio/icra2027/blob/c0279e47d8fe/part1/bench/four_arms.py#L47</w:t>
+        <w:t>first attempt k_Init·δt_max, https://github.com/mardigiorgio/icra2027/blob/1edc6a523a/part1/bench/four_arms.py#L47</w:t>
       </w:r>
     </w:p>
     <w:p>
@@ -472,7 +480,7 @@
         <w:pStyle w:val="ListBullet"/>
       </w:pPr>
       <w:r>
-        <w:t>inner tolerance rule (CENIC eq. 34), https://github.com/mardigiorgio/icra2027/blob/c0279e47d8fe/part1/bench/four_arms.py#L48</w:t>
+        <w:t>inner tolerance rule (CENIC eq. 34), https://github.com/mardigiorgio/icra2027/blob/1edc6a523a/part1/bench/four_arms.py#L48</w:t>
       </w:r>
     </w:p>
     <w:p>
@@ -480,7 +488,7 @@
         <w:pStyle w:val="ListBullet"/>
       </w:pPr>
       <w:r>
-        <w:t>contact budgets (&gt;= 2x measured demand), https://github.com/mardigiorgio/icra2027/blob/c0279e47d8fe/part1/bench/four_arms.py#L62-L64</w:t>
+        <w:t>contact budgets (&gt;= 2x measured demand), https://github.com/mardigiorgio/icra2027/blob/1edc6a523a/part1/bench/four_arms.py#L62-L64</w:t>
       </w:r>
     </w:p>
     <w:p>
@@ -599,6 +607,14 @@
       </w:r>
     </w:p>
     <w:p>
+      <w:pPr>
+        <w:pStyle w:val="ListBullet"/>
+      </w:pPr>
+      <w:r>
+        <w:t>Status (2026-09-03): all four arms re-measured with the ICF arms on the optimized solver (icf_warp perf/contact-solve 543879b: block-structured Hessian assembly, march compaction, block-sparse Cholesky); the MuJoCo arms, whose code did not change, reproduce the previous run within 2% (e.g. MuJoCo fixed at 2^13: 102.3 vs 102.4 ms per boundary), so the ICF movement is the solver change alone</w:t>
+      </w:r>
+    </w:p>
+    <w:p>
       <w:r>
         <w:t>Code:</w:t>
       </w:r>
@@ -608,7 +624,7 @@
         <w:pStyle w:val="ListBullet"/>
       </w:pPr>
       <w:r>
-        <w:t>runner (per-N subprocess), https://github.com/mardigiorgio/icra2027/blob/c0279e47d8fe/part1/bench/benchmarks/part1_scaling.py#L36</w:t>
+        <w:t>runner (per-N subprocess), https://github.com/mardigiorgio/icra2027/blob/1edc6a523a/part1/bench/benchmarks/part1_scaling.py#L36</w:t>
       </w:r>
     </w:p>
     <w:p>
@@ -616,7 +632,7 @@
         <w:pStyle w:val="ListBullet"/>
       </w:pPr>
       <w:r>
-        <w:t>warm-up handling, https://github.com/mardigiorgio/icra2027/blob/c0279e47d8fe/part1/bench/benchmarks/part1_scaling.py#L44-L47</w:t>
+        <w:t>warm-up handling, https://github.com/mardigiorgio/icra2027/blob/1edc6a523a/part1/bench/benchmarks/part1_scaling.py#L44-L47</w:t>
       </w:r>
     </w:p>
     <w:p>
@@ -624,7 +640,7 @@
         <w:pStyle w:val="ListBullet"/>
       </w:pPr>
       <w:r>
-        <w:t>median statistic, https://github.com/mardigiorgio/icra2027/blob/c0279e47d8fe/part1/bench/benchmarks/part1_scaling.py#L72</w:t>
+        <w:t>median statistic, https://github.com/mardigiorgio/icra2027/blob/1edc6a523a/part1/bench/benchmarks/part1_scaling.py#L72</w:t>
       </w:r>
     </w:p>
     <w:p>
@@ -632,7 +648,7 @@
         <w:pStyle w:val="ListBullet"/>
       </w:pPr>
       <w:r>
-        <w:t>defaults: 2 s timed, 0.2 s warm-up, 3 trials, https://github.com/mardigiorgio/icra2027/blob/c0279e47d8fe/part1/bench/benchmarks/part1_scaling.py#L82-L89</w:t>
+        <w:t>defaults: 2 s timed, 0.2 s warm-up, 3 trials, https://github.com/mardigiorgio/icra2027/blob/1edc6a523a/part1/bench/benchmarks/part1_scaling.py#L82-L89</w:t>
       </w:r>
     </w:p>
     <w:p>
@@ -681,7 +697,7 @@
     </w:p>
     <w:p>
       <w:r>
-        <w:t>Figure: wall time for the batch of N worlds to complete the 2 s hard clutter scene, CPU reference (128 cores) vs this work (RTX 5090), both measured to saturation.</w:t>
+        <w:t>Figure: wall time for the batch of N worlds to complete the 2 s hard clutter scene (warm-up to 0.2 s excluded, one makespan over the 20 timed control boundaries, identical protocol on both stacks), CPU reference (128 cores, 96 workers, worlds beyond the cores in sequence) vs this work (RTX 5090), 1024 to 16384 worlds.</w:t>
       </w:r>
     </w:p>
     <w:p>
@@ -734,7 +750,7 @@
         <w:pStyle w:val="ListBullet"/>
       </w:pPr>
       <w:r>
-        <w:t>Varied: number of concurrent worlds, 1 ... 8192, both stacks measured to saturation</w:t>
+        <w:t>Varied: number of concurrent worlds, 1024 ... 16384 (five doublings), both stacks past saturation over the whole range</w:t>
       </w:r>
     </w:p>
     <w:p>
@@ -758,7 +774,7 @@
         <w:pStyle w:val="ListBullet"/>
       </w:pPr>
       <w:r>
-        <w:t>Measured result (seconds to complete the scene): CPU 0.86 at 1 world, 4.6 at 256, then linear at 14.6 ms per world: 16 at 1024, 31 at 2048, 60 at 4096, 120 at 8192; GPU 1.0 at 1 world, 20 at 1024, 64 at 2048, 245 at 8192, linear at about 30 ms per world from 2^10; the two saturated slopes are parallel, CPU about 2x below at every N</w:t>
+        <w:t>Measured result (seconds to complete the scene, CPU / GPU): 1024: 15.9 / 15.6; 2048: 31.0 / 24.8; 4096: 60.2 / 42.5; 8192: 119.6 / 79.1; 16384: 234.5 / 147.9. Both linear past saturation: CPU 14.2 ms per added world, GPU 8.6 ms per added world (1.67x lower); the lines cross at about 1000 worlds and the GPU/CPU ratio keeps falling with N (0.98x at 1024, 0.63x at 16384)</w:t>
       </w:r>
     </w:p>
     <w:p>
@@ -766,7 +782,7 @@
         <w:pStyle w:val="ListBullet"/>
       </w:pPr>
       <w:r>
-        <w:t>Control on the same GPU: the MuJoCo error-controlled march completes at 5.6 ms per world-scene at 8192 worlds, 2.6x below the 128-core CPU: the gap between the curves is this ICF march implementation's per-step cost (narrow phase dominates its profile), not the hardware</w:t>
+        <w:t>Solver state for these numbers: icf_warp_adaptive branch perf/contact-solve at 543879b (block-structured assembly on the free-body layout, 24-dof block-sparse Cholesky, narrow-tail march compaction ICF_MARCH_COMPACT=1); physics unchanged (64-world oracle inside the run-to-run envelope, zero solve failures). Before this work the GPU arm cost about 30 ms per added world, 2.1x the CPU, with no crossover</w:t>
       </w:r>
     </w:p>
     <w:p>
@@ -811,7 +827,15 @@
         <w:pStyle w:val="ListBullet"/>
       </w:pPr>
       <w:r>
-        <w:t>GPU-side runner (Experiment 3 data), https://github.com/mardigiorgio/icra2027/blob/c0279e47d8fe/part1/bench/benchmarks/part1_scaling.py#L36</w:t>
+        <w:t>GPU arm on the same protocol (warm-up, timed window, makespan), https://github.com/mardigiorgio/icra2027/blob/1edc6a523a/part1/bench/benchmarks/part1_gpu_fair.py#L1-L40</w:t>
+      </w:r>
+    </w:p>
+    <w:p>
+      <w:pPr>
+        <w:pStyle w:val="ListBullet"/>
+      </w:pPr>
+      <w:r>
+        <w:t>Both ladders, one row per N with the solver commit, https://github.com/mardigiorgio/icra2027/blob/1edc6a523a/part1/bench/results/part1_gpu_fair_ladder.csv and https://github.com/mardigiorgio/icra2027/blob/1edc6a523a/part1/bench/results/part1_cenic_cpu.csv</w:t>
       </w:r>
     </w:p>
     <w:sectPr>

</xml_diff>

<commit_message>
Exp 4 ladder at every N on e2f39c4; march budget 16384
The fair-protocol GPU ladder now has one cell per N from 1 to 16384
on one solver commit (the plot keeps only rows of the newest commit),
so the figure shows the sublinear GPU region below the crossover as
well as the saturated linear region above it. Exponents 128 to 1024:
CPU 0.80, GPU 0.34; 4096 to 16384: CPU 0.98, GPU 0.90; crossover at
about 1000 worlds, GPU/CPU 0.63x at 16384.

The work-precision bench's march budget rises from 4096 to 16384
substeps per 0.1 s boundary for every arm. At eps = 1e-6 on hard
clutter the ICF EC arm needs between 4096 and 16384 in the impact
phase and, allowed to, completes at 12.4 s per simulated second (both
16384 and 65536 tried, no world exhausted); at 4096 the flag reported
the cap, not the solver.

Claude-Session: https://claude.ai/code/session_015jwxLQxXKy7cte15GEu79P
</commit_message>
<xml_diff>
--- a/part1/bench/results/P1_core_experiments.docx
+++ b/part1/bench/results/P1_core_experiments.docx
@@ -435,7 +435,7 @@
         <w:pStyle w:val="ListBullet"/>
       </w:pPr>
       <w:r>
-        <w:t>Held: scene geometry, masses, friction, δt_max = 0.1 s, march budget</w:t>
+        <w:t>Held: scene geometry, masses, friction, δt_max = 0.1 s, march budget of 16384 substeps per 0.1 s boundary for every arm (raised from 4096 on 2026-09-03: at ε = 1e-6 on hard clutter the ICF EC arm needs between 4096 and 16384 substeps in the impact phase and completes at 12.4 s per simulated second once allowed to; no arm is limited at 16384)</w:t>
       </w:r>
     </w:p>
     <w:p>
@@ -734,7 +734,7 @@
         <w:pStyle w:val="ListBullet"/>
       </w:pPr>
       <w:r>
-        <w:t>GPU arm: Newton/Warp CENIC (ICF EC), batched worlds; Experiment 3 scaling data plus dedicated cells at N = 1 ... 32 so both stacks share every x point</w:t>
+        <w:t>GPU arm: Newton/Warp CENIC (ICF EC), batched worlds, one fair-protocol cell per N so both stacks share every x point</w:t>
       </w:r>
     </w:p>
     <w:p>
@@ -750,7 +750,7 @@
         <w:pStyle w:val="ListBullet"/>
       </w:pPr>
       <w:r>
-        <w:t>Varied: number of concurrent worlds, 1024 ... 16384 (five doublings), both stacks past saturation over the whole range</w:t>
+        <w:t>Varied: number of concurrent worlds, 1 ... 16384 (fourteen doublings); the CPU is past its 128 cores from N = 128, the GPU saturates between 2048 and 4096</w:t>
       </w:r>
     </w:p>
     <w:p>
@@ -774,7 +774,7 @@
         <w:pStyle w:val="ListBullet"/>
       </w:pPr>
       <w:r>
-        <w:t>Measured result (seconds to complete the scene, CPU / GPU): 1024: 15.9 / 15.6; 2048: 31.0 / 24.8; 4096: 60.2 / 42.5; 8192: 119.6 / 79.1; 16384: 234.5 / 147.9. Both linear past saturation: CPU 14.2 ms per added world, GPU 8.6 ms per added world (1.67x lower); the lines cross at about 1000 worlds and the GPU/CPU ratio keeps falling with N (0.98x at 1024, 0.63x at 16384)</w:t>
+        <w:t>Measured result (seconds to complete the scene, CPU / GPU): 1: 0.86 / 1.2; 64: 1.6 / 6.3; 128: 3.0 / 7.7; 256: 4.6 / 9.1; 512: 8.5 / 11.4; 1024: 15.9 / 15.6; 2048: 31.0 / 25.1; 4096: 60.2 / 42.7; 8192: 119.6 / 77.5; 16384: 234.5 / 147.6. Scaling exponents (slope of log wall vs log N): 128 to 1024, CPU 0.80 vs GPU 0.34; 1024 to 4096, CPU 0.96 vs GPU 0.73; 4096 to 16384, CPU 0.98 vs GPU 0.90. The lines cross at about 1000 worlds; past saturation both are linear with the GPU at 9.0 ms per added world against the CPU's 14.2 (GPU/CPU 0.63x at 16384)</w:t>
       </w:r>
     </w:p>
     <w:p>
@@ -782,7 +782,7 @@
         <w:pStyle w:val="ListBullet"/>
       </w:pPr>
       <w:r>
-        <w:t>Solver state for these numbers: icf_warp_adaptive branch perf/contact-solve at 543879b (block-structured assembly on the free-body layout, 24-dof block-sparse Cholesky, narrow-tail march compaction ICF_MARCH_COMPACT=1); physics unchanged (64-world oracle inside the run-to-run envelope, zero solve failures). Before this work the GPU arm cost about 30 ms per added world, 2.1x the CPU, with no crossover</w:t>
+        <w:t>Solver state for these numbers: icf_warp_adaptive branch perf/contact-solve at e2f39c4 (block-structured assembly on the free-body layout, 24-dof block-sparse Cholesky, narrow-tail march compaction ICF_MARCH_COMPACT=1, exact per-iteration launch folds); physics unchanged (64-world oracle inside the run-to-run envelope, zero solve failures). Before this work the GPU arm cost about 30 ms per added world, 2.1x the CPU, with no crossover</w:t>
       </w:r>
     </w:p>
     <w:p>
@@ -790,7 +790,7 @@
         <w:pStyle w:val="ListBullet"/>
       </w:pPr>
       <w:r>
-        <w:t>Reading: on this host pair the CPU reference stays about 2x below this GPU implementation at all N; the same card beats the CPU with a cheaper per-step march, so the gap is implementation headroom, which is the paper's speed-optimization contribution surface; the GPU case additionally rests on co-residence with the learner (no PCIe state transfer in the training loop)</w:t>
+        <w:t>Reading: below about a thousand worlds the CPU reference is faster in absolute terms while the GPU is the sublinear one (exponent 0.34 against the CPU's 0.80 from 128 to 1024); above it the GPU is faster and the ratio keeps falling with N, but both are linear once the card saturates, so the asymptotic claim is a 1.6x per-world throughput advantage over a 128-core host, not a flatter curve. Pushing the GPU's saturation point out (fewer lockstep Newton trips, fused per-world kernels, less memory traffic per world) is the remaining implementation headroom; the GPU case additionally rests on co-residence with the learner (no PCIe state transfer in the training loop)</w:t>
       </w:r>
     </w:p>
     <w:p>

</xml_diff>

<commit_message>
Doc: per-row solver provenance for Exp 2 and Exp 3
Claude-Session: https://claude.ai/code/session_015jwxLQxXKy7cte15GEu79P
</commit_message>
<xml_diff>
--- a/part1/bench/results/P1_core_experiments.docx
+++ b/part1/bench/results/P1_core_experiments.docx
@@ -443,7 +443,7 @@
         <w:pStyle w:val="ListBullet"/>
       </w:pPr>
       <w:r>
-        <w:t>Status (2026-09-03): the N = 1 rows were re-measured on the optimized ICF solver (icf_warp perf/contact-solve 543879b); the N = 1024 rows still come from the pre-optimization solver and are queued for re-measurement, so the ICF EC curve at N = 1024 overstates its cost</w:t>
+        <w:t>Status (2026-09-03): both rows re-measured on the optimized ICF solver at the 16384 march budget; the N = 1 rows on icf_warp perf/contact-solve e2f39c4, the N = 1024 rows on 0fca334 (the two differ by exact launch folds and a once-per-solve Jacobian pack, at most a few percent of wall time)</w:t>
       </w:r>
     </w:p>
     <w:p>
@@ -611,7 +611,7 @@
         <w:pStyle w:val="ListBullet"/>
       </w:pPr>
       <w:r>
-        <w:t>Status (2026-09-03): all four arms re-measured with the ICF arms on the optimized solver (icf_warp perf/contact-solve 543879b: block-structured Hessian assembly, march compaction, block-sparse Cholesky); the MuJoCo arms, whose code did not change, reproduce the previous run within 2% (e.g. MuJoCo fixed at 2^13: 102.3 vs 102.4 ms per boundary), so the ICF movement is the solver change alone</w:t>
+        <w:t>Status (2026-09-03): all four arms re-measured with the ICF arms on the optimized solver (icf_warp perf/contact-solve 1f2ab5e: block-structured Hessian assembly, march compaction, block-sparse Cholesky; this predates the final build 0fca334 used for Exp 4, which is up to ~8% faster at the largest N); the MuJoCo arms, whose code did not change, reproduce the previous run within 2% (e.g. MuJoCo fixed at 2^13: 102.3 vs 102.4 ms per boundary), so the ICF movement is the solver change alone</w:t>
       </w:r>
     </w:p>
     <w:p>

</xml_diff>

<commit_message>
Part 1 clutter scenes are the 8-body variants; 20-body results kept as *_20
Marco's ruling (2026-09-03): per-world contact cost sets every Part-1
axis, so the paper's clutter scenes are two lattice layers (soft: 8
spheres; hard: 4 spheres + 4 cubes). CLUTTER_LAYERS = 2 makes them the
canonical "soft-clutter" / "hard-clutter"; the 20-body originals stay
reachable as "soft-clutter-20" / "hard-clutter-20" and their result
files move to *_20.csv (the Exp-4 8-body ladders take the canonical
file names). The CPU bench defaults to two layers as well. Every
experiment is re-measured on the 8-body scenes next.

Claude-Session: https://claude.ai/code/session_015jwxLQxXKy7cte15GEu79P
</commit_message>
<xml_diff>
--- a/part1/bench/results/P1_core_experiments.docx
+++ b/part1/bench/results/P1_core_experiments.docx
@@ -663,7 +663,7 @@
       <w:r>
         <w:drawing>
           <wp:inline xmlns:a="http://schemas.openxmlformats.org/drawingml/2006/main" xmlns:pic="http://schemas.openxmlformats.org/drawingml/2006/picture">
-            <wp:extent cx="5669280" cy="2011679"/>
+            <wp:extent cx="5669280" cy="3982879"/>
             <wp:docPr id="7" name="Picture 7"/>
             <wp:cNvGraphicFramePr>
               <a:graphicFrameLocks noChangeAspect="1"/>
@@ -684,7 +684,7 @@
                   <pic:spPr>
                     <a:xfrm>
                       <a:off x="0" y="0"/>
-                      <a:ext cx="5669280" cy="2011679"/>
+                      <a:ext cx="5669280" cy="3982879"/>
                     </a:xfrm>
                     <a:prstGeom prst="rect"/>
                   </pic:spPr>
@@ -697,7 +697,7 @@
     </w:p>
     <w:p>
       <w:r>
-        <w:t>Figure: wall time for the batch of N worlds to complete the 2 s scene (warm-up to 0.2 s excluded, one makespan over the 20 timed control boundaries, identical protocol on both stacks), CPU reference (128 cores, 96 workers, worlds beyond the cores in sequence) vs this work (RTX 5090). (a) the paper's hard clutter, 20 bodies; (b) the same scene at two lattice layers, 8 bodies, both stacks drawing the same first eight bodies from the same seeded stream.</w:t>
+        <w:t>Figure: wall time for the batch of N worlds to complete the 2 s scene (warm-up to 0.2 s excluded, one makespan over the 20 timed control boundaries, identical protocol on both stacks), CPU reference (128 cores, 96 workers, worlds beyond the cores in sequence) vs this work (RTX 5090). Scene: hard clutter at two lattice layers, 8 bodies (4 spheres + 4 cubes), both stacks drawing the same bodies from the same seeded stream.</w:t>
       </w:r>
     </w:p>
     <w:p>
@@ -742,7 +742,7 @@
         <w:pStyle w:val="ListBullet"/>
       </w:pPr>
       <w:r>
-        <w:t>Scenes: (a) hard clutter, 20 bodies; (b) hard clutter at 2 lattice layers, 8 bodies (4 spheres + 4 cubes; part1/scenes/clutter_lattice.py `layers`, SCENES['hard-clutter-8']). Both stacks import the same lattice generator, world i seeded identically, so CPU and GPU integrate identical randomized world sets in both panels</w:t>
+        <w:t>Scene: hard clutter at 2 lattice layers, 8 bodies (4 spheres + 4 cubes; part1/scenes/clutter_lattice.py `layers`, SCENES['hard-clutter-8'], contact constants as in Experiment 2). Both stacks import the same lattice generator, world i seeded identically, so CPU and GPU integrate identical randomized world sets</w:t>
       </w:r>
     </w:p>
     <w:p>
@@ -750,7 +750,7 @@
         <w:pStyle w:val="ListBullet"/>
       </w:pPr>
       <w:r>
-        <w:t>Varied: number of concurrent worlds, 1 ... 16384 (fourteen doublings) in both panels; the CPU is past its 128 cores from N = 128; the GPU saturates between 2048 and 4096 on 20 bodies and is still sublinear at 16384 on 8 bodies</w:t>
+        <w:t>Varied: number of concurrent worlds, 1 ... 16384 (fourteen doublings); the CPU is past its 128 cores from N = 128; the GPU is still sublinear at 16384</w:t>
       </w:r>
     </w:p>
     <w:p>
@@ -774,15 +774,7 @@
         <w:pStyle w:val="ListBullet"/>
       </w:pPr>
       <w:r>
-        <w:t>Measured result (a), 20 bodies (seconds to complete the scene, CPU / GPU): 1: 0.86 / 1.2; 64: 1.6 / 6.3; 128: 3.0 / 7.7; 256: 4.6 / 9.1; 512: 8.5 / 11.4; 1024: 15.9 / 15.6; 2048: 31.0 / 25.1; 4096: 60.2 / 42.7; 8192: 119.6 / 73.5; 16384: 234.5 / 137.2. Exponents (slope of log wall vs log N) 128 to 1024: CPU 0.80 vs GPU 0.34; 4096 to 16384: CPU 0.98 vs GPU 0.90. Crossover at about 1000 worlds; saturated per-world cost GPU 8.4 ms vs CPU 14.2 ms (0.59x at 16384)</w:t>
-      </w:r>
-    </w:p>
-    <w:p>
-      <w:pPr>
-        <w:pStyle w:val="ListBullet"/>
-      </w:pPr>
-      <w:r>
-        <w:t>Measured result (b), 8 bodies (CPU / GPU): 1: 0.24 / 0.1; 64: 0.38 / 0.4; 128: 0.54 / 0.5; 256: 0.77 / 0.7; 512: 1.38 / 0.8; 1024: 2.40 / 1.0; 2048: 4.44 / 1.3; 4096: 8.58 / 1.9; 8192: 16.5 / 3.0; 16384: 33.0 / 5.5. The GPU is at or below the CPU at every N, 6.0x faster at 16384, and still sublinear there (exponent 4096 to 16384: GPU 0.77 vs CPU 0.94); saturated per-world cost GPU 0.34 ms vs CPU 2.0 ms</w:t>
+        <w:t>Measured result (seconds to complete the scene, CPU / GPU): 1: 0.24 / 0.11; 2: 0.27 / 0.2; 4: 0.29 / 0.2; 8: 0.30 / 0.2; 16: 0.34 / 0.3; 32: 0.37 / 0.3; 64: 0.38 / 0.4; 128: 0.54 / 0.5; 256: 0.77 / 0.7; 512: 1.38 / 0.8; 1024: 2.40 / 1.0; 2048: 4.44 / 1.3; 4096: 8.58 / 1.9; 8192: 16.5 / 3.0; 16384: 33.0 / 5.5. The GPU is at or below the CPU at every N, 6.0x faster at 16384, and still sublinear there (exponent 4096 to 16384: GPU 0.77 vs CPU 0.94); saturated per-world cost GPU 0.34 ms vs CPU 2.0 ms</w:t>
       </w:r>
     </w:p>
     <w:p>
@@ -798,7 +790,7 @@
         <w:pStyle w:val="ListBullet"/>
       </w:pPr>
       <w:r>
-        <w:t>Reading: per-world work sets the whole picture. On the 20-body pile (120 dofs, up to 210 contact patches per world, a long lockstep tail) the card saturates near 2k worlds, so the GPU is faster only above the ~1000-world crossover and by 1.7x per world once both stacks are linear. Cutting the scene to 8 bodies lowers the GPU's per-world cost 25x but the CPU's only 7x (contact count grows faster than body count), so on that scene the GPU is faster at every N and pulls away with N. The GPU case additionally rests on co-residence with the learner (no PCIe state transfer in the training loop)</w:t>
+        <w:t>Reading: below 128 worlds both stacks are latency-bound (one world's march is a serial chain on either machine) and the wall time is set by per-step overhead; from 128 worlds the CPU runs worlds in sequence on its cores and grows linearly, while the GPU adds worlds at a fraction of a millisecond each until the card saturates. The GPU case additionally rests on co-residence with the learner (no PCIe state transfer in the training loop)</w:t>
       </w:r>
     </w:p>
     <w:p>

</xml_diff>

<commit_message>
Interim Part-1 doc on the 8-body scenes: captures, Exp 2 N=1, Exp 4
Figures are gated on freshness (postdating the scene switch); a stale one
is replaced by a pending line until its rerun lands, and the build is
stamped.

Claude-Session: https://claude.ai/code/session_015jwxLQxXKy7cte15GEu79P
</commit_message>
<xml_diff>
--- a/part1/bench/results/P1_core_experiments.docx
+++ b/part1/bench/results/P1_core_experiments.docx
@@ -8,6 +8,11 @@
       </w:pPr>
       <w:r>
         <w:t>Part 1, core experiments (design)</w:t>
+      </w:r>
+    </w:p>
+    <w:p>
+      <w:r>
+        <w:t>Build 2026-09-03 21:13. Every experiment is being re-measured on the 8-body clutter scenes (Marco, 2026-09-03) with the current solver; figures marked pending are still running and this document is redelivered as they land.</w:t>
       </w:r>
     </w:p>
     <w:p>
@@ -122,38 +127,12 @@
     </w:p>
     <w:p>
       <w:r>
-        <w:drawing>
-          <wp:inline xmlns:a="http://schemas.openxmlformats.org/drawingml/2006/main" xmlns:pic="http://schemas.openxmlformats.org/drawingml/2006/picture">
-            <wp:extent cx="5669280" cy="2726251"/>
-            <wp:docPr id="2" name="Picture 2"/>
-            <wp:cNvGraphicFramePr>
-              <a:graphicFrameLocks noChangeAspect="1"/>
-            </wp:cNvGraphicFramePr>
-            <a:graphic>
-              <a:graphicData uri="http://schemas.openxmlformats.org/drawingml/2006/picture">
-                <pic:pic>
-                  <pic:nvPicPr>
-                    <pic:cNvPr id="0" name="stiffness_sweep.png"/>
-                    <pic:cNvPicPr/>
-                  </pic:nvPicPr>
-                  <pic:blipFill>
-                    <a:blip r:embed="rId10"/>
-                    <a:stretch>
-                      <a:fillRect/>
-                    </a:stretch>
-                  </pic:blipFill>
-                  <pic:spPr>
-                    <a:xfrm>
-                      <a:off x="0" y="0"/>
-                      <a:ext cx="5669280" cy="2726251"/>
-                    </a:xfrm>
-                    <a:prstGeom prst="rect"/>
-                  </pic:spPr>
-                </pic:pic>
-              </a:graphicData>
-            </a:graphic>
-          </wp:inline>
-        </w:drawing>
+        <w:t>[figure stiffness_sweep.png pending: its rerun on the 8-body scenes is in progress and replaces this line when done]</w:t>
+      </w:r>
+    </w:p>
+    <w:p>
+      <w:r>
+        <w:t>Status (2026-09-03, evening): re-run on icf_warp perf/contact-solve 0fca334; the scene is the single stiffness sphere and did not change.</w:t>
       </w:r>
     </w:p>
     <w:p>
@@ -275,6 +254,47 @@
         <w:drawing>
           <wp:inline xmlns:a="http://schemas.openxmlformats.org/drawingml/2006/main" xmlns:pic="http://schemas.openxmlformats.org/drawingml/2006/picture">
             <wp:extent cx="4937760" cy="1894974"/>
+            <wp:docPr id="2" name="Picture 2"/>
+            <wp:cNvGraphicFramePr>
+              <a:graphicFrameLocks noChangeAspect="1"/>
+            </wp:cNvGraphicFramePr>
+            <a:graphic>
+              <a:graphicData uri="http://schemas.openxmlformats.org/drawingml/2006/picture">
+                <pic:pic>
+                  <pic:nvPicPr>
+                    <pic:cNvPr id="0" name="capture_soft_clutter.png"/>
+                    <pic:cNvPicPr/>
+                  </pic:nvPicPr>
+                  <pic:blipFill>
+                    <a:blip r:embed="rId10"/>
+                    <a:stretch>
+                      <a:fillRect/>
+                    </a:stretch>
+                  </pic:blipFill>
+                  <pic:spPr>
+                    <a:xfrm>
+                      <a:off x="0" y="0"/>
+                      <a:ext cx="4937760" cy="1894974"/>
+                    </a:xfrm>
+                    <a:prstGeom prst="rect"/>
+                  </pic:spPr>
+                </pic:pic>
+              </a:graphicData>
+            </a:graphic>
+          </wp:inline>
+        </w:drawing>
+      </w:r>
+    </w:p>
+    <w:p>
+      <w:r>
+        <w:t>Soft clutter (8 spheres), world 0 (Newton viewer): t = 0 left, settled at 1.5 s right.</w:t>
+      </w:r>
+    </w:p>
+    <w:p>
+      <w:r>
+        <w:drawing>
+          <wp:inline xmlns:a="http://schemas.openxmlformats.org/drawingml/2006/main" xmlns:pic="http://schemas.openxmlformats.org/drawingml/2006/picture">
+            <wp:extent cx="4937760" cy="1894974"/>
             <wp:docPr id="3" name="Picture 3"/>
             <wp:cNvGraphicFramePr>
               <a:graphicFrameLocks noChangeAspect="1"/>
@@ -283,7 +303,7 @@
               <a:graphicData uri="http://schemas.openxmlformats.org/drawingml/2006/picture">
                 <pic:pic>
                   <pic:nvPicPr>
-                    <pic:cNvPr id="0" name="capture_soft_clutter.png"/>
+                    <pic:cNvPr id="0" name="capture_hard_clutter.png"/>
                     <pic:cNvPicPr/>
                   </pic:nvPicPr>
                   <pic:blipFill>
@@ -308,14 +328,14 @@
     </w:p>
     <w:p>
       <w:r>
-        <w:t>Soft clutter, world 0 (Newton viewer): t = 0 left, settled at 1.5 s right.</w:t>
+        <w:t>Hard clutter (4 spheres + 4 cubes), world 0 (Newton viewer): t = 0 left, settled at 1.5 s right.</w:t>
       </w:r>
     </w:p>
     <w:p>
       <w:r>
         <w:drawing>
           <wp:inline xmlns:a="http://schemas.openxmlformats.org/drawingml/2006/main" xmlns:pic="http://schemas.openxmlformats.org/drawingml/2006/picture">
-            <wp:extent cx="4937760" cy="1894974"/>
+            <wp:extent cx="5669280" cy="2336689"/>
             <wp:docPr id="4" name="Picture 4"/>
             <wp:cNvGraphicFramePr>
               <a:graphicFrameLocks noChangeAspect="1"/>
@@ -324,7 +344,7 @@
               <a:graphicData uri="http://schemas.openxmlformats.org/drawingml/2006/picture">
                 <pic:pic>
                   <pic:nvPicPr>
-                    <pic:cNvPr id="0" name="capture_hard_clutter.png"/>
+                    <pic:cNvPr id="0" name="workprecision.png"/>
                     <pic:cNvPicPr/>
                   </pic:nvPicPr>
                   <pic:blipFill>
@@ -336,48 +356,7 @@
                   <pic:spPr>
                     <a:xfrm>
                       <a:off x="0" y="0"/>
-                      <a:ext cx="4937760" cy="1894974"/>
-                    </a:xfrm>
-                    <a:prstGeom prst="rect"/>
-                  </pic:spPr>
-                </pic:pic>
-              </a:graphicData>
-            </a:graphic>
-          </wp:inline>
-        </w:drawing>
-      </w:r>
-    </w:p>
-    <w:p>
-      <w:r>
-        <w:t>Hard clutter, world 0 (Newton viewer): t = 0 left, settled at 1.5 s right.</w:t>
-      </w:r>
-    </w:p>
-    <w:p>
-      <w:r>
-        <w:drawing>
-          <wp:inline xmlns:a="http://schemas.openxmlformats.org/drawingml/2006/main" xmlns:pic="http://schemas.openxmlformats.org/drawingml/2006/picture">
-            <wp:extent cx="5669280" cy="4584250"/>
-            <wp:docPr id="5" name="Picture 5"/>
-            <wp:cNvGraphicFramePr>
-              <a:graphicFrameLocks noChangeAspect="1"/>
-            </wp:cNvGraphicFramePr>
-            <a:graphic>
-              <a:graphicData uri="http://schemas.openxmlformats.org/drawingml/2006/picture">
-                <pic:pic>
-                  <pic:nvPicPr>
-                    <pic:cNvPr id="0" name="workprecision.png"/>
-                    <pic:cNvPicPr/>
-                  </pic:nvPicPr>
-                  <pic:blipFill>
-                    <a:blip r:embed="rId13"/>
-                    <a:stretch>
-                      <a:fillRect/>
-                    </a:stretch>
-                  </pic:blipFill>
-                  <pic:spPr>
-                    <a:xfrm>
-                      <a:off x="0" y="0"/>
-                      <a:ext cx="5669280" cy="4584250"/>
+                      <a:ext cx="5669280" cy="2336689"/>
                     </a:xfrm>
                     <a:prstGeom prst="rect"/>
                   </pic:spPr>
@@ -403,7 +382,7 @@
         <w:pStyle w:val="ListBullet"/>
       </w:pPr>
       <w:r>
-        <w:t>Scenes: soft clutter (20 spheres, k = 1,000 N/m) and hard clutter (10 spheres + 10 cubes, k = 100,000 N/m), dropped into a 30 cm bin; each world its own randomized non-overlapping lattice; 2 s horizon</w:t>
+        <w:t>Scenes (Marco's ruling 2026-09-03: two lattice layers, 8 bodies, since per-world contact cost sets every axis here): soft clutter (8 spheres, k = 1,000 N/m) and hard clutter (4 spheres + 4 cubes, k = 100,000 N/m), dropped into a 30 cm bin; each world its own randomized non-overlapping lattice (the first 8 bodies of the original 20-body stream); 2 s horizon</w:t>
       </w:r>
     </w:p>
     <w:p>
@@ -443,7 +422,7 @@
         <w:pStyle w:val="ListBullet"/>
       </w:pPr>
       <w:r>
-        <w:t>Status (2026-09-03): both rows re-measured on the optimized ICF solver at the 16384 march budget; the N = 1 rows on icf_warp perf/contact-solve e2f39c4, the N = 1024 rows on 0fca334 (the two differ by exact launch folds and a once-per-solve Jacobian pack, at most a few percent of wall time)</w:t>
+        <w:t>Status (2026-09-03, evening): both rows measured on the 8-body scenes with the ICF arms on icf_warp perf/contact-solve 0fca334 at the 16384 march budget; the 20-body results of the same day are kept as *_20.csv</w:t>
       </w:r>
     </w:p>
     <w:p>
@@ -522,38 +501,7 @@
     </w:p>
     <w:p>
       <w:r>
-        <w:drawing>
-          <wp:inline xmlns:a="http://schemas.openxmlformats.org/drawingml/2006/main" xmlns:pic="http://schemas.openxmlformats.org/drawingml/2006/picture">
-            <wp:extent cx="5669280" cy="4127317"/>
-            <wp:docPr id="6" name="Picture 6"/>
-            <wp:cNvGraphicFramePr>
-              <a:graphicFrameLocks noChangeAspect="1"/>
-            </wp:cNvGraphicFramePr>
-            <a:graphic>
-              <a:graphicData uri="http://schemas.openxmlformats.org/drawingml/2006/picture">
-                <pic:pic>
-                  <pic:nvPicPr>
-                    <pic:cNvPr id="0" name="scaling_hard-clutter.png"/>
-                    <pic:cNvPicPr/>
-                  </pic:nvPicPr>
-                  <pic:blipFill>
-                    <a:blip r:embed="rId14"/>
-                    <a:stretch>
-                      <a:fillRect/>
-                    </a:stretch>
-                  </pic:blipFill>
-                  <pic:spPr>
-                    <a:xfrm>
-                      <a:off x="0" y="0"/>
-                      <a:ext cx="5669280" cy="4127317"/>
-                    </a:xfrm>
-                    <a:prstGeom prst="rect"/>
-                  </pic:spPr>
-                </pic:pic>
-              </a:graphicData>
-            </a:graphic>
-          </wp:inline>
-        </w:drawing>
+        <w:t>[figure scaling_hard-clutter.png pending: its rerun on the 8-body scenes is in progress and replaces this line when done]</w:t>
       </w:r>
     </w:p>
     <w:p>
@@ -611,7 +559,7 @@
         <w:pStyle w:val="ListBullet"/>
       </w:pPr>
       <w:r>
-        <w:t>Status (2026-09-03): all four arms re-measured with the ICF arms on the optimized solver (icf_warp perf/contact-solve 1f2ab5e: block-structured Hessian assembly, march compaction, block-sparse Cholesky; this predates the final build 0fca334 used for Exp 4, which is up to ~8% faster at the largest N); the MuJoCo arms, whose code did not change, reproduce the previous run within 2% (e.g. MuJoCo fixed at 2^13: 102.3 vs 102.4 ms per boundary), so the ICF movement is the solver change alone</w:t>
+        <w:t>Status (2026-09-03, evening): all four arms measured on the 8-body hard clutter with the ICF arms on icf_warp perf/contact-solve 0fca334; the 20-body results of the same day are kept as part1_scaling_*_20.csv</w:t>
       </w:r>
     </w:p>
     <w:p>
@@ -664,7 +612,7 @@
         <w:drawing>
           <wp:inline xmlns:a="http://schemas.openxmlformats.org/drawingml/2006/main" xmlns:pic="http://schemas.openxmlformats.org/drawingml/2006/picture">
             <wp:extent cx="5669280" cy="3982879"/>
-            <wp:docPr id="7" name="Picture 7"/>
+            <wp:docPr id="5" name="Picture 5"/>
             <wp:cNvGraphicFramePr>
               <a:graphicFrameLocks noChangeAspect="1"/>
             </wp:cNvGraphicFramePr>
@@ -676,7 +624,7 @@
                     <pic:cNvPicPr/>
                   </pic:nvPicPr>
                   <pic:blipFill>
-                    <a:blip r:embed="rId15"/>
+                    <a:blip r:embed="rId13"/>
                     <a:stretch>
                       <a:fillRect/>
                     </a:stretch>
@@ -697,7 +645,7 @@
     </w:p>
     <w:p>
       <w:r>
-        <w:t>Figure: wall time for the batch of N worlds to complete the 2 s scene (warm-up to 0.2 s excluded, one makespan over the 20 timed control boundaries, identical protocol on both stacks), CPU reference (128 cores, 96 workers, worlds beyond the cores in sequence) vs this work (RTX 5090). Scene: hard clutter at two lattice layers, 8 bodies (4 spheres + 4 cubes), both stacks drawing the same bodies from the same seeded stream.</w:t>
+        <w:t>Figure: wall time for the batch of N worlds to complete the 2 s scene (warm-up to 0.2 s excluded, one makespan over the 20 timed control boundaries, identical protocol on both stacks), CPU reference (128 cores, 96 workers, worlds beyond the cores in sequence) vs this work (RTX 5090). Scene: hard clutter at two lattice layers, 8 bodies, both stacks drawing the same bodies from the same seeded stream. Two GPU curves: the nominal tolerance (solid, eps = 1e-3) and the step-matched one (dashed, eps = 3e-5), see the tolerance note below.</w:t>
       </w:r>
     </w:p>
     <w:p>
@@ -742,7 +690,7 @@
         <w:pStyle w:val="ListBullet"/>
       </w:pPr>
       <w:r>
-        <w:t>Scene: hard clutter at 2 lattice layers, 8 bodies (4 spheres + 4 cubes; part1/scenes/clutter_lattice.py `layers`, SCENES['hard-clutter-8'], contact constants as in Experiment 2). Both stacks import the same lattice generator, world i seeded identically, so CPU and GPU integrate identical randomized world sets</w:t>
+        <w:t>Scene: the hard clutter of Experiment 2 (8 bodies: 4 spheres + 4 cubes, part1/scenes/clutter_lattice.py `layers` = 2). Both stacks import the same lattice generator, world i seeded identically, so CPU and GPU integrate identical randomized world sets</w:t>
       </w:r>
     </w:p>
     <w:p>
@@ -766,7 +714,23 @@
         <w:pStyle w:val="ListBullet"/>
       </w:pPr>
       <w:r>
-        <w:t>Held in both stacks: tolerance eps = 0.001, max step 0.1 s, 0.2 s warm-up then 2 s timed, contact constants (k = 100,000 N/m, Hunt-Crossley 1.0 s/m, friction 0.5, stiction tolerance 0.0001)</w:t>
+        <w:t>Held in both stacks: max step 0.1 s, 0.2 s warm-up then 2 s timed, contact constants (k = 100,000 N/m, Hunt-Crossley 1.0 s/m, friction 0.5, stiction tolerance 0.0001); requested tolerance 0.001 in both stacks for the nominal curves</w:t>
+      </w:r>
+    </w:p>
+    <w:p>
+      <w:pPr>
+        <w:pStyle w:val="ListBullet"/>
+      </w:pPr>
+      <w:r>
+        <w:t>Tolerance note (2026-09-03): the two stacks' accuracy knobs are not the same quantity. Drake's `accuracy` is a relative tolerance on its weighted state norm; this work's eps is an absolute position L-inf tolerance in metres. On world 0 over the 20 timed boundaries, Drake at 0.001 takes 543 steps on the 8-body scene (about 24 per boundary once the pile is at rest, dt near 4 ms) while this work at 0.001 accepts 105 (42, 15, 2, 1, ... : the steps go to the impacts, then the step opens to the 0.1 s cap); both reach the same rest state. The step-matched GPU tolerance, found by sweeping on the same world, is eps = 3e-5 (574 accepted steps; 20-body scene: 3e-4 for 884 vs Drake's 895). The figure therefore shows the GPU at both tolerances; a matched-achieved-error (work-precision) comparison against a reference solution is the principled resolution and is not part of this document</w:t>
+      </w:r>
+    </w:p>
+    <w:p>
+      <w:pPr>
+        <w:pStyle w:val="ListBullet"/>
+      </w:pPr>
+      <w:r>
+        <w:t>CPU bench note (2026-09-03): the lockstep barrier polled its rendezvous files every 5 ms, adding about 0.15 s per run at small N (Drake's own compute on the 8-body world at N = 1 is 0.087 s); polling is now 0.2 ms and the N &lt;= 256 cells of both CPU ladders were re-measured (8-body N = 1: 0.141 s; the remaining gap to 0.087 s is the barrier itself)</w:t>
       </w:r>
     </w:p>
     <w:p>

</xml_diff>

<commit_message>
Exp 3, stiffness sweep and step-matched Exp-4 ladder on the 8-body scenes
Claude-Session: https://claude.ai/code/session_015jwxLQxXKy7cte15GEu79P
</commit_message>
<xml_diff>
--- a/part1/bench/results/P1_core_experiments.docx
+++ b/part1/bench/results/P1_core_experiments.docx
@@ -12,7 +12,7 @@
     </w:p>
     <w:p>
       <w:r>
-        <w:t>Build 2026-09-03 21:13. Every experiment is being re-measured on the 8-body clutter scenes (Marco, 2026-09-03) with the current solver; figures marked pending are still running and this document is redelivered as they land.</w:t>
+        <w:t>Build 2026-09-03 21:27. Every experiment is being re-measured on the 8-body clutter scenes (Marco, 2026-09-03) with the current solver; figures marked pending are still running and this document is redelivered as they land.</w:t>
       </w:r>
     </w:p>
     <w:p>
@@ -127,7 +127,38 @@
     </w:p>
     <w:p>
       <w:r>
-        <w:t>[figure stiffness_sweep.png pending: its rerun on the 8-body scenes is in progress and replaces this line when done]</w:t>
+        <w:drawing>
+          <wp:inline xmlns:a="http://schemas.openxmlformats.org/drawingml/2006/main" xmlns:pic="http://schemas.openxmlformats.org/drawingml/2006/picture">
+            <wp:extent cx="5669280" cy="2726251"/>
+            <wp:docPr id="2" name="Picture 2"/>
+            <wp:cNvGraphicFramePr>
+              <a:graphicFrameLocks noChangeAspect="1"/>
+            </wp:cNvGraphicFramePr>
+            <a:graphic>
+              <a:graphicData uri="http://schemas.openxmlformats.org/drawingml/2006/picture">
+                <pic:pic>
+                  <pic:nvPicPr>
+                    <pic:cNvPr id="0" name="stiffness_sweep.png"/>
+                    <pic:cNvPicPr/>
+                  </pic:nvPicPr>
+                  <pic:blipFill>
+                    <a:blip r:embed="rId10"/>
+                    <a:stretch>
+                      <a:fillRect/>
+                    </a:stretch>
+                  </pic:blipFill>
+                  <pic:spPr>
+                    <a:xfrm>
+                      <a:off x="0" y="0"/>
+                      <a:ext cx="5669280" cy="2726251"/>
+                    </a:xfrm>
+                    <a:prstGeom prst="rect"/>
+                  </pic:spPr>
+                </pic:pic>
+              </a:graphicData>
+            </a:graphic>
+          </wp:inline>
+        </w:drawing>
       </w:r>
     </w:p>
     <w:p>
@@ -254,7 +285,7 @@
         <w:drawing>
           <wp:inline xmlns:a="http://schemas.openxmlformats.org/drawingml/2006/main" xmlns:pic="http://schemas.openxmlformats.org/drawingml/2006/picture">
             <wp:extent cx="4937760" cy="1894974"/>
-            <wp:docPr id="2" name="Picture 2"/>
+            <wp:docPr id="3" name="Picture 3"/>
             <wp:cNvGraphicFramePr>
               <a:graphicFrameLocks noChangeAspect="1"/>
             </wp:cNvGraphicFramePr>
@@ -266,7 +297,7 @@
                     <pic:cNvPicPr/>
                   </pic:nvPicPr>
                   <pic:blipFill>
-                    <a:blip r:embed="rId10"/>
+                    <a:blip r:embed="rId11"/>
                     <a:stretch>
                       <a:fillRect/>
                     </a:stretch>
@@ -295,7 +326,7 @@
         <w:drawing>
           <wp:inline xmlns:a="http://schemas.openxmlformats.org/drawingml/2006/main" xmlns:pic="http://schemas.openxmlformats.org/drawingml/2006/picture">
             <wp:extent cx="4937760" cy="1894974"/>
-            <wp:docPr id="3" name="Picture 3"/>
+            <wp:docPr id="4" name="Picture 4"/>
             <wp:cNvGraphicFramePr>
               <a:graphicFrameLocks noChangeAspect="1"/>
             </wp:cNvGraphicFramePr>
@@ -307,7 +338,7 @@
                     <pic:cNvPicPr/>
                   </pic:nvPicPr>
                   <pic:blipFill>
-                    <a:blip r:embed="rId11"/>
+                    <a:blip r:embed="rId12"/>
                     <a:stretch>
                       <a:fillRect/>
                     </a:stretch>
@@ -336,7 +367,7 @@
         <w:drawing>
           <wp:inline xmlns:a="http://schemas.openxmlformats.org/drawingml/2006/main" xmlns:pic="http://schemas.openxmlformats.org/drawingml/2006/picture">
             <wp:extent cx="5669280" cy="2336689"/>
-            <wp:docPr id="4" name="Picture 4"/>
+            <wp:docPr id="5" name="Picture 5"/>
             <wp:cNvGraphicFramePr>
               <a:graphicFrameLocks noChangeAspect="1"/>
             </wp:cNvGraphicFramePr>
@@ -348,7 +379,7 @@
                     <pic:cNvPicPr/>
                   </pic:nvPicPr>
                   <pic:blipFill>
-                    <a:blip r:embed="rId12"/>
+                    <a:blip r:embed="rId13"/>
                     <a:stretch>
                       <a:fillRect/>
                     </a:stretch>
@@ -501,7 +532,38 @@
     </w:p>
     <w:p>
       <w:r>
-        <w:t>[figure scaling_hard-clutter.png pending: its rerun on the 8-body scenes is in progress and replaces this line when done]</w:t>
+        <w:drawing>
+          <wp:inline xmlns:a="http://schemas.openxmlformats.org/drawingml/2006/main" xmlns:pic="http://schemas.openxmlformats.org/drawingml/2006/picture">
+            <wp:extent cx="5669280" cy="4127317"/>
+            <wp:docPr id="6" name="Picture 6"/>
+            <wp:cNvGraphicFramePr>
+              <a:graphicFrameLocks noChangeAspect="1"/>
+            </wp:cNvGraphicFramePr>
+            <a:graphic>
+              <a:graphicData uri="http://schemas.openxmlformats.org/drawingml/2006/picture">
+                <pic:pic>
+                  <pic:nvPicPr>
+                    <pic:cNvPr id="0" name="scaling_hard-clutter.png"/>
+                    <pic:cNvPicPr/>
+                  </pic:nvPicPr>
+                  <pic:blipFill>
+                    <a:blip r:embed="rId14"/>
+                    <a:stretch>
+                      <a:fillRect/>
+                    </a:stretch>
+                  </pic:blipFill>
+                  <pic:spPr>
+                    <a:xfrm>
+                      <a:off x="0" y="0"/>
+                      <a:ext cx="5669280" cy="4127317"/>
+                    </a:xfrm>
+                    <a:prstGeom prst="rect"/>
+                  </pic:spPr>
+                </pic:pic>
+              </a:graphicData>
+            </a:graphic>
+          </wp:inline>
+        </w:drawing>
       </w:r>
     </w:p>
     <w:p>
@@ -612,7 +674,7 @@
         <w:drawing>
           <wp:inline xmlns:a="http://schemas.openxmlformats.org/drawingml/2006/main" xmlns:pic="http://schemas.openxmlformats.org/drawingml/2006/picture">
             <wp:extent cx="5669280" cy="3982879"/>
-            <wp:docPr id="5" name="Picture 5"/>
+            <wp:docPr id="7" name="Picture 7"/>
             <wp:cNvGraphicFramePr>
               <a:graphicFrameLocks noChangeAspect="1"/>
             </wp:cNvGraphicFramePr>
@@ -624,7 +686,7 @@
                     <pic:cNvPicPr/>
                   </pic:nvPicPr>
                   <pic:blipFill>
-                    <a:blip r:embed="rId13"/>
+                    <a:blip r:embed="rId15"/>
                     <a:stretch>
                       <a:fillRect/>
                     </a:stretch>

</xml_diff>

<commit_message>
Exp 4 at 1e-3 on both stacks only; a scene render under every experiment
Claude-Session: https://claude.ai/code/session_015jwxLQxXKy7cte15GEu79P
</commit_message>
<xml_diff>
--- a/part1/bench/results/P1_core_experiments.docx
+++ b/part1/bench/results/P1_core_experiments.docx
@@ -12,7 +12,7 @@
     </w:p>
     <w:p>
       <w:r>
-        <w:t>Build 2026-09-03 21:27. Every experiment is being re-measured on the 8-body clutter scenes (Marco, 2026-09-03) with the current solver; figures marked pending are still running and this document is redelivered as they land.</w:t>
+        <w:t>Build 2026-09-03 21:33. Every experiment is being re-measured on the 8-body clutter scenes (Marco, 2026-09-03) with the current solver; figures marked pending are still running and this document is redelivered as they land.</w:t>
       </w:r>
     </w:p>
     <w:p>
@@ -366,7 +366,7 @@
       <w:r>
         <w:drawing>
           <wp:inline xmlns:a="http://schemas.openxmlformats.org/drawingml/2006/main" xmlns:pic="http://schemas.openxmlformats.org/drawingml/2006/picture">
-            <wp:extent cx="5669280" cy="2336689"/>
+            <wp:extent cx="5669280" cy="4584250"/>
             <wp:docPr id="5" name="Picture 5"/>
             <wp:cNvGraphicFramePr>
               <a:graphicFrameLocks noChangeAspect="1"/>
@@ -387,7 +387,7 @@
                   <pic:spPr>
                     <a:xfrm>
                       <a:off x="0" y="0"/>
-                      <a:ext cx="5669280" cy="2336689"/>
+                      <a:ext cx="5669280" cy="4584250"/>
                     </a:xfrm>
                     <a:prstGeom prst="rect"/>
                   </pic:spPr>
@@ -527,7 +527,43 @@
     </w:p>
     <w:p>
       <w:r>
-        <w:t>Scene: hard clutter, as captured under Experiment 2.</w:t>
+        <w:drawing>
+          <wp:inline xmlns:a="http://schemas.openxmlformats.org/drawingml/2006/main" xmlns:pic="http://schemas.openxmlformats.org/drawingml/2006/picture">
+            <wp:extent cx="4937760" cy="1894974"/>
+            <wp:docPr id="6" name="Picture 6"/>
+            <wp:cNvGraphicFramePr>
+              <a:graphicFrameLocks noChangeAspect="1"/>
+            </wp:cNvGraphicFramePr>
+            <a:graphic>
+              <a:graphicData uri="http://schemas.openxmlformats.org/drawingml/2006/picture">
+                <pic:pic>
+                  <pic:nvPicPr>
+                    <pic:cNvPr id="0" name="capture_hard_clutter.png"/>
+                    <pic:cNvPicPr/>
+                  </pic:nvPicPr>
+                  <pic:blipFill>
+                    <a:blip r:embed="rId12"/>
+                    <a:stretch>
+                      <a:fillRect/>
+                    </a:stretch>
+                  </pic:blipFill>
+                  <pic:spPr>
+                    <a:xfrm>
+                      <a:off x="0" y="0"/>
+                      <a:ext cx="4937760" cy="1894974"/>
+                    </a:xfrm>
+                    <a:prstGeom prst="rect"/>
+                  </pic:spPr>
+                </pic:pic>
+              </a:graphicData>
+            </a:graphic>
+          </wp:inline>
+        </w:drawing>
+      </w:r>
+    </w:p>
+    <w:p>
+      <w:r>
+        <w:t>Hard clutter (4 spheres + 4 cubes), world 0 (Newton viewer): t = 0 left, settled at 1.5 s right; every world of the batch is its own randomized lattice of this scene.</w:t>
       </w:r>
     </w:p>
     <w:p>
@@ -535,7 +571,7 @@
         <w:drawing>
           <wp:inline xmlns:a="http://schemas.openxmlformats.org/drawingml/2006/main" xmlns:pic="http://schemas.openxmlformats.org/drawingml/2006/picture">
             <wp:extent cx="5669280" cy="4127317"/>
-            <wp:docPr id="6" name="Picture 6"/>
+            <wp:docPr id="7" name="Picture 7"/>
             <wp:cNvGraphicFramePr>
               <a:graphicFrameLocks noChangeAspect="1"/>
             </wp:cNvGraphicFramePr>
@@ -673,8 +709,49 @@
       <w:r>
         <w:drawing>
           <wp:inline xmlns:a="http://schemas.openxmlformats.org/drawingml/2006/main" xmlns:pic="http://schemas.openxmlformats.org/drawingml/2006/picture">
+            <wp:extent cx="4937760" cy="1894974"/>
+            <wp:docPr id="8" name="Picture 8"/>
+            <wp:cNvGraphicFramePr>
+              <a:graphicFrameLocks noChangeAspect="1"/>
+            </wp:cNvGraphicFramePr>
+            <a:graphic>
+              <a:graphicData uri="http://schemas.openxmlformats.org/drawingml/2006/picture">
+                <pic:pic>
+                  <pic:nvPicPr>
+                    <pic:cNvPr id="0" name="capture_hard_clutter.png"/>
+                    <pic:cNvPicPr/>
+                  </pic:nvPicPr>
+                  <pic:blipFill>
+                    <a:blip r:embed="rId12"/>
+                    <a:stretch>
+                      <a:fillRect/>
+                    </a:stretch>
+                  </pic:blipFill>
+                  <pic:spPr>
+                    <a:xfrm>
+                      <a:off x="0" y="0"/>
+                      <a:ext cx="4937760" cy="1894974"/>
+                    </a:xfrm>
+                    <a:prstGeom prst="rect"/>
+                  </pic:spPr>
+                </pic:pic>
+              </a:graphicData>
+            </a:graphic>
+          </wp:inline>
+        </w:drawing>
+      </w:r>
+    </w:p>
+    <w:p>
+      <w:r>
+        <w:t>Hard clutter (4 spheres + 4 cubes), world 0 (Newton viewer): t = 0 left, settled at 1.5 s right; the CPU reference integrates the identical randomized worlds (same lattice generator, same seeds).</w:t>
+      </w:r>
+    </w:p>
+    <w:p>
+      <w:r>
+        <w:drawing>
+          <wp:inline xmlns:a="http://schemas.openxmlformats.org/drawingml/2006/main" xmlns:pic="http://schemas.openxmlformats.org/drawingml/2006/picture">
             <wp:extent cx="5669280" cy="3982879"/>
-            <wp:docPr id="7" name="Picture 7"/>
+            <wp:docPr id="9" name="Picture 9"/>
             <wp:cNvGraphicFramePr>
               <a:graphicFrameLocks noChangeAspect="1"/>
             </wp:cNvGraphicFramePr>
@@ -707,7 +784,7 @@
     </w:p>
     <w:p>
       <w:r>
-        <w:t>Figure: wall time for the batch of N worlds to complete the 2 s scene (warm-up to 0.2 s excluded, one makespan over the 20 timed control boundaries, identical protocol on both stacks), CPU reference (128 cores, 96 workers, worlds beyond the cores in sequence) vs this work (RTX 5090). Scene: hard clutter at two lattice layers, 8 bodies, both stacks drawing the same bodies from the same seeded stream. Two GPU curves: the nominal tolerance (solid, eps = 1e-3) and the step-matched one (dashed, eps = 3e-5), see the tolerance note below.</w:t>
+        <w:t>Figure: wall time for the batch of N worlds to complete the 2 s scene (warm-up to 0.2 s excluded, one makespan over the 20 timed control boundaries, identical protocol on both stacks), CPU reference (128 cores, 96 workers, worlds beyond the cores in sequence) vs this work (RTX 5090), both at requested accuracy 0.001. Scene: the hard clutter of Experiment 2 (8 bodies), both stacks drawing the same bodies from the same seeded stream.</w:t>
       </w:r>
     </w:p>
     <w:p>
@@ -784,7 +861,7 @@
         <w:pStyle w:val="ListBullet"/>
       </w:pPr>
       <w:r>
-        <w:t>Tolerance note (2026-09-03): the two stacks' accuracy knobs are not the same quantity. Drake's `accuracy` is a relative tolerance on its weighted state norm; this work's eps is an absolute position L-inf tolerance in metres. On world 0 over the 20 timed boundaries, Drake at 0.001 takes 543 steps on the 8-body scene (about 24 per boundary once the pile is at rest, dt near 4 ms) while this work at 0.001 accepts 105 (42, 15, 2, 1, ... : the steps go to the impacts, then the step opens to the 0.1 s cap); both reach the same rest state. The step-matched GPU tolerance, found by sweeping on the same world, is eps = 3e-5 (574 accepted steps; 20-body scene: 3e-4 for 884 vs Drake's 895). The figure therefore shows the GPU at both tolerances; a matched-achieved-error (work-precision) comparison against a reference solution is the principled resolution and is not part of this document</w:t>
+        <w:t>Tolerance note: both stacks run at their requested accuracy 0.001. Drake's `accuracy` is a relative tolerance on its weighted state norm; this work's eps is an absolute position L-inf tolerance in metres, so the two controllers take different step counts on the same world (Drake 543 vs this work 105 accepted steps over the 20 timed boundaries of world 0, both reaching the same rest state); the figure compares the two implementations at their own nominal 0.001</w:t>
       </w:r>
     </w:p>
     <w:p>

</xml_diff>

<commit_message>
Exp 4 small N: repeated trials, compute-time makespan for one world per worker
Five GPU and three CPU trials at the small world counts replace the
single measurements (medians in the ladders, ranges in the doc). When
every world has its own worker the CPU bench reports the slowest
world's integration time: the lockstep barrier there only synchronizes
clocks and its file polling (about 55 ms per run) was a harness
artifact that had put the CPU above the GPU at one world. With it gone
the CPU is faster below about 256 worlds, as a serial per-world march
on one core should be, and the curves cross between 256 and 512.

Claude-Session: https://claude.ai/code/session_015jwxLQxXKy7cte15GEu79P
</commit_message>
<xml_diff>
--- a/part1/bench/results/P1_core_experiments.docx
+++ b/part1/bench/results/P1_core_experiments.docx
@@ -12,7 +12,7 @@
     </w:p>
     <w:p>
       <w:r>
-        <w:t>Build 2026-09-03 21:36. Every experiment is being re-measured on the 8-body clutter scenes (Marco, 2026-09-03) with the current solver; figures marked pending are still running and this document is redelivered as they land.</w:t>
+        <w:t>Build 2026-09-03 21:42. Every experiment is being re-measured on the 8-body clutter scenes (Marco, 2026-09-03) with the current solver; figures marked pending are still running and this document is redelivered as they land.</w:t>
       </w:r>
     </w:p>
     <w:p>
@@ -869,7 +869,7 @@
         <w:pStyle w:val="ListBullet"/>
       </w:pPr>
       <w:r>
-        <w:t>CPU bench note (2026-09-03): the lockstep barrier polled its rendezvous files every 5 ms, adding about 0.15 s per run at small N (Drake's own compute on the 8-body world at N = 1 is 0.087 s); polling is now 0.2 ms and the N &lt;= 256 cells of both CPU ladders were re-measured (8-body N = 1: 0.141 s; the remaining gap to 0.087 s is the barrier itself)</w:t>
+        <w:t>Small-N protocol and trials (2026-09-03): N &lt;= 8 on both stacks are medians of repeated runs (GPU 5 trials: N = 1 0.084 to 0.111 s, N = 2 0.126 to 0.140, N = 4 0.147 to 0.199, N = 8 0.187 to 0.235; CPU 3 trials: N = 1 0.085 to 0.089, N = 2 0.101 to 0.106, N = 4 0.101 to 0.106, N = 8 0.107 to 0.115, N = 16 0.161 to 0.163, N = 32 0.185 to 0.188, N = 64 0.201 to 0.213). When every world has its own worker (N &lt;= 96) the CPU makespan is the slowest world's integration time, because the lockstep barrier there only synchronizes clocks and its file polling (about 55 ms per run) is a harness artifact, not the reference implementation; with more worlds than workers the barrier makespan is the batch time. The barrier makespan is kept alongside in the CSV</w:t>
       </w:r>
     </w:p>
     <w:p>
@@ -877,7 +877,7 @@
         <w:pStyle w:val="ListBullet"/>
       </w:pPr>
       <w:r>
-        <w:t>Measured result (seconds to complete the scene, CPU / GPU): 1: 0.24 / 0.11; 2: 0.27 / 0.2; 4: 0.29 / 0.2; 8: 0.30 / 0.2; 16: 0.34 / 0.3; 32: 0.37 / 0.3; 64: 0.38 / 0.4; 128: 0.54 / 0.5; 256: 0.77 / 0.7; 512: 1.38 / 0.8; 1024: 2.40 / 1.0; 2048: 4.44 / 1.3; 4096: 8.58 / 1.9; 8192: 16.5 / 3.0; 16384: 33.0 / 5.5. The GPU is at or below the CPU at every N, 6.0x faster at 16384, and still sublinear there (exponent 4096 to 16384: GPU 0.77 vs CPU 0.94); saturated per-world cost GPU 0.34 ms vs CPU 2.0 ms</w:t>
+        <w:t>Measured result (seconds to complete the scene, CPU / GPU): 1: 0.0852 / 0.096; 2: 0.101 / 0.128; 4: 0.102 / 0.155; 8: 0.108 / 0.196; 16: 0.161 / 0.3; 32: 0.188 / 0.3; 64: 0.202 / 0.4; 128: 0.472 / 0.5; 256: 0.691 / 0.7; 512: 1.38 / 0.8; 1024: 2.4 / 1; 2048: 4.44 / 1.3; 4096: 8.58 / 1.9; 8192: 16.5 / 3; 16384: 33 / 5.5. Below about 256 worlds the CPU is faster (at one world the GPU's 0.096 s against Drake's 0.085 s; per step the GPU is about six times slower there); the curves cross between 256 and 512 worlds; the GPU is 6.0x faster at 16384 and still sublinear there (exponent 4096 to 16384: GPU 0.77 vs CPU 0.94); saturated per-world cost GPU 0.34 ms vs CPU 2.0 ms</w:t>
       </w:r>
     </w:p>
     <w:p>
@@ -893,7 +893,7 @@
         <w:pStyle w:val="ListBullet"/>
       </w:pPr>
       <w:r>
-        <w:t>Reading: below 128 worlds both stacks are latency-bound (one world's march is a serial chain on either machine) and the wall time is set by per-step overhead; from 128 worlds the CPU runs worlds in sequence on its cores and grows linearly, while the GPU adds worlds at a fraction of a millisecond each until the card saturates. The GPU case additionally rests on co-residence with the learner (no PCIe state transfer in the training loop)</w:t>
+        <w:t>Reading: a single world's march is a serial chain on either machine, and one CPU core runs it faster than the GPU (per step about 6x); the GPU's advantage appears only once enough worlds run concurrently to fill the card, which on this scene happens between 256 and 512 worlds, and it grows from there because the GPU adds worlds at a fraction of a millisecond each while the CPU runs them in sequence on its cores. The GPU case additionally rests on co-residence with the learner (no PCIe state transfer in the training loop)</w:t>
       </w:r>
     </w:p>
     <w:p>

</xml_diff>

<commit_message>
Part-1 doc audit: citations at the measured commit, Exp-3 statistics stated as measured, Exp-2 caption, Exp-4 exponent and solver commit
Claude-Session: https://claude.ai/code/session_015jwxLQxXKy7cte15GEu79P
</commit_message>
<xml_diff>
--- a/part1/bench/results/P1_core_experiments.docx
+++ b/part1/bench/results/P1_core_experiments.docx
@@ -12,7 +12,7 @@
     </w:p>
     <w:p>
       <w:r>
-        <w:t>Build 2026-09-03 21:42. Every experiment is being re-measured on the 8-body clutter scenes (Marco, 2026-09-03) with the current solver; figures marked pending are still running and this document is redelivered as they land.</w:t>
+        <w:t>Build 2026-09-03 22:31. Every figure and number below is from the 8-body clutter scenes (Marco's ruling of 2026-09-03), measured on 2026-09-03 with icf_warp perf/contact-solve 0fca334 (Newton/Warp) and Drake 1.56.0 (CPU reference). Code citations point at icra2027 commit 91c8394, the code these runs used.</w:t>
       </w:r>
     </w:p>
     <w:p>
@@ -229,7 +229,7 @@
         <w:pStyle w:val="ListBullet"/>
       </w:pPr>
       <w:r>
-        <w:t>step and tolerance grids, https://github.com/mardigiorgio/icra2027/blob/48604cf33b/part1/bench/benchmarks/part1_stiffness_sweep.py#L40-L41</w:t>
+        <w:t>step and tolerance grids, https://github.com/mardigiorgio/icra2027/blob/91c8394/part1/bench/benchmarks/part1_stiffness_sweep.py#L40-L41</w:t>
       </w:r>
     </w:p>
     <w:p>
@@ -237,7 +237,7 @@
         <w:pStyle w:val="ListBullet"/>
       </w:pPr>
       <w:r>
-        <w:t>the calibrated MuJoCo solref anchor, self-verifying at fine steps, https://github.com/mardigiorgio/icra2027/blob/48604cf33b/part1/bench/benchmarks/part1_stiffness_sweep.py#L43-L47</w:t>
+        <w:t>the calibrated MuJoCo solref anchor, self-verifying at fine steps, https://github.com/mardigiorgio/icra2027/blob/91c8394/part1/bench/benchmarks/part1_stiffness_sweep.py#L43-L47</w:t>
       </w:r>
     </w:p>
     <w:p>
@@ -245,7 +245,7 @@
         <w:pStyle w:val="ListBullet"/>
       </w:pPr>
       <w:r>
-        <w:t>MuJoCo solref calibration anchors, https://github.com/mardigiorgio/icra2027/blob/48604cf33b/part1/scenes/cenic_scenes.py#L66-L69</w:t>
+        <w:t>MuJoCo solref calibration anchors, https://github.com/mardigiorgio/icra2027/blob/91c8394/part1/scenes/cenic_scenes.py#L66-L69</w:t>
       </w:r>
     </w:p>
     <w:p>
@@ -253,7 +253,7 @@
         <w:pStyle w:val="ListBullet"/>
       </w:pPr>
       <w:r>
-        <w:t>scene build, settle loop and depth readout, https://github.com/mardigiorgio/icra2027/blob/48604cf33b/part1/bench/benchmarks/part1_stiffness_sweep.py#L50-L79</w:t>
+        <w:t>scene build, settle loop and depth readout, https://github.com/mardigiorgio/icra2027/blob/91c8394/part1/bench/benchmarks/part1_stiffness_sweep.py#L50-L79</w:t>
       </w:r>
     </w:p>
     <w:p>
@@ -261,7 +261,7 @@
         <w:pStyle w:val="ListBullet"/>
       </w:pPr>
       <w:r>
-        <w:t>the sweep cells (arms x steps x tolerances), https://github.com/mardigiorgio/icra2027/blob/48604cf33b/part1/bench/benchmarks/part1_stiffness_sweep.py#L92-L99</w:t>
+        <w:t>the sweep cells (arms x steps x tolerances), https://github.com/mardigiorgio/icra2027/blob/91c8394/part1/bench/benchmarks/part1_stiffness_sweep.py#L86-L103</w:t>
       </w:r>
     </w:p>
     <w:p>
@@ -269,7 +269,7 @@
         <w:pStyle w:val="ListBullet"/>
       </w:pPr>
       <w:r>
-        <w:t>solref written onto every contact geom, https://github.com/mardigiorgio/icra2027/blob/48604cf33b/part1/bench/four_arms.py#L102-L112</w:t>
+        <w:t>solref written onto every contact geom, https://github.com/mardigiorgio/icra2027/blob/91c8394/part1/bench/four_arms.py#L103-L113</w:t>
       </w:r>
     </w:p>
     <w:p>
@@ -400,7 +400,7 @@
     </w:p>
     <w:p>
       <w:r>
-        <w:t>Figure: wall time to complete the 2 s clutter scene, vs requested tolerance; dotted levels are the fixed steps; gray line is the timeout.</w:t>
+        <w:t>Figure: wall time to complete the 2 s clutter scene, vs requested tolerance; dotted levels are the fixed-step arms at δt = 10 ms and 1 ms; the thin gray line is real time (wall equal to simulated time). Any timed-out or budget-limited cell would be drawn as a cross; none occurred.</w:t>
       </w:r>
     </w:p>
     <w:p>
@@ -429,7 +429,7 @@
         <w:pStyle w:val="ListBullet"/>
       </w:pPr>
       <w:r>
-        <w:t>Varied: requested tolerance ε in {0.1 ... 0.000001} m; number of parallel worlds N in {1, 1024}; N = 1 rows are 3-trial medians</w:t>
+        <w:t>Varied: requested tolerance ε in {0.1 ... 0.000001} m; number of parallel worlds N in {1, 1024}; every cell is the median of 3 independent runs</w:t>
       </w:r>
     </w:p>
     <w:p>
@@ -445,7 +445,7 @@
         <w:pStyle w:val="ListBullet"/>
       </w:pPr>
       <w:r>
-        <w:t>Held: scene geometry, masses, friction, δt_max = 0.1 s, march budget of 16384 substeps per 0.1 s boundary for every arm (raised from 4096 on 2026-09-03: at ε = 1e-6 on hard clutter the ICF EC arm needs between 4096 and 16384 substeps in the impact phase and completes at 12.4 s per simulated second once allowed to; no arm is limited at 16384)</w:t>
+        <w:t>Held: scene geometry, masses, friction, δt_max = 0.1 s, march budget of 16384 substeps per 0.1 s boundary for every arm (raised from 4096 on 2026-09-03 after the 20-body hard clutter at ε = 1e-6 needed between 4096 and 16384 substeps in its impact phase; on the 8-body scenes no cell of any arm exhausts the budget at any tolerance)</w:t>
       </w:r>
     </w:p>
     <w:p>
@@ -466,7 +466,7 @@
         <w:pStyle w:val="ListBullet"/>
       </w:pPr>
       <w:r>
-        <w:t>timeout semantics (per world-second), https://github.com/mardigiorgio/icra2027/blob/1edc6a523a/part1/bench/benchmarks/part1_workprecision.py#L8-L16</w:t>
+        <w:t>timeout semantics (per world-second), https://github.com/mardigiorgio/icra2027/blob/91c8394/part1/bench/benchmarks/part1_workprecision.py#L6-L16</w:t>
       </w:r>
     </w:p>
     <w:p>
@@ -474,7 +474,7 @@
         <w:pStyle w:val="ListBullet"/>
       </w:pPr>
       <w:r>
-        <w:t>accuracy ladder + march budget, https://github.com/mardigiorgio/icra2027/blob/1edc6a523a/part1/bench/benchmarks/part1_workprecision.py#L18-L21</w:t>
+        <w:t>accuracy ladder + march budget, https://github.com/mardigiorgio/icra2027/blob/91c8394/part1/bench/benchmarks/part1_workprecision.py#L18-L24</w:t>
       </w:r>
     </w:p>
     <w:p>
@@ -482,7 +482,7 @@
         <w:pStyle w:val="ListBullet"/>
       </w:pPr>
       <w:r>
-        <w:t>first attempt k_Init·δt_max, https://github.com/mardigiorgio/icra2027/blob/1edc6a523a/part1/bench/four_arms.py#L47</w:t>
+        <w:t>first attempt k_Init·δt_max, https://github.com/mardigiorgio/icra2027/blob/91c8394/part1/bench/four_arms.py#L47</w:t>
       </w:r>
     </w:p>
     <w:p>
@@ -490,7 +490,7 @@
         <w:pStyle w:val="ListBullet"/>
       </w:pPr>
       <w:r>
-        <w:t>inner tolerance rule (CENIC eq. 34), https://github.com/mardigiorgio/icra2027/blob/1edc6a523a/part1/bench/four_arms.py#L48</w:t>
+        <w:t>inner tolerance rule (CENIC eq. 34), https://github.com/mardigiorgio/icra2027/blob/91c8394/part1/bench/four_arms.py#L49-L50</w:t>
       </w:r>
     </w:p>
     <w:p>
@@ -498,7 +498,7 @@
         <w:pStyle w:val="ListBullet"/>
       </w:pPr>
       <w:r>
-        <w:t>contact budgets (&gt;= 2x measured demand), https://github.com/mardigiorgio/icra2027/blob/1edc6a523a/part1/bench/four_arms.py#L62-L64</w:t>
+        <w:t>contact budgets (&gt;= 2x measured demand), https://github.com/mardigiorgio/icra2027/blob/91c8394/part1/bench/four_arms.py#L55-L65</w:t>
       </w:r>
     </w:p>
     <w:p>
@@ -506,7 +506,7 @@
         <w:pStyle w:val="ListBullet"/>
       </w:pPr>
       <w:r>
-        <w:t>per-world no-overlap lattice generator, https://github.com/mardigiorgio/icra2027/blob/98cb3afd46/part1/scenes/clutter_lattice.py#L38-L86</w:t>
+        <w:t>per-world no-overlap lattice generator, https://github.com/mardigiorgio/icra2027/blob/91c8394/part1/scenes/clutter_lattice.py#L38-L86</w:t>
       </w:r>
     </w:p>
     <w:p>
@@ -514,7 +514,7 @@
         <w:pStyle w:val="ListBullet"/>
       </w:pPr>
       <w:r>
-        <w:t>MuJoCo arms on Newton pipeline contacts, https://github.com/mardigiorgio/icra2027/blob/98cb3afd46/part1/bench/four_arms.py#L120 and #L150</w:t>
+        <w:t>MuJoCo arms on Newton pipeline contacts, https://github.com/mardigiorgio/icra2027/blob/91c8394/part1/bench/four_arms.py#L124-L131 and #L157-L162</w:t>
       </w:r>
     </w:p>
     <w:p>
@@ -604,7 +604,7 @@
     </w:p>
     <w:p>
       <w:r>
-        <w:t>Figure: wall time to complete the 2 s hard clutter scene, vs the number of parallel worlds; band is the spread of 3 independent runs.</w:t>
+        <w:t>Figure: wall time to complete the 2 s hard clutter scene, vs the number of parallel worlds. Each point is 20 times the median per-boundary wall of one run over its 20 timed 0.1 s boundaries; the band spans the median to the 90th percentile of those per-boundary walls.</w:t>
       </w:r>
     </w:p>
     <w:p>
@@ -641,7 +641,7 @@
         <w:pStyle w:val="ListBullet"/>
       </w:pPr>
       <w:r>
-        <w:t>Measured: wall time to complete the 2 s scene, median of 3 independent trials (spread drawn as a band)</w:t>
+        <w:t>Measured: per-boundary wall over the 20 timed boundaries of one run per cell; the plotted scene time is 20 x the median boundary, the band the median-to-p90 spread of the boundaries</w:t>
       </w:r>
     </w:p>
     <w:p>
@@ -670,7 +670,7 @@
         <w:pStyle w:val="ListBullet"/>
       </w:pPr>
       <w:r>
-        <w:t>runner (per-N subprocess), https://github.com/mardigiorgio/icra2027/blob/1edc6a523a/part1/bench/benchmarks/part1_scaling.py#L36</w:t>
+        <w:t>runner (per-N subprocess), https://github.com/mardigiorgio/icra2027/blob/91c8394/part1/bench/benchmarks/part1_scaling.py#L36</w:t>
       </w:r>
     </w:p>
     <w:p>
@@ -678,7 +678,7 @@
         <w:pStyle w:val="ListBullet"/>
       </w:pPr>
       <w:r>
-        <w:t>warm-up handling, https://github.com/mardigiorgio/icra2027/blob/1edc6a523a/part1/bench/benchmarks/part1_scaling.py#L44-L47</w:t>
+        <w:t>warm-up handling, https://github.com/mardigiorgio/icra2027/blob/91c8394/part1/bench/benchmarks/part1_scaling.py#L44-L47</w:t>
       </w:r>
     </w:p>
     <w:p>
@@ -686,7 +686,7 @@
         <w:pStyle w:val="ListBullet"/>
       </w:pPr>
       <w:r>
-        <w:t>median statistic, https://github.com/mardigiorgio/icra2027/blob/1edc6a523a/part1/bench/benchmarks/part1_scaling.py#L72</w:t>
+        <w:t>median statistic, https://github.com/mardigiorgio/icra2027/blob/91c8394/part1/bench/benchmarks/part1_scaling.py#L72</w:t>
       </w:r>
     </w:p>
     <w:p>
@@ -694,7 +694,7 @@
         <w:pStyle w:val="ListBullet"/>
       </w:pPr>
       <w:r>
-        <w:t>defaults: 2 s timed, 0.2 s warm-up, 3 trials, https://github.com/mardigiorgio/icra2027/blob/1edc6a523a/part1/bench/benchmarks/part1_scaling.py#L82-L89</w:t>
+        <w:t>defaults: 2 s timed, 0.2 s warm-up, δt_fixed = 10 ms, ε = 1e-3, https://github.com/mardigiorgio/icra2027/blob/91c8394/part1/bench/benchmarks/part1_scaling.py#L80-L86</w:t>
       </w:r>
     </w:p>
     <w:p>
@@ -805,7 +805,7 @@
         <w:pStyle w:val="ListBullet"/>
       </w:pPr>
       <w:r>
-        <w:t>CPU arm: Drake 1.56, integration_scheme = cenic (the reference implementation, shipped in Drake); W = min(N, 96) worker processes on the idle 128-core host, each building ONE diagram and hosting its share of worlds as ~1 MB per-world contexts, so worlds beyond the core count run SEQUENTIALLY on the cores available with no artificial per-world residency cost</w:t>
+        <w:t>CPU arm: Drake 1.56.0, integration_scheme = cenic (the reference implementation, shipped in Drake); W = min(N, 96) worker processes on the idle 128-core host, each building ONE diagram and hosting its share of worlds as ~1 MB per-world contexts, so worlds beyond the core count run SEQUENTIALLY on the cores available with no artificial per-world residency cost</w:t>
       </w:r>
     </w:p>
     <w:p>
@@ -877,7 +877,7 @@
         <w:pStyle w:val="ListBullet"/>
       </w:pPr>
       <w:r>
-        <w:t>Measured result (seconds to complete the scene, CPU / GPU): 1: 0.0852 / 0.096; 2: 0.101 / 0.128; 4: 0.102 / 0.155; 8: 0.108 / 0.196; 16: 0.161 / 0.3; 32: 0.188 / 0.3; 64: 0.202 / 0.4; 128: 0.472 / 0.5; 256: 0.691 / 0.7; 512: 1.38 / 0.8; 1024: 2.4 / 1; 2048: 4.44 / 1.3; 4096: 8.58 / 1.9; 8192: 16.5 / 3; 16384: 33 / 5.5. Below about 256 worlds the CPU is faster (at one world the GPU's 0.096 s against Drake's 0.085 s; per step the GPU is about six times slower there); the curves cross between 256 and 512 worlds; the GPU is 6.0x faster at 16384 and still sublinear there (exponent 4096 to 16384: GPU 0.77 vs CPU 0.94); saturated per-world cost GPU 0.34 ms vs CPU 2.0 ms</w:t>
+        <w:t>Measured result (seconds to complete the scene, CPU / GPU): 1: 0.0852 / 0.096; 2: 0.101 / 0.128; 4: 0.102 / 0.155; 8: 0.108 / 0.196; 16: 0.161 / 0.3; 32: 0.188 / 0.3; 64: 0.202 / 0.4; 128: 0.472 / 0.5; 256: 0.691 / 0.7; 512: 1.38 / 0.8; 1024: 2.4 / 1; 2048: 4.44 / 1.3; 4096: 8.58 / 1.9; 8192: 16.5 / 3; 16384: 33 / 5.5. Below about 256 worlds the CPU is faster (at one world the GPU's 0.096 s against Drake's 0.085 s; per step the GPU is about six times slower there); the curves cross between 256 and 512 worlds; the GPU is 6.0x faster at 16384 and still sublinear there (exponent 4096 to 16384: GPU 0.77 vs CPU 0.97); saturated per-world cost GPU 0.34 ms vs CPU 2.0 ms</w:t>
       </w:r>
     </w:p>
     <w:p>
@@ -885,7 +885,7 @@
         <w:pStyle w:val="ListBullet"/>
       </w:pPr>
       <w:r>
-        <w:t>Solver state for these numbers: icf_warp_adaptive branch perf/contact-solve at e2f39c4 (block-structured assembly on the free-body layout, 24-dof block-sparse Cholesky, narrow-tail march compaction ICF_MARCH_COMPACT=1, exact per-iteration launch folds); physics unchanged (64-world oracle inside the run-to-run envelope, zero solve failures). Before this work the GPU arm cost about 30 ms per added world, 2.1x the CPU, with no crossover</w:t>
+        <w:t>Solver state for these numbers: icf_warp_adaptive branch perf/contact-solve at 0fca334 (block-structured assembly on the free-body layout, 24-dof block-sparse Cholesky, narrow-tail march compaction ICF_MARCH_COMPACT=1, exact per-iteration launch folds); physics unchanged (64-world oracle inside the run-to-run envelope, zero solve failures). Before this work the GPU arm cost about 30 ms per added world on the 20-body scene, 2.1x the CPU, with no crossover</w:t>
       </w:r>
     </w:p>
     <w:p>
@@ -906,7 +906,7 @@
         <w:pStyle w:val="ListBullet"/>
       </w:pPr>
       <w:r>
-        <w:t>shared lattice import and scene constants, https://github.com/mardigiorgio/icra2027/blob/98cb3afd46/part1/bench/benchmarks/part1_cenic_cpu.py#L38-L60</w:t>
+        <w:t>shared lattice import and scene constants, https://github.com/mardigiorgio/icra2027/blob/91c8394/part1/bench/benchmarks/part1_cenic_cpu.py#L41-L59</w:t>
       </w:r>
     </w:p>
     <w:p>
@@ -914,7 +914,7 @@
         <w:pStyle w:val="ListBullet"/>
       </w:pPr>
       <w:r>
-        <w:t>Drake world build and CENIC configuration, https://github.com/mardigiorgio/icra2027/blob/98cb3afd46/part1/bench/benchmarks/part1_cenic_cpu.py#L66-L135</w:t>
+        <w:t>Drake world build and CENIC configuration, https://github.com/mardigiorgio/icra2027/blob/91c8394/part1/bench/benchmarks/part1_cenic_cpu.py#L70-L150</w:t>
       </w:r>
     </w:p>
     <w:p>
@@ -922,7 +922,7 @@
         <w:pStyle w:val="ListBullet"/>
       </w:pPr>
       <w:r>
-        <w:t>GO-signal barrier, lockstep boundaries, makespan timing, https://github.com/mardigiorgio/icra2027/blob/98cb3afd46/part1/bench/benchmarks/part1_cenic_cpu.py#L137-L196</w:t>
+        <w:t>GO-signal barrier, lockstep boundaries, makespan timing, https://github.com/mardigiorgio/icra2027/blob/91c8394/part1/bench/benchmarks/part1_cenic_cpu.py#L157-L205</w:t>
       </w:r>
     </w:p>
     <w:p>
@@ -930,7 +930,7 @@
         <w:pStyle w:val="ListBullet"/>
       </w:pPr>
       <w:r>
-        <w:t>GPU arm on the same protocol (warm-up, timed window, makespan), https://github.com/mardigiorgio/icra2027/blob/1edc6a523a/part1/bench/benchmarks/part1_gpu_fair.py#L1-L40</w:t>
+        <w:t>GPU arm on the same protocol (warm-up, timed window, makespan), https://github.com/mardigiorgio/icra2027/blob/91c8394/part1/bench/benchmarks/part1_gpu_fair.py#L26-L28 and #L41-L90</w:t>
       </w:r>
     </w:p>
     <w:p>
@@ -938,7 +938,7 @@
         <w:pStyle w:val="ListBullet"/>
       </w:pPr>
       <w:r>
-        <w:t>Both ladders, one row per N with the solver commit, https://github.com/mardigiorgio/icra2027/blob/1edc6a523a/part1/bench/results/part1_gpu_fair_ladder.csv and https://github.com/mardigiorgio/icra2027/blob/1edc6a523a/part1/bench/results/part1_cenic_cpu.csv</w:t>
+        <w:t>Both ladders, one row per N with the solver commit, https://github.com/mardigiorgio/icra2027/blob/91c8394/part1/bench/results/part1_gpu_fair_ladder.csv and https://github.com/mardigiorgio/icra2027/blob/91c8394/part1/bench/results/part1_cenic_cpu.csv</w:t>
       </w:r>
     </w:p>
     <w:sectPr>

</xml_diff>

<commit_message>
Doc Exp 1: text matches the current stiffness sweep (refsafe clamp, direct-solref control, today's results)
Claude-Session: https://claude.ai/code/session_015jwxLQxXKy7cte15GEu79P
</commit_message>
<xml_diff>
--- a/part1/bench/results/P1_core_experiments.docx
+++ b/part1/bench/results/P1_core_experiments.docx
@@ -12,7 +12,7 @@
     </w:p>
     <w:p>
       <w:r>
-        <w:t>Build 2026-09-03 22:31. Every figure and number below is from the 8-body clutter scenes (Marco's ruling of 2026-09-03), measured on 2026-09-03 with icf_warp perf/contact-solve 0fca334 (Newton/Warp) and Drake 1.56.0 (CPU reference). Code citations point at icra2027 commit 91c8394, the code these runs used.</w:t>
+        <w:t>Build 2026-09-03 22:34. Every figure and number below is from the 8-body clutter scenes (Marco's ruling of 2026-09-03), measured on 2026-09-03 with icf_warp perf/contact-solve 0fca334 (Newton/Warp) and Drake 1.56.0 (CPU reference). Code citations point at icra2027 commit 91c8394, the code these runs used.</w:t>
       </w:r>
     </w:p>
     <w:p>
@@ -163,7 +163,7 @@
     </w:p>
     <w:p>
       <w:r>
-        <w:t>Status (2026-09-03, evening): re-run on icf_warp perf/contact-solve 0fca334; the scene is the single stiffness sphere and did not change.</w:t>
+        <w:t>Figure: resting penetration of the sphere divided by the model's m g / k (1 = the stiffness the scene asked for). (a) fixed step, both solvers; the dotted vertical line is where MuJoCo's refsafe clamp starts to bite (δt = τ/2 = 1.2 ms), beyond which its contact time constant is 2 δt instead of τ. (b) error control at the requested tolerance ε.</w:t>
       </w:r>
     </w:p>
     <w:p>
@@ -184,7 +184,7 @@
         <w:pStyle w:val="ListBullet"/>
       </w:pPr>
       <w:r>
-        <w:t>Contact stiffness: k = 100,000 N/m for the whole experiment (companion rows at k = 1,000 in the same CSV); ICF takes k directly; MuJoCo takes solref τ = 2.4 ms, calibrated so the converged rest depth equals mg/k at a 1 ms step (τ swept at fixed 1 ms until depth = mg/k)</w:t>
+        <w:t>Contact stiffness: k = 100,000 N/m for the whole experiment (companion rows at k = 1,000 in the same CSV); ICF takes k directly. MuJoCo takes the reference solref (timeconst τ = 2.4 ms, dampratio 1), τ calibrated so the converged rest depth equals m g / k at a 1 ms step; MuJoCo clamps timeconst to at least 2 δt (refsafe), so above δt = τ/2 the contact is softer than asked by (2 δt / τ)^2. The direct solref form (-k, -b), a literal stiffness the clamp does not touch, is run as a control: it is unstable at 10 and 5 ms and exact at 2 ms and below (rows in the CSV, not on the figure)</w:t>
       </w:r>
     </w:p>
     <w:p>
@@ -216,7 +216,15 @@
         <w:pStyle w:val="ListBullet"/>
       </w:pPr>
       <w:r>
-        <w:t>Built-in control: at δt &lt;= 1 ms both solvers read 1.00 within 2 percent, which is the definition of same physical system (equality by convergence, no parameter translation anywhere)</w:t>
+        <w:t>Built-in control: at δt &lt;= 1 ms both solvers read 1.00 within 2 percent (MuJoCo 0.98 at 1 ms and 0.5 ms), which is the definition of same physical system (equality by convergence, no parameter translation anywhere)</w:t>
+      </w:r>
+    </w:p>
+    <w:p>
+      <w:pPr>
+        <w:pStyle w:val="ListBullet"/>
+      </w:pPr>
+      <w:r>
+        <w:t>Result (2026-09-03 run): ICF reads 1.00 at every step and every tolerance. MuJoCo fixed reads 57x at 10 ms, 16.8x at 5 ms, 2.7x at 2 ms, 0.98 at 1 ms and 0.5 ms. MuJoCo error control reads 16.8x for every ε from 0.1 to 1e-4 and 1.25x at 1e-5: its controller only brings the step under τ/2 at the tightest tolerance, because the softened contact is self-consistent at every step and produces no error signal. At k = 1,000 (τ = 31.8 ms) both solvers read 1.00 at every step; the clamp never bites</w:t>
       </w:r>
     </w:p>
     <w:p>

</xml_diff>